<commit_message>
Expand Bright Data, Zod, and tech-stack sections in documentation
Add operational detail to chapter 6.2 (Bright Data extraction schema
and collector-ID setup) and a new appendix guide for recovering a
paused Supabase project, both sourced from private setup notes with
credentials excluded. Also port the five Zod schema code figures from
BT section 5.3 into chapter 9.1, and add a new chapter 2.5 technology
stack table (versions verified against package-lock.json/requirements.txt)
based on BT Tab. 19. Table captions renumbered accordingly.

Co-Authored-By: Claude Sonnet 5 <noreply@anthropic.com>
</commit_message>
<xml_diff>
--- a/docs/Technische-Dokumentation.docx
+++ b/docs/Technische-Dokumentation.docx
@@ -1199,6 +1199,921 @@
     </w:p>
     <w:p>
       <w:pPr>
+        <w:pStyle w:val="Heading2"/>
+      </w:pPr>
+      <w:r>
+        <w:t>2.5 Technologie-Stack</w:t>
+      </w:r>
+    </w:p>
+    <w:p>
+      <w:pPr>
+        <w:pStyle w:val="Caption2"/>
+      </w:pPr>
+      <w:r>
+        <w:t>Tabelle 3: Im Portal eingesetzte Technologien</w:t>
+      </w:r>
+    </w:p>
+    <w:tbl>
+      <w:tblPr>
+        <w:tblStyle w:val="LightGrid-Accent1"/>
+        <w:tblW w:type="auto" w:w="0"/>
+        <w:tblLayout w:type="autofit"/>
+        <w:tblLook w:firstColumn="1" w:firstRow="1" w:lastColumn="0" w:lastRow="0" w:noHBand="0" w:noVBand="1" w:val="04A0"/>
+      </w:tblPr>
+      <w:tblGrid>
+        <w:gridCol w:w="1881"/>
+        <w:gridCol w:w="1881"/>
+        <w:gridCol w:w="1881"/>
+        <w:gridCol w:w="1881"/>
+        <w:gridCol w:w="1881"/>
+      </w:tblGrid>
+      <w:tr>
+        <w:tc>
+          <w:tcPr>
+            <w:tcW w:type="dxa" w:w="1881"/>
+          </w:tcPr>
+          <w:p>
+            <w:r>
+              <w:t>Kategorie</w:t>
+            </w:r>
+          </w:p>
+        </w:tc>
+        <w:tc>
+          <w:tcPr>
+            <w:tcW w:type="dxa" w:w="1881"/>
+          </w:tcPr>
+          <w:p>
+            <w:r>
+              <w:t>Technologie</w:t>
+            </w:r>
+          </w:p>
+        </w:tc>
+        <w:tc>
+          <w:tcPr>
+            <w:tcW w:type="dxa" w:w="1881"/>
+          </w:tcPr>
+          <w:p>
+            <w:r>
+              <w:t>Version</w:t>
+            </w:r>
+          </w:p>
+        </w:tc>
+        <w:tc>
+          <w:tcPr>
+            <w:tcW w:type="dxa" w:w="1881"/>
+          </w:tcPr>
+          <w:p>
+            <w:r>
+              <w:t>Dokumentation</w:t>
+            </w:r>
+          </w:p>
+        </w:tc>
+        <w:tc>
+          <w:tcPr>
+            <w:tcW w:type="dxa" w:w="1881"/>
+          </w:tcPr>
+          <w:p>
+            <w:r>
+              <w:t>Zweck</w:t>
+            </w:r>
+          </w:p>
+        </w:tc>
+      </w:tr>
+      <w:tr>
+        <w:tc>
+          <w:tcPr>
+            <w:tcW w:type="dxa" w:w="1881"/>
+          </w:tcPr>
+          <w:p>
+            <w:r>
+              <w:t>Framework</w:t>
+            </w:r>
+          </w:p>
+        </w:tc>
+        <w:tc>
+          <w:tcPr>
+            <w:tcW w:type="dxa" w:w="1881"/>
+          </w:tcPr>
+          <w:p>
+            <w:r>
+              <w:t>Next.js</w:t>
+            </w:r>
+          </w:p>
+        </w:tc>
+        <w:tc>
+          <w:tcPr>
+            <w:tcW w:type="dxa" w:w="1881"/>
+          </w:tcPr>
+          <w:p>
+            <w:r>
+              <w:t>15.5.18</w:t>
+            </w:r>
+          </w:p>
+        </w:tc>
+        <w:tc>
+          <w:tcPr>
+            <w:tcW w:type="dxa" w:w="1881"/>
+          </w:tcPr>
+          <w:p>
+            <w:r>
+              <w:t>https://nextjs.org/docs</w:t>
+            </w:r>
+          </w:p>
+        </w:tc>
+        <w:tc>
+          <w:tcPr>
+            <w:tcW w:type="dxa" w:w="1881"/>
+          </w:tcPr>
+          <w:p>
+            <w:r>
+              <w:t>Full-Stack-Framework, App Router, serverseitiges Rendering</w:t>
+            </w:r>
+          </w:p>
+        </w:tc>
+      </w:tr>
+      <w:tr>
+        <w:tc>
+          <w:tcPr>
+            <w:tcW w:type="dxa" w:w="1881"/>
+          </w:tcPr>
+          <w:p>
+            <w:r>
+              <w:t>UI-Bibliothek</w:t>
+            </w:r>
+          </w:p>
+        </w:tc>
+        <w:tc>
+          <w:tcPr>
+            <w:tcW w:type="dxa" w:w="1881"/>
+          </w:tcPr>
+          <w:p>
+            <w:r>
+              <w:t>React</w:t>
+            </w:r>
+          </w:p>
+        </w:tc>
+        <w:tc>
+          <w:tcPr>
+            <w:tcW w:type="dxa" w:w="1881"/>
+          </w:tcPr>
+          <w:p>
+            <w:r>
+              <w:t>19.2.4</w:t>
+            </w:r>
+          </w:p>
+        </w:tc>
+        <w:tc>
+          <w:tcPr>
+            <w:tcW w:type="dxa" w:w="1881"/>
+          </w:tcPr>
+          <w:p>
+            <w:r>
+              <w:t>https://react.dev</w:t>
+            </w:r>
+          </w:p>
+        </w:tc>
+        <w:tc>
+          <w:tcPr>
+            <w:tcW w:type="dxa" w:w="1881"/>
+          </w:tcPr>
+          <w:p>
+            <w:r>
+              <w:t>Komponentenbasierte Benutzeroberfläche</w:t>
+            </w:r>
+          </w:p>
+        </w:tc>
+      </w:tr>
+      <w:tr>
+        <w:tc>
+          <w:tcPr>
+            <w:tcW w:type="dxa" w:w="1881"/>
+          </w:tcPr>
+          <w:p>
+            <w:r>
+              <w:t>Sprache</w:t>
+            </w:r>
+          </w:p>
+        </w:tc>
+        <w:tc>
+          <w:tcPr>
+            <w:tcW w:type="dxa" w:w="1881"/>
+          </w:tcPr>
+          <w:p>
+            <w:r>
+              <w:t>TypeScript</w:t>
+            </w:r>
+          </w:p>
+        </w:tc>
+        <w:tc>
+          <w:tcPr>
+            <w:tcW w:type="dxa" w:w="1881"/>
+          </w:tcPr>
+          <w:p>
+            <w:r>
+              <w:t>5.9.3</w:t>
+            </w:r>
+          </w:p>
+        </w:tc>
+        <w:tc>
+          <w:tcPr>
+            <w:tcW w:type="dxa" w:w="1881"/>
+          </w:tcPr>
+          <w:p>
+            <w:r>
+              <w:t>https://www.typescriptlang.org/docs</w:t>
+            </w:r>
+          </w:p>
+        </w:tc>
+        <w:tc>
+          <w:tcPr>
+            <w:tcW w:type="dxa" w:w="1881"/>
+          </w:tcPr>
+          <w:p>
+            <w:r>
+              <w:t>Statische Typisierung, Typsynchronisation mit Supabase</w:t>
+            </w:r>
+          </w:p>
+        </w:tc>
+      </w:tr>
+      <w:tr>
+        <w:tc>
+          <w:tcPr>
+            <w:tcW w:type="dxa" w:w="1881"/>
+          </w:tcPr>
+          <w:p>
+            <w:r>
+              <w:t>Datenbank / Backend</w:t>
+            </w:r>
+          </w:p>
+        </w:tc>
+        <w:tc>
+          <w:tcPr>
+            <w:tcW w:type="dxa" w:w="1881"/>
+          </w:tcPr>
+          <w:p>
+            <w:r>
+              <w:t>Supabase (supabase-js)</w:t>
+            </w:r>
+          </w:p>
+        </w:tc>
+        <w:tc>
+          <w:tcPr>
+            <w:tcW w:type="dxa" w:w="1881"/>
+          </w:tcPr>
+          <w:p>
+            <w:r>
+              <w:t>2.98.0</w:t>
+            </w:r>
+          </w:p>
+        </w:tc>
+        <w:tc>
+          <w:tcPr>
+            <w:tcW w:type="dxa" w:w="1881"/>
+          </w:tcPr>
+          <w:p>
+            <w:r>
+              <w:t>https://supabase.com/docs</w:t>
+            </w:r>
+          </w:p>
+        </w:tc>
+        <w:tc>
+          <w:tcPr>
+            <w:tcW w:type="dxa" w:w="1881"/>
+          </w:tcPr>
+          <w:p>
+            <w:r>
+              <w:t>PostgreSQL-Datenbank, REST-API, Realtime, Row Level Security</w:t>
+            </w:r>
+          </w:p>
+        </w:tc>
+      </w:tr>
+      <w:tr>
+        <w:tc>
+          <w:tcPr>
+            <w:tcW w:type="dxa" w:w="1881"/>
+          </w:tcPr>
+          <w:p>
+            <w:r>
+              <w:t>Validierung</w:t>
+            </w:r>
+          </w:p>
+        </w:tc>
+        <w:tc>
+          <w:tcPr>
+            <w:tcW w:type="dxa" w:w="1881"/>
+          </w:tcPr>
+          <w:p>
+            <w:r>
+              <w:t>Zod</w:t>
+            </w:r>
+          </w:p>
+        </w:tc>
+        <w:tc>
+          <w:tcPr>
+            <w:tcW w:type="dxa" w:w="1881"/>
+          </w:tcPr>
+          <w:p>
+            <w:r>
+              <w:t>4.3.6</w:t>
+            </w:r>
+          </w:p>
+        </w:tc>
+        <w:tc>
+          <w:tcPr>
+            <w:tcW w:type="dxa" w:w="1881"/>
+          </w:tcPr>
+          <w:p>
+            <w:r>
+              <w:t>https://zod.dev</w:t>
+            </w:r>
+          </w:p>
+        </w:tc>
+        <w:tc>
+          <w:tcPr>
+            <w:tcW w:type="dxa" w:w="1881"/>
+          </w:tcPr>
+          <w:p>
+            <w:r>
+              <w:t>Laufzeitvalidierung, Schema-zu-Typ-Synchronisation</w:t>
+            </w:r>
+          </w:p>
+        </w:tc>
+      </w:tr>
+      <w:tr>
+        <w:tc>
+          <w:tcPr>
+            <w:tcW w:type="dxa" w:w="1881"/>
+          </w:tcPr>
+          <w:p>
+            <w:r>
+              <w:t>State-Management</w:t>
+            </w:r>
+          </w:p>
+        </w:tc>
+        <w:tc>
+          <w:tcPr>
+            <w:tcW w:type="dxa" w:w="1881"/>
+          </w:tcPr>
+          <w:p>
+            <w:r>
+              <w:t>Zustand</w:t>
+            </w:r>
+          </w:p>
+        </w:tc>
+        <w:tc>
+          <w:tcPr>
+            <w:tcW w:type="dxa" w:w="1881"/>
+          </w:tcPr>
+          <w:p>
+            <w:r>
+              <w:t>5.0.11</w:t>
+            </w:r>
+          </w:p>
+        </w:tc>
+        <w:tc>
+          <w:tcPr>
+            <w:tcW w:type="dxa" w:w="1881"/>
+          </w:tcPr>
+          <w:p>
+            <w:r>
+              <w:t>https://zustand.docs.pmnd.rs</w:t>
+            </w:r>
+          </w:p>
+        </w:tc>
+        <w:tc>
+          <w:tcPr>
+            <w:tcW w:type="dxa" w:w="1881"/>
+          </w:tcPr>
+          <w:p>
+            <w:r>
+              <w:t>Globaler State (Vergleichsauswahl, UI-Präferenzen)</w:t>
+            </w:r>
+          </w:p>
+        </w:tc>
+      </w:tr>
+      <w:tr>
+        <w:tc>
+          <w:tcPr>
+            <w:tcW w:type="dxa" w:w="1881"/>
+          </w:tcPr>
+          <w:p>
+            <w:r>
+              <w:t>Styling</w:t>
+            </w:r>
+          </w:p>
+        </w:tc>
+        <w:tc>
+          <w:tcPr>
+            <w:tcW w:type="dxa" w:w="1881"/>
+          </w:tcPr>
+          <w:p>
+            <w:r>
+              <w:t>Tailwind CSS</w:t>
+            </w:r>
+          </w:p>
+        </w:tc>
+        <w:tc>
+          <w:tcPr>
+            <w:tcW w:type="dxa" w:w="1881"/>
+          </w:tcPr>
+          <w:p>
+            <w:r>
+              <w:t>4.3.0</w:t>
+            </w:r>
+          </w:p>
+        </w:tc>
+        <w:tc>
+          <w:tcPr>
+            <w:tcW w:type="dxa" w:w="1881"/>
+          </w:tcPr>
+          <w:p>
+            <w:r>
+              <w:t>https://tailwindcss.com/docs</w:t>
+            </w:r>
+          </w:p>
+        </w:tc>
+        <w:tc>
+          <w:tcPr>
+            <w:tcW w:type="dxa" w:w="1881"/>
+          </w:tcPr>
+          <w:p>
+            <w:r>
+              <w:t>Utility-First-CSS, Theming über CSS-Variablen</w:t>
+            </w:r>
+          </w:p>
+        </w:tc>
+      </w:tr>
+      <w:tr>
+        <w:tc>
+          <w:tcPr>
+            <w:tcW w:type="dxa" w:w="1881"/>
+          </w:tcPr>
+          <w:p>
+            <w:r>
+              <w:t>UI-Primitives</w:t>
+            </w:r>
+          </w:p>
+        </w:tc>
+        <w:tc>
+          <w:tcPr>
+            <w:tcW w:type="dxa" w:w="1881"/>
+          </w:tcPr>
+          <w:p>
+            <w:r>
+              <w:t>shadcn/ui (Radix Dialog)</w:t>
+            </w:r>
+          </w:p>
+        </w:tc>
+        <w:tc>
+          <w:tcPr>
+            <w:tcW w:type="dxa" w:w="1881"/>
+          </w:tcPr>
+          <w:p>
+            <w:r>
+              <w:t>1.1.15</w:t>
+            </w:r>
+          </w:p>
+        </w:tc>
+        <w:tc>
+          <w:tcPr>
+            <w:tcW w:type="dxa" w:w="1881"/>
+          </w:tcPr>
+          <w:p>
+            <w:r>
+              <w:t>https://ui.shadcn.com</w:t>
+            </w:r>
+          </w:p>
+        </w:tc>
+        <w:tc>
+          <w:tcPr>
+            <w:tcW w:type="dxa" w:w="1881"/>
+          </w:tcPr>
+          <w:p>
+            <w:r>
+              <w:t>Headless-Komponenten auf Basis von Radix UI</w:t>
+            </w:r>
+          </w:p>
+        </w:tc>
+      </w:tr>
+      <w:tr>
+        <w:tc>
+          <w:tcPr>
+            <w:tcW w:type="dxa" w:w="1881"/>
+          </w:tcPr>
+          <w:p>
+            <w:r>
+              <w:t>Icons</w:t>
+            </w:r>
+          </w:p>
+        </w:tc>
+        <w:tc>
+          <w:tcPr>
+            <w:tcW w:type="dxa" w:w="1881"/>
+          </w:tcPr>
+          <w:p>
+            <w:r>
+              <w:t>lucide-react</w:t>
+            </w:r>
+          </w:p>
+        </w:tc>
+        <w:tc>
+          <w:tcPr>
+            <w:tcW w:type="dxa" w:w="1881"/>
+          </w:tcPr>
+          <w:p>
+            <w:r>
+              <w:t>0.475.0</w:t>
+            </w:r>
+          </w:p>
+        </w:tc>
+        <w:tc>
+          <w:tcPr>
+            <w:tcW w:type="dxa" w:w="1881"/>
+          </w:tcPr>
+          <w:p>
+            <w:r>
+              <w:t>https://lucide.dev</w:t>
+            </w:r>
+          </w:p>
+        </w:tc>
+        <w:tc>
+          <w:tcPr>
+            <w:tcW w:type="dxa" w:w="1881"/>
+          </w:tcPr>
+          <w:p>
+            <w:r>
+              <w:t>Interface-Icons</w:t>
+            </w:r>
+          </w:p>
+        </w:tc>
+      </w:tr>
+      <w:tr>
+        <w:tc>
+          <w:tcPr>
+            <w:tcW w:type="dxa" w:w="1881"/>
+          </w:tcPr>
+          <w:p>
+            <w:r>
+              <w:t>Schriftart</w:t>
+            </w:r>
+          </w:p>
+        </w:tc>
+        <w:tc>
+          <w:tcPr>
+            <w:tcW w:type="dxa" w:w="1881"/>
+          </w:tcPr>
+          <w:p>
+            <w:r>
+              <w:t>Geist</w:t>
+            </w:r>
+          </w:p>
+        </w:tc>
+        <w:tc>
+          <w:tcPr>
+            <w:tcW w:type="dxa" w:w="1881"/>
+          </w:tcPr>
+          <w:p>
+            <w:r>
+              <w:t>1.7.0</w:t>
+            </w:r>
+          </w:p>
+        </w:tc>
+        <w:tc>
+          <w:tcPr>
+            <w:tcW w:type="dxa" w:w="1881"/>
+          </w:tcPr>
+          <w:p>
+            <w:r>
+              <w:t>https://vercel.com/font</w:t>
+            </w:r>
+          </w:p>
+        </w:tc>
+        <w:tc>
+          <w:tcPr>
+            <w:tcW w:type="dxa" w:w="1881"/>
+          </w:tcPr>
+          <w:p>
+            <w:r>
+              <w:t>Interface-Typografie</w:t>
+            </w:r>
+          </w:p>
+        </w:tc>
+      </w:tr>
+      <w:tr>
+        <w:tc>
+          <w:tcPr>
+            <w:tcW w:type="dxa" w:w="1881"/>
+          </w:tcPr>
+          <w:p>
+            <w:r>
+              <w:t>Internationalisierung</w:t>
+            </w:r>
+          </w:p>
+        </w:tc>
+        <w:tc>
+          <w:tcPr>
+            <w:tcW w:type="dxa" w:w="1881"/>
+          </w:tcPr>
+          <w:p>
+            <w:r>
+              <w:t>next-intl</w:t>
+            </w:r>
+          </w:p>
+        </w:tc>
+        <w:tc>
+          <w:tcPr>
+            <w:tcW w:type="dxa" w:w="1881"/>
+          </w:tcPr>
+          <w:p>
+            <w:r>
+              <w:t>4.11.1</w:t>
+            </w:r>
+          </w:p>
+        </w:tc>
+        <w:tc>
+          <w:tcPr>
+            <w:tcW w:type="dxa" w:w="1881"/>
+          </w:tcPr>
+          <w:p>
+            <w:r>
+              <w:t>https://next-intl.dev</w:t>
+            </w:r>
+          </w:p>
+        </w:tc>
+        <w:tc>
+          <w:tcPr>
+            <w:tcW w:type="dxa" w:w="1881"/>
+          </w:tcPr>
+          <w:p>
+            <w:r>
+              <w:t>Zweisprachigkeit DE/EN, Locale-Routing</w:t>
+            </w:r>
+          </w:p>
+        </w:tc>
+      </w:tr>
+      <w:tr>
+        <w:tc>
+          <w:tcPr>
+            <w:tcW w:type="dxa" w:w="1881"/>
+          </w:tcPr>
+          <w:p>
+            <w:r>
+              <w:t>Scraping (DOM)</w:t>
+            </w:r>
+          </w:p>
+        </w:tc>
+        <w:tc>
+          <w:tcPr>
+            <w:tcW w:type="dxa" w:w="1881"/>
+          </w:tcPr>
+          <w:p>
+            <w:r>
+              <w:t>Puppeteer</w:t>
+            </w:r>
+          </w:p>
+        </w:tc>
+        <w:tc>
+          <w:tcPr>
+            <w:tcW w:type="dxa" w:w="1881"/>
+          </w:tcPr>
+          <w:p>
+            <w:r>
+              <w:t>23.11.1</w:t>
+            </w:r>
+          </w:p>
+        </w:tc>
+        <w:tc>
+          <w:tcPr>
+            <w:tcW w:type="dxa" w:w="1881"/>
+          </w:tcPr>
+          <w:p>
+            <w:r>
+              <w:t>https://pptr.dev</w:t>
+            </w:r>
+          </w:p>
+        </w:tc>
+        <w:tc>
+          <w:tcPr>
+            <w:tcW w:type="dxa" w:w="1881"/>
+          </w:tcPr>
+          <w:p>
+            <w:r>
+              <w:t>Klassisches DOM-Scraping (Headless Chrome)</w:t>
+            </w:r>
+          </w:p>
+        </w:tc>
+      </w:tr>
+      <w:tr>
+        <w:tc>
+          <w:tcPr>
+            <w:tcW w:type="dxa" w:w="1881"/>
+          </w:tcPr>
+          <w:p>
+            <w:r>
+              <w:t>Scraping (LLM)</w:t>
+            </w:r>
+          </w:p>
+        </w:tc>
+        <w:tc>
+          <w:tcPr>
+            <w:tcW w:type="dxa" w:w="1881"/>
+          </w:tcPr>
+          <w:p>
+            <w:r>
+              <w:t>ScrapeGraphAI</w:t>
+            </w:r>
+          </w:p>
+        </w:tc>
+        <w:tc>
+          <w:tcPr>
+            <w:tcW w:type="dxa" w:w="1881"/>
+          </w:tcPr>
+          <w:p>
+            <w:r>
+              <w:t>1.75.1</w:t>
+            </w:r>
+          </w:p>
+        </w:tc>
+        <w:tc>
+          <w:tcPr>
+            <w:tcW w:type="dxa" w:w="1881"/>
+          </w:tcPr>
+          <w:p>
+            <w:r>
+              <w:t>https://scrapegraphai.com</w:t>
+            </w:r>
+          </w:p>
+        </w:tc>
+        <w:tc>
+          <w:tcPr>
+            <w:tcW w:type="dxa" w:w="1881"/>
+          </w:tcPr>
+          <w:p>
+            <w:r>
+              <w:t>LLM-basierte Datenextraktion</w:t>
+            </w:r>
+          </w:p>
+        </w:tc>
+      </w:tr>
+      <w:tr>
+        <w:tc>
+          <w:tcPr>
+            <w:tcW w:type="dxa" w:w="1881"/>
+          </w:tcPr>
+          <w:p>
+            <w:r>
+              <w:t>Scraping (Cloud)</w:t>
+            </w:r>
+          </w:p>
+        </w:tc>
+        <w:tc>
+          <w:tcPr>
+            <w:tcW w:type="dxa" w:w="1881"/>
+          </w:tcPr>
+          <w:p>
+            <w:r>
+              <w:t>Bright Data</w:t>
+            </w:r>
+          </w:p>
+        </w:tc>
+        <w:tc>
+          <w:tcPr>
+            <w:tcW w:type="dxa" w:w="1881"/>
+          </w:tcPr>
+          <w:p>
+            <w:r>
+              <w:t>–</w:t>
+            </w:r>
+          </w:p>
+        </w:tc>
+        <w:tc>
+          <w:tcPr>
+            <w:tcW w:type="dxa" w:w="1881"/>
+          </w:tcPr>
+          <w:p>
+            <w:r>
+              <w:t>https://docs.brightdata.com</w:t>
+            </w:r>
+          </w:p>
+        </w:tc>
+        <w:tc>
+          <w:tcPr>
+            <w:tcW w:type="dxa" w:w="1881"/>
+          </w:tcPr>
+          <w:p>
+            <w:r>
+              <w:t>Cloud-Scraping-Dienst (Methodenvergleich, siehe Kapitel 6.2)</w:t>
+            </w:r>
+          </w:p>
+        </w:tc>
+      </w:tr>
+      <w:tr>
+        <w:tc>
+          <w:tcPr>
+            <w:tcW w:type="dxa" w:w="1881"/>
+          </w:tcPr>
+          <w:p>
+            <w:r>
+              <w:t>LLM (Extraktion)</w:t>
+            </w:r>
+          </w:p>
+        </w:tc>
+        <w:tc>
+          <w:tcPr>
+            <w:tcW w:type="dxa" w:w="1881"/>
+          </w:tcPr>
+          <w:p>
+            <w:r>
+              <w:t>BFH LLM (gpt-oss:120b)</w:t>
+            </w:r>
+          </w:p>
+        </w:tc>
+        <w:tc>
+          <w:tcPr>
+            <w:tcW w:type="dxa" w:w="1881"/>
+          </w:tcPr>
+          <w:p>
+            <w:r>
+              <w:t>–</w:t>
+            </w:r>
+          </w:p>
+        </w:tc>
+        <w:tc>
+          <w:tcPr>
+            <w:tcW w:type="dxa" w:w="1881"/>
+          </w:tcPr>
+          <w:p>
+            <w:r>
+              <w:t>– (internes BFH-Netz/VPN, kein öffentlicher Doku-Link)</w:t>
+            </w:r>
+          </w:p>
+        </w:tc>
+        <w:tc>
+          <w:tcPr>
+            <w:tcW w:type="dxa" w:w="1881"/>
+          </w:tcPr>
+          <w:p>
+            <w:r>
+              <w:t>Datenextraktion für ScrapeGraphAI (siehe Kapitel 6.3)</w:t>
+            </w:r>
+          </w:p>
+        </w:tc>
+      </w:tr>
+      <w:tr>
+        <w:tc>
+          <w:tcPr>
+            <w:tcW w:type="dxa" w:w="1881"/>
+          </w:tcPr>
+          <w:p>
+            <w:r>
+              <w:t>LLM (Self-Healing)</w:t>
+            </w:r>
+          </w:p>
+        </w:tc>
+        <w:tc>
+          <w:tcPr>
+            <w:tcW w:type="dxa" w:w="1881"/>
+          </w:tcPr>
+          <w:p>
+            <w:r>
+              <w:t>Gemini</w:t>
+            </w:r>
+          </w:p>
+        </w:tc>
+        <w:tc>
+          <w:tcPr>
+            <w:tcW w:type="dxa" w:w="1881"/>
+          </w:tcPr>
+          <w:p>
+            <w:r>
+              <w:t>2.5 Flash</w:t>
+            </w:r>
+          </w:p>
+        </w:tc>
+        <w:tc>
+          <w:tcPr>
+            <w:tcW w:type="dxa" w:w="1881"/>
+          </w:tcPr>
+          <w:p>
+            <w:r>
+              <w:t>https://ai.google.dev/gemini-api/docs</w:t>
+            </w:r>
+          </w:p>
+        </w:tc>
+        <w:tc>
+          <w:tcPr>
+            <w:tcW w:type="dxa" w:w="1881"/>
+          </w:tcPr>
+          <w:p>
+            <w:r>
+              <w:t>Selector-/Prompt-Generierung im Self-Healing-Loop (siehe Kapitel 7)</w:t>
+            </w:r>
+          </w:p>
+        </w:tc>
+      </w:tr>
+    </w:tbl>
+    <w:p>
+      <w:pPr>
         <w:pStyle w:val="Heading1"/>
       </w:pPr>
       <w:r>
@@ -1814,7 +2729,7 @@
         <w:spacing w:after="40"/>
       </w:pPr>
       <w:r>
-        <w:t>Tabelle 3: Umgebungsvariablen-Referenz</w:t>
+        <w:t>Tabelle 4: Umgebungsvariablen-Referenz</w:t>
       </w:r>
     </w:p>
     <w:tbl>
@@ -2231,7 +3146,7 @@
         <w:spacing w:after="40"/>
       </w:pPr>
       <w:r>
-        <w:t>Tabelle 4: Weitere Konfigurationsdateien</w:t>
+        <w:t>Tabelle 5: Weitere Konfigurationsdateien</w:t>
       </w:r>
     </w:p>
     <w:tbl>
@@ -2561,7 +3476,7 @@
         <w:spacing w:after="40"/>
       </w:pPr>
       <w:r>
-        <w:t>Tabelle 5: Übersicht der Datenbanktabellen</w:t>
+        <w:t>Tabelle 6: Übersicht der Datenbanktabellen</w:t>
       </w:r>
     </w:p>
     <w:tbl>
@@ -3033,7 +3948,7 @@
         <w:spacing w:after="40"/>
       </w:pPr>
       <w:r>
-        <w:t>Tabelle 6: RLS-Status je Tabelle</w:t>
+        <w:t>Tabelle 7: RLS-Status je Tabelle</w:t>
       </w:r>
     </w:p>
     <w:tbl>
@@ -3582,7 +4497,7 @@
         <w:spacing w:after="40"/>
       </w:pPr>
       <w:r>
-        <w:t>Tabelle 7: Referenz-SQL-Skripte</w:t>
+        <w:t>Tabelle 8: Referenz-SQL-Skripte</w:t>
       </w:r>
     </w:p>
     <w:tbl>
@@ -3796,7 +4711,7 @@
         <w:spacing w:after="40"/>
       </w:pPr>
       <w:r>
-        <w:t>Tabelle 8: Vergleich der drei Scraping-Methoden</w:t>
+        <w:t>Tabelle 9: Vergleich der drei Scraping-Methoden</w:t>
       </w:r>
     </w:p>
     <w:tbl>
@@ -4079,7 +4994,7 @@
         <w:spacing w:after="40"/>
       </w:pPr>
       <w:r>
-        <w:t>Tabelle 9: Zentrale Tabellen im Scraper-Lebenszyklus</w:t>
+        <w:t>Tabelle 10: Zentrale Tabellen im Scraper-Lebenszyklus</w:t>
       </w:r>
     </w:p>
     <w:tbl>
@@ -4305,7 +5220,7 @@
         <w:spacing w:after="40"/>
       </w:pPr>
       <w:r>
-        <w:t>Tabelle 10: Manuelle Ausführung je Scraping-Methode</w:t>
+        <w:t>Tabelle 11: Manuelle Ausführung je Scraping-Methode</w:t>
       </w:r>
     </w:p>
     <w:tbl>
@@ -5166,6 +6081,120 @@
         <w:pStyle w:val="Heading3"/>
       </w:pPr>
       <w:r>
+        <w:t>Extraktionsschema im Bright-Data-Dashboard</w:t>
+      </w:r>
+    </w:p>
+    <w:p>
+      <w:pPr/>
+      <w:r>
+        <w:t>Welche Felder pro Kurs und pro Anbieter extrahiert werden, ist nicht im Projekt-Code hinterlegt, sondern als Freitext-Prompt im jeweiligen Data Collector der Bright-Data-Scraper-Studio-Oberfläche konfiguriert. Pro Kurs werden folgende Felder extrahiert:</w:t>
+      </w:r>
+    </w:p>
+    <w:p>
+      <w:pPr>
+        <w:pStyle w:val="ListBullet"/>
+      </w:pPr>
+      <w:r>
+        <w:t>Kursname, Kursart (Langzeitgymi oder Kurzzeitgymi)</w:t>
+      </w:r>
+    </w:p>
+    <w:p>
+      <w:pPr>
+        <w:pStyle w:val="ListBullet"/>
+      </w:pPr>
+      <w:r>
+        <w:t>Wochentag und Uhrzeit</w:t>
+      </w:r>
+    </w:p>
+    <w:p>
+      <w:pPr>
+        <w:pStyle w:val="ListBullet"/>
+      </w:pPr>
+      <w:r>
+        <w:t>Standort (z. B. Zürich HB, Stadelhofen, Winterthur, Online)</w:t>
+      </w:r>
+    </w:p>
+    <w:p>
+      <w:pPr>
+        <w:pStyle w:val="ListBullet"/>
+      </w:pPr>
+      <w:r>
+        <w:t>Startdatum und Enddatum (Format TT.MM.JJJJ)</w:t>
+      </w:r>
+    </w:p>
+    <w:p>
+      <w:pPr>
+        <w:pStyle w:val="ListBullet"/>
+      </w:pPr>
+      <w:r>
+        <w:t>Preis in CHF als Zahl (nur Gruppenpreis, keine Einzelstundenpreise); falls ein Rabatt sichtbar ist, zusätzlich der reguläre Preis und das Rabatt-Ablaufdatum</w:t>
+      </w:r>
+    </w:p>
+    <w:p>
+      <w:pPr>
+        <w:pStyle w:val="ListBullet"/>
+      </w:pPr>
+      <w:r>
+        <w:t>Verfügbarkeitsstatus (z. B. „freie Plätze“, „wenige Plätze“, „ausgebucht“)</w:t>
+      </w:r>
+    </w:p>
+    <w:p>
+      <w:pPr>
+        <w:pStyle w:val="ListBullet"/>
+      </w:pPr>
+      <w:r>
+        <w:t>Ob der Kurs online stattfindet</w:t>
+      </w:r>
+    </w:p>
+    <w:p>
+      <w:pPr/>
+      <w:r>
+        <w:t>Zusätzlich werden als Anbieter-Metadaten (einmal pro Anbieter, nicht pro Kurs) extrahiert:</w:t>
+      </w:r>
+    </w:p>
+    <w:p>
+      <w:pPr>
+        <w:pStyle w:val="ListBullet"/>
+      </w:pPr>
+      <w:r>
+        <w:t>Ob Aufsatzkorrektur, Einstufungstest, Prüfungsarchiv, Beratungsgespräch oder eigenes Lernmaterial angeboten wird</w:t>
+      </w:r>
+    </w:p>
+    <w:p>
+      <w:pPr>
+        <w:pStyle w:val="ListBullet"/>
+      </w:pPr>
+      <w:r>
+        <w:t>Ob E-Learning oder eine Online-Prüfung verfügbar ist</w:t>
+      </w:r>
+    </w:p>
+    <w:p>
+      <w:pPr>
+        <w:pStyle w:val="ListBullet"/>
+      </w:pPr>
+      <w:r>
+        <w:t>Ob Nachholoptionen, Aufholstunden, Hausaufgabenbetreuung oder Wiederholung verpasster Lektionen angeboten wird</w:t>
+      </w:r>
+    </w:p>
+    <w:p>
+      <w:pPr>
+        <w:pStyle w:val="ListBullet"/>
+      </w:pPr>
+      <w:r>
+        <w:t>Maximale Gruppengrösse als Zahl</w:t>
+      </w:r>
+    </w:p>
+    <w:p>
+      <w:pPr/>
+      <w:r>
+        <w:t>Diese Felder entsprechen direkt den Spalten des courses- bzw. CourseDetails-Schemas (Kapitel 5.2); transform_courses() und aggregate_metadata() übernehmen sie im Wesentlichen unverändert, statt sie aus HTML zu parsen.</w:t>
+      </w:r>
+    </w:p>
+    <w:p>
+      <w:pPr>
+        <w:pStyle w:val="Heading3"/>
+      </w:pPr>
+      <w:r>
         <w:t>Manuelles Auslösen</w:t>
       </w:r>
     </w:p>
@@ -5256,6 +6285,50 @@
     </w:p>
     <w:p>
       <w:pPr>
+        <w:pStyle w:val="Heading3"/>
+      </w:pPr>
+      <w:r>
+        <w:t>Collector-ID für einen neuen Anbieter einrichten</w:t>
+      </w:r>
+    </w:p>
+    <w:p>
+      <w:pPr/>
+      <w:r>
+        <w:t>Um Bright Data auf einen zusätzlichen Anbieter anzusetzen, muss zunächst im Bright-Data-Dashboard ein neuer Data Collector angelegt und dessen Collector-ID als Umgebungsvariable hinterlegt werden:</w:t>
+      </w:r>
+    </w:p>
+    <w:p>
+      <w:pPr>
+        <w:pStyle w:val="ListNumber"/>
+      </w:pPr>
+      <w:r>
+        <w:t>Im Bright-Data-Dashboard einloggen und zu Scraper / Scraper Studio navigieren.</w:t>
+      </w:r>
+    </w:p>
+    <w:p>
+      <w:pPr>
+        <w:pStyle w:val="ListNumber"/>
+      </w:pPr>
+      <w:r>
+        <w:t>Den gewünschten Collector öffnen; die Collector-ID steht als c_xxxxxxxxxxxxxxxx-Teil in der Browser-Adresszeile (https://brightdata.com/cp/scrapers/c_xxxxxxxxxxxxxxxx/stats?...).</w:t>
+      </w:r>
+    </w:p>
+    <w:p>
+      <w:pPr>
+        <w:pStyle w:val="ListNumber"/>
+      </w:pPr>
+      <w:r>
+        <w:t>Die ID als neue Variable BRIGHT_DATA_COLLECTOR_ID_&lt;ANBIETER&gt; in .env eintragen (siehe Kapitel 4.1) und im entsprechenden Scraper-Skript per os.getenv() referenzieren.</w:t>
+      </w:r>
+    </w:p>
+    <w:p>
+      <w:pPr/>
+      <w:r>
+        <w:t>Die Collector-ID wird, wie der BRIGHT_DATA_API_TOKEN, ausschliesslich über die Umgebungsvariablen in .env verwaltet und nicht versioniert.</w:t>
+      </w:r>
+    </w:p>
+    <w:p>
+      <w:pPr>
         <w:pStyle w:val="Heading2"/>
       </w:pPr>
       <w:r>
@@ -6240,7 +7313,7 @@
         <w:spacing w:after="40"/>
       </w:pPr>
       <w:r>
-        <w:t>Tabelle 11: Tabellen im Self-Healing-Kreislauf</w:t>
+        <w:t>Tabelle 12: Tabellen im Self-Healing-Kreislauf</w:t>
       </w:r>
     </w:p>
     <w:tbl>
@@ -6652,7 +7725,7 @@
         <w:spacing w:after="40"/>
       </w:pPr>
       <w:r>
-        <w:t>Tabelle 12: Felder der Tabelle zap_info</w:t>
+        <w:t>Tabelle 13: Felder der Tabelle zap_info</w:t>
       </w:r>
     </w:p>
     <w:tbl>
@@ -7282,7 +8355,7 @@
         <w:spacing w:after="40"/>
       </w:pPr>
       <w:r>
-        <w:t>Tabelle 13: Zod-Validierungsschemas</w:t>
+        <w:t>Tabelle 14: Zod-Validierungsschemas</w:t>
       </w:r>
     </w:p>
     <w:tbl>
@@ -7539,6 +8612,226 @@
       </w:r>
     </w:p>
     <w:p>
+      <w:r>
+        <w:drawing>
+          <wp:inline xmlns:a="http://schemas.openxmlformats.org/drawingml/2006/main" xmlns:pic="http://schemas.openxmlformats.org/drawingml/2006/picture">
+            <wp:extent cx="5580000" cy="4500676"/>
+            <wp:docPr id="21" name="Picture 21"/>
+            <wp:cNvGraphicFramePr>
+              <a:graphicFrameLocks noChangeAspect="1"/>
+            </wp:cNvGraphicFramePr>
+            <a:graphic>
+              <a:graphicData uri="http://schemas.openxmlformats.org/drawingml/2006/picture">
+                <pic:pic>
+                  <pic:nvPicPr>
+                    <pic:cNvPr id="0" name="fig1-gymiproviderschema.png"/>
+                    <pic:cNvPicPr/>
+                  </pic:nvPicPr>
+                  <pic:blipFill>
+                    <a:blip r:embed="rId30"/>
+                    <a:stretch>
+                      <a:fillRect/>
+                    </a:stretch>
+                  </pic:blipFill>
+                  <pic:spPr>
+                    <a:xfrm>
+                      <a:off x="0" y="0"/>
+                      <a:ext cx="5580000" cy="4500676"/>
+                    </a:xfrm>
+                    <a:prstGeom prst="rect"/>
+                  </pic:spPr>
+                </pic:pic>
+              </a:graphicData>
+            </a:graphic>
+          </wp:inline>
+        </w:drawing>
+      </w:r>
+    </w:p>
+    <w:p>
+      <w:pPr>
+        <w:pStyle w:val="Caption2"/>
+      </w:pPr>
+      <w:r>
+        <w:t>Abbildung 21: Ausschnitt aus schemas/gymiProviderSchema.ts – Definition von GymiProviderSchema (Quelle: BT Fig. 1).</w:t>
+      </w:r>
+    </w:p>
+    <w:p>
+      <w:r>
+        <w:drawing>
+          <wp:inline xmlns:a="http://schemas.openxmlformats.org/drawingml/2006/main" xmlns:pic="http://schemas.openxmlformats.org/drawingml/2006/picture">
+            <wp:extent cx="5580000" cy="3369640"/>
+            <wp:docPr id="22" name="Picture 22"/>
+            <wp:cNvGraphicFramePr>
+              <a:graphicFrameLocks noChangeAspect="1"/>
+            </wp:cNvGraphicFramePr>
+            <a:graphic>
+              <a:graphicData uri="http://schemas.openxmlformats.org/drawingml/2006/picture">
+                <pic:pic>
+                  <pic:nvPicPr>
+                    <pic:cNvPr id="0" name="fig2-courseschema-enum.png"/>
+                    <pic:cNvPicPr/>
+                  </pic:nvPicPr>
+                  <pic:blipFill>
+                    <a:blip r:embed="rId31"/>
+                    <a:stretch>
+                      <a:fillRect/>
+                    </a:stretch>
+                  </pic:blipFill>
+                  <pic:spPr>
+                    <a:xfrm>
+                      <a:off x="0" y="0"/>
+                      <a:ext cx="5580000" cy="3369640"/>
+                    </a:xfrm>
+                    <a:prstGeom prst="rect"/>
+                  </pic:spPr>
+                </pic:pic>
+              </a:graphicData>
+            </a:graphic>
+          </wp:inline>
+        </w:drawing>
+      </w:r>
+    </w:p>
+    <w:p>
+      <w:pPr>
+        <w:pStyle w:val="Caption2"/>
+      </w:pPr>
+      <w:r>
+        <w:t>Abbildung 22: Ausschnitt aus schemas/courseSchema.ts – Definition von CourseSchema mit Enum-Constraints (Quelle: BT Fig. 2).</w:t>
+      </w:r>
+    </w:p>
+    <w:p>
+      <w:r>
+        <w:drawing>
+          <wp:inline xmlns:a="http://schemas.openxmlformats.org/drawingml/2006/main" xmlns:pic="http://schemas.openxmlformats.org/drawingml/2006/picture">
+            <wp:extent cx="5580000" cy="2839695"/>
+            <wp:docPr id="23" name="Picture 23"/>
+            <wp:cNvGraphicFramePr>
+              <a:graphicFrameLocks noChangeAspect="1"/>
+            </wp:cNvGraphicFramePr>
+            <a:graphic>
+              <a:graphicData uri="http://schemas.openxmlformats.org/drawingml/2006/picture">
+                <pic:pic>
+                  <pic:nvPicPr>
+                    <pic:cNvPr id="0" name="fig3-parsegymiproviders.png"/>
+                    <pic:cNvPicPr/>
+                  </pic:nvPicPr>
+                  <pic:blipFill>
+                    <a:blip r:embed="rId32"/>
+                    <a:stretch>
+                      <a:fillRect/>
+                    </a:stretch>
+                  </pic:blipFill>
+                  <pic:spPr>
+                    <a:xfrm>
+                      <a:off x="0" y="0"/>
+                      <a:ext cx="5580000" cy="2839695"/>
+                    </a:xfrm>
+                    <a:prstGeom prst="rect"/>
+                  </pic:spPr>
+                </pic:pic>
+              </a:graphicData>
+            </a:graphic>
+          </wp:inline>
+        </w:drawing>
+      </w:r>
+    </w:p>
+    <w:p>
+      <w:pPr>
+        <w:pStyle w:val="Caption2"/>
+      </w:pPr>
+      <w:r>
+        <w:t>Abbildung 23: Ausschnitt aus schemas/gymiProviderSchema.ts – fehlertolerante Variante parseGymiProviders (Quelle: BT Fig. 3).</w:t>
+      </w:r>
+    </w:p>
+    <w:p>
+      <w:r>
+        <w:drawing>
+          <wp:inline xmlns:a="http://schemas.openxmlformats.org/drawingml/2006/main" xmlns:pic="http://schemas.openxmlformats.org/drawingml/2006/picture">
+            <wp:extent cx="5580000" cy="1863480"/>
+            <wp:docPr id="24" name="Picture 24"/>
+            <wp:cNvGraphicFramePr>
+              <a:graphicFrameLocks noChangeAspect="1"/>
+            </wp:cNvGraphicFramePr>
+            <a:graphic>
+              <a:graphicData uri="http://schemas.openxmlformats.org/drawingml/2006/picture">
+                <pic:pic>
+                  <pic:nvPicPr>
+                    <pic:cNvPr id="0" name="fig4-parsegymiprovider-strict.png"/>
+                    <pic:cNvPicPr/>
+                  </pic:nvPicPr>
+                  <pic:blipFill>
+                    <a:blip r:embed="rId33"/>
+                    <a:stretch>
+                      <a:fillRect/>
+                    </a:stretch>
+                  </pic:blipFill>
+                  <pic:spPr>
+                    <a:xfrm>
+                      <a:off x="0" y="0"/>
+                      <a:ext cx="5580000" cy="1863480"/>
+                    </a:xfrm>
+                    <a:prstGeom prst="rect"/>
+                  </pic:spPr>
+                </pic:pic>
+              </a:graphicData>
+            </a:graphic>
+          </wp:inline>
+        </w:drawing>
+      </w:r>
+    </w:p>
+    <w:p>
+      <w:pPr>
+        <w:pStyle w:val="Caption2"/>
+      </w:pPr>
+      <w:r>
+        <w:t>Abbildung 24: Ausschnitt aus schemas/gymiProviderSchema.ts – strikte Variante parseGymiProvider, die bei Validierungsfehlern eine Exception wirft (Quelle: BT Fig. 4).</w:t>
+      </w:r>
+    </w:p>
+    <w:p>
+      <w:r>
+        <w:drawing>
+          <wp:inline xmlns:a="http://schemas.openxmlformats.org/drawingml/2006/main" xmlns:pic="http://schemas.openxmlformats.org/drawingml/2006/picture">
+            <wp:extent cx="5580000" cy="2920525"/>
+            <wp:docPr id="25" name="Picture 25"/>
+            <wp:cNvGraphicFramePr>
+              <a:graphicFrameLocks noChangeAspect="1"/>
+            </wp:cNvGraphicFramePr>
+            <a:graphic>
+              <a:graphicData uri="http://schemas.openxmlformats.org/drawingml/2006/picture">
+                <pic:pic>
+                  <pic:nvPicPr>
+                    <pic:cNvPr id="0" name="fig5-getpreiskategorie.png"/>
+                    <pic:cNvPicPr/>
+                  </pic:nvPicPr>
+                  <pic:blipFill>
+                    <a:blip r:embed="rId34"/>
+                    <a:stretch>
+                      <a:fillRect/>
+                    </a:stretch>
+                  </pic:blipFill>
+                  <pic:spPr>
+                    <a:xfrm>
+                      <a:off x="0" y="0"/>
+                      <a:ext cx="5580000" cy="2920525"/>
+                    </a:xfrm>
+                    <a:prstGeom prst="rect"/>
+                  </pic:spPr>
+                </pic:pic>
+              </a:graphicData>
+            </a:graphic>
+          </wp:inline>
+        </w:drawing>
+      </w:r>
+    </w:p>
+    <w:p>
+      <w:pPr>
+        <w:pStyle w:val="Caption2"/>
+      </w:pPr>
+      <w:r>
+        <w:t>Abbildung 25: Ausschnitt aus schemas/gymiProviderSchema.ts – dynamische Preiskategorisierung getPreisKategorie (Quelle: BT Fig. 5).</w:t>
+      </w:r>
+    </w:p>
+    <w:p>
       <w:pPr>
         <w:pStyle w:val="Heading2"/>
       </w:pPr>
@@ -7557,7 +8850,7 @@
         <w:spacing w:after="40"/>
       </w:pPr>
       <w:r>
-        <w:t>Tabelle 14: Zustand-Stores (Client-State)</w:t>
+        <w:t>Tabelle 15: Zustand-Stores (Client-State)</w:t>
       </w:r>
     </w:p>
     <w:tbl>
@@ -7907,7 +9200,7 @@
         <w:spacing w:after="40"/>
       </w:pPr>
       <w:r>
-        <w:t>Tabelle 15: Bewertungskriterien und Indikatoren</w:t>
+        <w:t>Tabelle 16: Bewertungskriterien und Indikatoren</w:t>
       </w:r>
     </w:p>
     <w:tbl>
@@ -8547,7 +9840,7 @@
         <w:spacing w:after="40"/>
       </w:pPr>
       <w:r>
-        <w:t>Tabelle 16: Score-Formeln je Kriterium</w:t>
+        <w:t>Tabelle 17: Score-Formeln je Kriterium</w:t>
       </w:r>
     </w:p>
     <w:tbl>
@@ -9882,7 +11175,7 @@
         <w:spacing w:after="40"/>
       </w:pPr>
       <w:r>
-        <w:t>Tabelle 17: Die zwei Supabase-Clients</w:t>
+        <w:t>Tabelle 18: Die zwei Supabase-Clients</w:t>
       </w:r>
     </w:p>
     <w:tbl>
@@ -10178,7 +11471,7 @@
         <w:spacing w:after="40"/>
       </w:pPr>
       <w:r>
-        <w:t>Tabelle 18: GitHub-Actions-Workflows</w:t>
+        <w:t>Tabelle 19: GitHub-Actions-Workflows</w:t>
       </w:r>
     </w:p>
     <w:tbl>
@@ -10401,7 +11694,7 @@
         <w:spacing w:after="40"/>
       </w:pPr>
       <w:r>
-        <w:t>Tabelle 19: npm-Skripte im Überblick</w:t>
+        <w:t>Tabelle 20: npm-Skripte im Überblick</w:t>
       </w:r>
     </w:p>
     <w:tbl>
@@ -10803,7 +12096,7 @@
         <w:spacing w:after="40"/>
       </w:pPr>
       <w:r>
-        <w:t>Tabelle 20: Bekannte Probleme und Lösungen</w:t>
+        <w:t>Tabelle 21: Bekannte Probleme und Lösungen</w:t>
       </w:r>
     </w:p>
     <w:tbl>
@@ -11352,7 +12645,7 @@
         <w:spacing w:after="40"/>
       </w:pPr>
       <w:r>
-        <w:t>Tabelle 21: Glossar der Fachbegriffe</w:t>
+        <w:t>Tabelle 22: Glossar der Fachbegriffe</w:t>
       </w:r>
     </w:p>
     <w:tbl>
@@ -11667,7 +12960,120 @@
         <w:pStyle w:val="Heading2"/>
       </w:pPr>
       <w:r>
-        <w:t>17.3 Offene Punkte und Annahmen</w:t>
+        <w:t>17.3 Wiederherstellung eines pausierten Supabase-Projekts</w:t>
+      </w:r>
+    </w:p>
+    <w:p>
+      <w:pPr/>
+      <w:r>
+        <w:t>Supabase pausiert Projekte auf dem kostenlosen Free-Tier nach längerer Inaktivität automatisch. Laut BT-Anhang (BT Tab. 44) liess sich ein derart pausiertes Projekt nach mehr als 90 Tagen nicht mehr direkt über das Dashboard reaktivieren – die zugrunde liegende Datenbank blieb jedoch als herunterladbares Backup verfügbar. Die folgende Anleitung fasst das in der BT beschriebene Vorgehen zusammen und ergänzt es um die dort nicht ausformulierten konkreten Befehle.</w:t>
+      </w:r>
+    </w:p>
+    <w:p>
+      <w:pPr>
+        <w:pStyle w:val="ListNumber"/>
+      </w:pPr>
+      <w:r>
+        <w:t>Backup herunterladen: Im Supabase-Dashboard des pausierten Projekts unter Settings → Backups (bzw. Database → Backups) das verfügbare Backup als komprimiertes Archiv herunterladen.</w:t>
+      </w:r>
+    </w:p>
+    <w:p>
+      <w:pPr>
+        <w:pStyle w:val="ListNumber"/>
+      </w:pPr>
+      <w:r>
+        <w:t>Neues Projekt anlegen: Ein neues Supabase-Projekt erstellen, das die wiederhergestellten Daten aufnimmt. Es erhält eine eigene Connection-URL sowie neue API-Keys (anon und service_role).</w:t>
+      </w:r>
+    </w:p>
+    <w:p>
+      <w:pPr>
+        <w:pStyle w:val="ListNumber"/>
+      </w:pPr>
+      <w:r>
+        <w:t>Lokale Restore-Umgebung vorbereiten: PostgreSQL-Client-Tools (psql, pg_restore – Teil der offiziellen PostgreSQL-Installation) lokal installieren und das heruntergeladene Archiv entpacken.</w:t>
+      </w:r>
+    </w:p>
+    <w:p>
+      <w:pPr>
+        <w:pStyle w:val="ListNumber"/>
+      </w:pPr>
+      <w:r>
+        <w:t>Connection-String der Ziel-Datenbank ermitteln: Im neuen Projekt unter Settings → Database → Connection string die Direct-Connection-URI (Port 5432) kopieren, nicht die des Connection-Poolers (Port 6543) – ein vollständiger Restore mit DDL-Anweisungen benötigt eine direkte Session-Verbindung.</w:t>
+      </w:r>
+    </w:p>
+    <w:p>
+      <w:pPr>
+        <w:pStyle w:val="ListNumber"/>
+      </w:pPr>
+      <w:r>
+        <w:t>Datenbank wiederherstellen: Je nach Exportformat entweder als reinen SQL-Dump mit psql einspielen oder – bei einem Custom-Format-Dump – mit pg_restore importieren (Befehle siehe unten).</w:t>
+      </w:r>
+    </w:p>
+    <w:p>
+      <w:pPr>
+        <w:pStyle w:val="ListNumber"/>
+      </w:pPr>
+      <w:r>
+        <w:t>Projekt-Einstellungen nachziehen: Das Backup enthält nur Tabellen, Relationen und Zeilen. Folgende Einstellungen sind nicht Teil des Dumps und müssen manuell im neuen Projekt nachgezogen werden: Auth-Einstellungen, Realtime-Publikationen (siehe Kapitel 12.3), aktivierte Postgres-Extensions sowie ggf. Edge Functions.</w:t>
+      </w:r>
+    </w:p>
+    <w:p>
+      <w:pPr>
+        <w:pStyle w:val="ListNumber"/>
+      </w:pPr>
+      <w:r>
+        <w:t>Anwendung umstellen: Die drei Supabase-Umgebungsvariablen NEXT_PUBLIC_SUPABASE_URL, NEXT_PUBLIC_SUPABASE_ANON_KEY und SUPABASE_SERVICE_ROLE_KEY (siehe Kapitel 4.1) in .env auf das neue Projekt umstellen und Webanwendung sowie alle Scraper neu starten.</w:t>
+      </w:r>
+    </w:p>
+    <w:p>
+      <w:pPr>
+        <w:pStyle w:val="Code"/>
+      </w:pPr>
+      <w:r>
+        <w:t># Variante 1: reiner SQL-Dump</w:t>
+      </w:r>
+    </w:p>
+    <w:p>
+      <w:pPr>
+        <w:pStyle w:val="Code"/>
+      </w:pPr>
+      <w:r>
+        <w:t>psql "postgresql://postgres:[PASSWORT]@[NEUE-PROJEKT-REF].supabase.co:5432/postgres" -f backup.sql</w:t>
+      </w:r>
+    </w:p>
+    <w:p>
+      <w:pPr>
+        <w:pStyle w:val="Code"/>
+      </w:pPr>
+    </w:p>
+    <w:p>
+      <w:pPr>
+        <w:pStyle w:val="Code"/>
+      </w:pPr>
+      <w:r>
+        <w:t># Variante 2: Custom-Format-Dump (.dump / .backup)</w:t>
+      </w:r>
+    </w:p>
+    <w:p>
+      <w:pPr>
+        <w:pStyle w:val="Code"/>
+      </w:pPr>
+      <w:r>
+        <w:t>pg_restore --no-owner --clean -d "postgresql://postgres:[PASSWORT]@[NEUE-PROJEKT-REF].supabase.co:5432/postgres" backup.dump</w:t>
+      </w:r>
+    </w:p>
+    <w:p>
+      <w:pPr/>
+      <w:r>
+        <w:t>Um eine erneute Pausierung zu vermeiden, empfiehlt sich entweder ein periodischer, minimaler Zugriff auf das Projekt (z. B. ein wöchentlich geplanter Health-Check-Query) oder ein Upgrade auf einen kostenpflichtigen Supabase-Plan ohne automatische Pausierung.</w:t>
+      </w:r>
+    </w:p>
+    <w:p>
+      <w:pPr>
+        <w:pStyle w:val="Heading2"/>
+      </w:pPr>
+      <w:r>
+        <w:t>17.4 Offene Punkte und Annahmen</w:t>
       </w:r>
     </w:p>
     <w:p>

</xml_diff>

<commit_message>
Add full ScrapeGraphAI prompt reference for all 12 providers to appendix
Extract every HARDCODED_PROMPT/HARDCODED_PROMPTS value from the twelve
sGAI_*.py scrapers via AST parsing and add it as a new appendix
section 17.4, so the actual per-provider extraction prompts (not just
the Avidii example from chapter 6.3) are documented. Appendix section
"Offene Punkte und Annahmen" renumbered to 17.5.

Co-Authored-By: Claude Sonnet 5 <noreply@anthropic.com>
</commit_message>
<xml_diff>
--- a/docs/Technische-Dokumentation.docx
+++ b/docs/Technische-Dokumentation.docx
@@ -29375,18 +29375,3110 @@
     <w:p>
       <w:pPr>
         <w:pStyle w:val="berschrift2"/>
-        <w:rPr>
-          <w:lang w:val="de-CH"/>
-        </w:rPr>
-      </w:pPr>
-      <w:bookmarkStart w:id="86" w:name="_Toc237169783"/>
-      <w:r>
-        <w:rPr>
-          <w:lang w:val="de-CH"/>
-        </w:rPr>
-        <w:t>17.4 Offene Punkte und Annahmen</w:t>
-      </w:r>
-      <w:bookmarkEnd w:id="86"/>
+      </w:pPr>
+      <w:r>
+        <w:t>17.4 Vollständige ScrapeGraphAI-Prompts</w:t>
+      </w:r>
+    </w:p>
+    <w:p>
+      <w:pPr/>
+      <w:r>
+        <w:t>Referenz aller Extraktions-Prompts der zwölf ScrapeGraphAI-Scraper, direkt aus dem jeweiligen HARDCODED_PROMPT bzw. HARDCODED_PROMPTS-Dict extrahiert (siehe Kapitel 6.3 für das grundlegende Muster am Beispiel Avidii). Dies sind die fest codierten Fallback-Prompts; zur Laufzeit kann bei elf der zwölf Scraper ein über den Self-Healing-Loop reparierter Prompt aus scraper_registry Vorrang haben (Kapitel 6.3, "Self-Healing-Rücklese").</w:t>
+      </w:r>
+    </w:p>
+    <w:p>
+      <w:pPr>
+        <w:pStyle w:val="berschrift3"/>
+      </w:pPr>
+      <w:r>
+        <w:t>Anbieter 1: Gymivorbereitung Zuerich (sGAI_gymivorbereitungZuerichScraper.py)</w:t>
+      </w:r>
+    </w:p>
+    <w:p>
+      <w:pPr>
+        <w:pStyle w:val="Code"/>
+      </w:pPr>
+    </w:p>
+    <w:p>
+      <w:pPr>
+        <w:pStyle w:val="Code"/>
+      </w:pPr>
+      <w:r>
+        <w:t>Du bist ein Datenextraktions-Assistent. Extrahiere alle Kurszeilen aus dieser Webseite.</w:t>
+      </w:r>
+    </w:p>
+    <w:p>
+      <w:pPr>
+        <w:pStyle w:val="Code"/>
+      </w:pPr>
+    </w:p>
+    <w:p>
+      <w:pPr>
+        <w:pStyle w:val="Code"/>
+      </w:pPr>
+      <w:r>
+        <w:t>Für jeden Kurs gib folgende Felder zurück:</w:t>
+      </w:r>
+    </w:p>
+    <w:p>
+      <w:pPr>
+        <w:pStyle w:val="Code"/>
+      </w:pPr>
+      <w:r>
+        <w:t>- course_name: Name des Kurses (z.B. "Kurs A", "Halbjahreskurs")</w:t>
+      </w:r>
+    </w:p>
+    <w:p>
+      <w:pPr>
+        <w:pStyle w:val="Code"/>
+      </w:pPr>
+      <w:r>
+        <w:t>- weekday: Wochentag (z.B. "Samstag", "Mittwoch")</w:t>
+      </w:r>
+    </w:p>
+    <w:p>
+      <w:pPr>
+        <w:pStyle w:val="Code"/>
+      </w:pPr>
+      <w:r>
+        <w:t>- course_time: Uhrzeit (z.B. "11:00-12:30")</w:t>
+      </w:r>
+    </w:p>
+    <w:p>
+      <w:pPr>
+        <w:pStyle w:val="Code"/>
+      </w:pPr>
+      <w:r>
+        <w:t>- location: Kursort (z.B. "Zürich HB", "Stadelhofen", "Winterthur", "Online")</w:t>
+      </w:r>
+    </w:p>
+    <w:p>
+      <w:pPr>
+        <w:pStyle w:val="Code"/>
+      </w:pPr>
+      <w:r>
+        <w:t>- start_date: Startdatum im Format TT.MM.JJJJ (z.B. "29.08.2026")</w:t>
+      </w:r>
+    </w:p>
+    <w:p>
+      <w:pPr>
+        <w:pStyle w:val="Code"/>
+      </w:pPr>
+      <w:r>
+        <w:t>- price_chf: aktueller Preis in CHF als Zahl (z.B. 3290)</w:t>
+      </w:r>
+    </w:p>
+    <w:p>
+      <w:pPr>
+        <w:pStyle w:val="Code"/>
+      </w:pPr>
+      <w:r>
+        <w:t>- price_regular_chf: Regulärpreis in CHF falls Frühbucherrabatt vorhanden (z.B. 3490)</w:t>
+      </w:r>
+    </w:p>
+    <w:p>
+      <w:pPr>
+        <w:pStyle w:val="Code"/>
+      </w:pPr>
+      <w:r>
+        <w:t>- discount_valid_until: Monat bis wann Frühbucherrabatt gilt (z.B. "Mai", "Juni")</w:t>
+      </w:r>
+    </w:p>
+    <w:p>
+      <w:pPr>
+        <w:pStyle w:val="Code"/>
+      </w:pPr>
+      <w:r>
+        <w:t>- availability: Verfügbarkeitsstatus (z.B. "Freie Plätze", "Wenige Plätze", "Ausgebucht")</w:t>
+      </w:r>
+    </w:p>
+    <w:p>
+      <w:pPr>
+        <w:pStyle w:val="Code"/>
+      </w:pPr>
+      <w:r>
+        <w:t>- is_online: true wenn Kurs online stattfindet, sonst false</w:t>
+      </w:r>
+    </w:p>
+    <w:p>
+      <w:pPr>
+        <w:pStyle w:val="Code"/>
+      </w:pPr>
+    </w:p>
+    <w:p>
+      <w:pPr>
+        <w:pStyle w:val="Code"/>
+      </w:pPr>
+      <w:r>
+        <w:t>Gib auch folgende Anbieter-Metadaten zurück:</w:t>
+      </w:r>
+    </w:p>
+    <w:p>
+      <w:pPr>
+        <w:pStyle w:val="Code"/>
+      </w:pPr>
+      <w:r>
+        <w:t>- aufsatzkorrektur: true/false</w:t>
+      </w:r>
+    </w:p>
+    <w:p>
+      <w:pPr>
+        <w:pStyle w:val="Code"/>
+      </w:pPr>
+      <w:r>
+        <w:t>- einstufungstest: true/false</w:t>
+      </w:r>
+    </w:p>
+    <w:p>
+      <w:pPr>
+        <w:pStyle w:val="Code"/>
+      </w:pPr>
+      <w:r>
+        <w:t>- e_learning: true/false</w:t>
+      </w:r>
+    </w:p>
+    <w:p>
+      <w:pPr>
+        <w:pStyle w:val="Code"/>
+      </w:pPr>
+      <w:r>
+        <w:t>- pruefungsarchiv: true/false</w:t>
+      </w:r>
+    </w:p>
+    <w:p>
+      <w:pPr>
+        <w:pStyle w:val="Code"/>
+      </w:pPr>
+      <w:r>
+        <w:t>- beratungsgespraech: true/false</w:t>
+      </w:r>
+    </w:p>
+    <w:p>
+      <w:pPr>
+        <w:pStyle w:val="Code"/>
+      </w:pPr>
+      <w:r>
+        <w:t>- lernunterlagen: true/false</w:t>
+      </w:r>
+    </w:p>
+    <w:p>
+      <w:pPr>
+        <w:pStyle w:val="Code"/>
+      </w:pPr>
+      <w:r>
+        <w:t>- pruefungssimulation: true/false</w:t>
+      </w:r>
+    </w:p>
+    <w:p>
+      <w:pPr>
+        <w:pStyle w:val="Code"/>
+      </w:pPr>
+      <w:r>
+        <w:t>- einzelkurse: true/false</w:t>
+      </w:r>
+    </w:p>
+    <w:p>
+      <w:pPr>
+        <w:pStyle w:val="Code"/>
+      </w:pPr>
+      <w:r>
+        <w:t>- unterstuetzung_ausserhalb: true wenn Nachholoptionen, Aufholstunden, Hausaufgabenbetreuung, Wiederholung verpasster Lektionen oder Unterstützung ausserhalb der Unterrichtszeiten angeboten wird</w:t>
+      </w:r>
+    </w:p>
+    <w:p>
+      <w:pPr>
+        <w:pStyle w:val="Code"/>
+      </w:pPr>
+      <w:r>
+        <w:t>- max_teilnehmer: maximale Gruppengrösse als Zahl oder Range-String (z.B. "3-8")</w:t>
+      </w:r>
+    </w:p>
+    <w:p>
+      <w:pPr>
+        <w:pStyle w:val="Code"/>
+      </w:pPr>
+      <w:r>
+        <w:t>- standorte: kommagetrennte Liste aller Standorte (z.B. "Zürich HB, Stadelhofen, Winterthur, Online")</w:t>
+      </w:r>
+    </w:p>
+    <w:p>
+      <w:pPr>
+        <w:pStyle w:val="Code"/>
+      </w:pPr>
+    </w:p>
+    <w:p>
+      <w:pPr>
+        <w:pStyle w:val="Code"/>
+      </w:pPr>
+      <w:r>
+        <w:t>Antworte NUR mit einem JSON-Objekt mit den Feldern "courses" (Liste) und "metadata" (Objekt).</w:t>
+      </w:r>
+    </w:p>
+    <w:p>
+      <w:pPr>
+        <w:pStyle w:val="Code"/>
+      </w:pPr>
+    </w:p>
+    <w:p>
+      <w:pPr>
+        <w:pStyle w:val="berschrift3"/>
+      </w:pPr>
+      <w:r>
+        <w:t>Anbieter 2: Lern-Forum.ch (sGAI_lernForumScraper.py)</w:t>
+      </w:r>
+    </w:p>
+    <w:p>
+      <w:pPr/>
+      <w:r>
+        <w:t>Prompt-Key: "meta"</w:t>
+      </w:r>
+    </w:p>
+    <w:p>
+      <w:pPr>
+        <w:pStyle w:val="Code"/>
+      </w:pPr>
+      <w:r>
+        <w:t>Du bist ein Datenextraktions-Assistent. Extrahiere NUR Metadaten:</w:t>
+      </w:r>
+    </w:p>
+    <w:p>
+      <w:pPr>
+        <w:pStyle w:val="Code"/>
+      </w:pPr>
+      <w:r>
+        <w:t>- aufsatzkorrektur, einstufungstest, e_learning, pruefungsarchiv, beratungsgespraech, lernunterlagen, pruefungssimulation, einzelkurse, unterstuetzung_ausserhalb (alle als bool)</w:t>
+      </w:r>
+    </w:p>
+    <w:p>
+      <w:pPr>
+        <w:pStyle w:val="Code"/>
+      </w:pPr>
+      <w:r>
+        <w:t>- unterstuetzung_ausserhalb: true wenn Nachholoptionen, Aufholstunden, Hausaufgabenbetreuung, Wiederholung verpasster Lektionen oder Unterstützung ausserhalb der Unterrichtszeiten angeboten wird</w:t>
+      </w:r>
+    </w:p>
+    <w:p>
+      <w:pPr>
+        <w:pStyle w:val="Code"/>
+      </w:pPr>
+      <w:r>
+        <w:t>- max_teilnehmer: Zahl</w:t>
+      </w:r>
+    </w:p>
+    <w:p>
+      <w:pPr>
+        <w:pStyle w:val="Code"/>
+      </w:pPr>
+      <w:r>
+        <w:t>- standorte: Liste</w:t>
+      </w:r>
+    </w:p>
+    <w:p>
+      <w:pPr>
+        <w:pStyle w:val="Code"/>
+      </w:pPr>
+      <w:r>
+        <w:t>Antworte NUR mit reinem JSON: {"metadata": {...}}</w:t>
+      </w:r>
+    </w:p>
+    <w:p>
+      <w:pPr/>
+      <w:r>
+        <w:t>Prompt-Key: "courses"</w:t>
+      </w:r>
+    </w:p>
+    <w:p>
+      <w:pPr>
+        <w:pStyle w:val="Code"/>
+      </w:pPr>
+      <w:r>
+        <w:t>Extrahiere ALLE Kurstermine von dieser Seite. Antworte auf Deutsch.</w:t>
+      </w:r>
+    </w:p>
+    <w:p>
+      <w:pPr>
+        <w:pStyle w:val="Code"/>
+      </w:pPr>
+      <w:r>
+        <w:t>Für jeden Kurs: title (Deutsch), weekday (deutscher Wochentag: Montag/Dienstag/Mittwoch/Donnerstag/Freitag/Samstag/Sonntag), course_time, location, start_date (TT.MM.JJJJ), end_date, price_chf (Zahl), availability (ausgebucht/viele), is_online (bool).</w:t>
+      </w:r>
+    </w:p>
+    <w:p>
+      <w:pPr>
+        <w:pStyle w:val="Code"/>
+      </w:pPr>
+      <w:r>
+        <w:t>Antworte NUR mit reinem JSON: {"courses": [...]}</w:t>
+      </w:r>
+    </w:p>
+    <w:p>
+      <w:pPr>
+        <w:pStyle w:val="berschrift3"/>
+      </w:pPr>
+      <w:r>
+        <w:t>Anbieter 3: Avidii (sGAI_avidiiScraper.py)</w:t>
+      </w:r>
+    </w:p>
+    <w:p>
+      <w:pPr>
+        <w:pStyle w:val="Code"/>
+      </w:pPr>
+    </w:p>
+    <w:p>
+      <w:pPr>
+        <w:pStyle w:val="Code"/>
+      </w:pPr>
+      <w:r>
+        <w:t>Du bist ein Datenextraktions-Assistent. Extrahiere alle Kurszeilen aus dieser Webseite.</w:t>
+      </w:r>
+    </w:p>
+    <w:p>
+      <w:pPr>
+        <w:pStyle w:val="Code"/>
+      </w:pPr>
+    </w:p>
+    <w:p>
+      <w:pPr>
+        <w:pStyle w:val="Code"/>
+      </w:pPr>
+      <w:r>
+        <w:t>Für jeden Kurs gib folgende Felder zurück:</w:t>
+      </w:r>
+    </w:p>
+    <w:p>
+      <w:pPr>
+        <w:pStyle w:val="Code"/>
+      </w:pPr>
+      <w:r>
+        <w:t>- course_name: Name des Kurses (z.B. "Gruppenkurs Mittwoch", "Einzelkurs")</w:t>
+      </w:r>
+    </w:p>
+    <w:p>
+      <w:pPr>
+        <w:pStyle w:val="Code"/>
+      </w:pPr>
+      <w:r>
+        <w:t>- weekday: Wochentag (z.B. "Mittwoch")</w:t>
+      </w:r>
+    </w:p>
+    <w:p>
+      <w:pPr>
+        <w:pStyle w:val="Code"/>
+      </w:pPr>
+      <w:r>
+        <w:t>- course_time: Uhrzeit (z.B. "14:00-17:30")</w:t>
+      </w:r>
+    </w:p>
+    <w:p>
+      <w:pPr>
+        <w:pStyle w:val="Code"/>
+      </w:pPr>
+      <w:r>
+        <w:t>- location: Kursort (z.B. "Zürich", "Online")</w:t>
+      </w:r>
+    </w:p>
+    <w:p>
+      <w:pPr>
+        <w:pStyle w:val="Code"/>
+      </w:pPr>
+      <w:r>
+        <w:t>- start_date: Startdatum im Format TT.MM.JJJJ (z.B. "27.08.2025")</w:t>
+      </w:r>
+    </w:p>
+    <w:p>
+      <w:pPr>
+        <w:pStyle w:val="Code"/>
+      </w:pPr>
+      <w:r>
+        <w:t>- end_date: Enddatum im Format TT.MM.JJJJ falls vorhanden (z.B. "15.04.2026")</w:t>
+      </w:r>
+    </w:p>
+    <w:p>
+      <w:pPr>
+        <w:pStyle w:val="Code"/>
+      </w:pPr>
+      <w:r>
+        <w:t>- price_chf: Gruppenpreis in CHF als Zahl (z.B. 2950). Nur Gruppenpreise, keine Einzelstundenpreise.</w:t>
+      </w:r>
+    </w:p>
+    <w:p>
+      <w:pPr>
+        <w:pStyle w:val="Code"/>
+      </w:pPr>
+      <w:r>
+        <w:t>- availability: Verfügbarkeitsstatus (z.B. "Freie Plätze", "Wenige Plätze", "Ausgebucht")</w:t>
+      </w:r>
+    </w:p>
+    <w:p>
+      <w:pPr>
+        <w:pStyle w:val="Code"/>
+      </w:pPr>
+      <w:r>
+        <w:t>- is_online: true wenn Kurs online stattfindet, sonst false</w:t>
+      </w:r>
+    </w:p>
+    <w:p>
+      <w:pPr>
+        <w:pStyle w:val="Code"/>
+      </w:pPr>
+    </w:p>
+    <w:p>
+      <w:pPr>
+        <w:pStyle w:val="Code"/>
+      </w:pPr>
+      <w:r>
+        <w:t>Gib auch folgende Anbieter-Metadaten zurück:</w:t>
+      </w:r>
+    </w:p>
+    <w:p>
+      <w:pPr>
+        <w:pStyle w:val="Code"/>
+      </w:pPr>
+      <w:r>
+        <w:t>- aufsatzkorrektur: true wenn Aufsatztraining oder Aufsatzkorrektur erwähnt wird</w:t>
+      </w:r>
+    </w:p>
+    <w:p>
+      <w:pPr>
+        <w:pStyle w:val="Code"/>
+      </w:pPr>
+      <w:r>
+        <w:t>- einstufungstest: true wenn Standortbestimmung oder Einstufungstest erwähnt wird</w:t>
+      </w:r>
+    </w:p>
+    <w:p>
+      <w:pPr>
+        <w:pStyle w:val="Code"/>
+      </w:pPr>
+      <w:r>
+        <w:t>- e_learning: true wenn Lerncockpit, Google Classroom oder E-Learning erwähnt wird</w:t>
+      </w:r>
+    </w:p>
+    <w:p>
+      <w:pPr>
+        <w:pStyle w:val="Code"/>
+      </w:pPr>
+      <w:r>
+        <w:t>- pruefungsarchiv: true wenn alte Prüfungen oder Prüfungstraining erwähnt wird</w:t>
+      </w:r>
+    </w:p>
+    <w:p>
+      <w:pPr>
+        <w:pStyle w:val="Code"/>
+      </w:pPr>
+      <w:r>
+        <w:t>- beratungsgespraech: true wenn Erstgespräch oder Beratungsgespräch erwähnt wird</w:t>
+      </w:r>
+    </w:p>
+    <w:p>
+      <w:pPr>
+        <w:pStyle w:val="Code"/>
+      </w:pPr>
+      <w:r>
+        <w:t>- lernunterlagen: true wenn Kursmaterial oder Lernmaterial erwähnt wird</w:t>
+      </w:r>
+    </w:p>
+    <w:p>
+      <w:pPr>
+        <w:pStyle w:val="Code"/>
+      </w:pPr>
+      <w:r>
+        <w:t>- pruefungssimulation: true wenn Prüfungssimulation oder Testprüfung erwähnt wird</w:t>
+      </w:r>
+    </w:p>
+    <w:p>
+      <w:pPr>
+        <w:pStyle w:val="Code"/>
+      </w:pPr>
+      <w:r>
+        <w:t>- einzelkurse: true wenn Einzelunterricht oder Privatnachhilfe angeboten wird</w:t>
+      </w:r>
+    </w:p>
+    <w:p>
+      <w:pPr>
+        <w:pStyle w:val="Code"/>
+      </w:pPr>
+      <w:r>
+        <w:t>- unterstuetzung_ausserhalb: true wenn Nachholoptionen, Aufholstunden, Hausaufgabenbetreuung, Wiederholung verpasster Lektionen oder Unterstützung ausserhalb der Unterrichtszeiten angeboten wird</w:t>
+      </w:r>
+    </w:p>
+    <w:p>
+      <w:pPr>
+        <w:pStyle w:val="Code"/>
+      </w:pPr>
+      <w:r>
+        <w:t>- max_teilnehmer: maximale Gruppengrösse als Zahl (z.B. 8)</w:t>
+      </w:r>
+    </w:p>
+    <w:p>
+      <w:pPr>
+        <w:pStyle w:val="Code"/>
+      </w:pPr>
+      <w:r>
+        <w:t>- standorte: kommagetrennte Liste aller Standorte (z.B. "Zürich, Online")</w:t>
+      </w:r>
+    </w:p>
+    <w:p>
+      <w:pPr>
+        <w:pStyle w:val="Code"/>
+      </w:pPr>
+    </w:p>
+    <w:p>
+      <w:pPr>
+        <w:pStyle w:val="Code"/>
+      </w:pPr>
+      <w:r>
+        <w:t>Antworte NUR mit einem JSON-Objekt mit den Feldern "courses" (Liste) und "metadata" (Objekt).</w:t>
+      </w:r>
+    </w:p>
+    <w:p>
+      <w:pPr>
+        <w:pStyle w:val="Code"/>
+      </w:pPr>
+    </w:p>
+    <w:p>
+      <w:pPr>
+        <w:pStyle w:val="berschrift3"/>
+      </w:pPr>
+      <w:r>
+        <w:t>Anbieter 4: Learning Culture (sGAI_learningCultureScraper.py)</w:t>
+      </w:r>
+    </w:p>
+    <w:p>
+      <w:pPr/>
+      <w:r>
+        <w:t>Prompt-Key: "meta"</w:t>
+      </w:r>
+    </w:p>
+    <w:p>
+      <w:pPr>
+        <w:pStyle w:val="Code"/>
+      </w:pPr>
+      <w:r>
+        <w:t>Du bist ein Datenextraktions-Assistent. Extrahiere NUR die Metadaten (keine Kurse):</w:t>
+      </w:r>
+    </w:p>
+    <w:p>
+      <w:pPr>
+        <w:pStyle w:val="Code"/>
+      </w:pPr>
+      <w:r>
+        <w:t>- aufsatzkorrektur, einstufungstest, e_learning, pruefungsarchiv, beratungsgespraech, lernunterlagen, pruefungssimulation, einzelkurse, unterstuetzung_ausserhalb (alle als bool)</w:t>
+      </w:r>
+    </w:p>
+    <w:p>
+      <w:pPr>
+        <w:pStyle w:val="Code"/>
+      </w:pPr>
+      <w:r>
+        <w:t>- unterstuetzung_ausserhalb: true wenn Nachholoptionen, Aufholstunden, Hausaufgabenbetreuung, Wiederholung verpasster Lektionen oder Unterstützung ausserhalb der Unterrichtszeiten angeboten wird</w:t>
+      </w:r>
+    </w:p>
+    <w:p>
+      <w:pPr>
+        <w:pStyle w:val="Code"/>
+      </w:pPr>
+      <w:r>
+        <w:t>- max_teilnehmer: Zahl</w:t>
+      </w:r>
+    </w:p>
+    <w:p>
+      <w:pPr>
+        <w:pStyle w:val="Code"/>
+      </w:pPr>
+      <w:r>
+        <w:t>- standorte: Liste</w:t>
+      </w:r>
+    </w:p>
+    <w:p>
+      <w:pPr>
+        <w:pStyle w:val="Code"/>
+      </w:pPr>
+      <w:r>
+        <w:t>Antworte NUR mit reinem JSON: {"metadata": {...}}</w:t>
+      </w:r>
+    </w:p>
+    <w:p>
+      <w:pPr/>
+      <w:r>
+        <w:t>Prompt-Key: "langgymi_kurse"</w:t>
+      </w:r>
+    </w:p>
+    <w:p>
+      <w:pPr>
+        <w:pStyle w:val="Code"/>
+      </w:pPr>
+      <w:r>
+        <w:t>Du bist ein Datenextraktions-Assistent. Extrahiere ALLE Kurstermine, Kurse oder Anmelde-Einträge die auf dieser Seite erscheinen — egal wie sie genannt sind (z.B. 'Kurs', 'Vorbereitungskurs', 'Teil 1', 'Teil 1+', 'Teil 2', 'Intensivkurs', 'Sportferienkurs', 'Simulationsprüfung', 'Themenkurs', oder einfach nur Datums-/Zeit-Angaben in einer Tabelle).</w:t>
+      </w:r>
+    </w:p>
+    <w:p>
+      <w:pPr>
+        <w:pStyle w:val="Code"/>
+      </w:pPr>
+    </w:p>
+    <w:p>
+      <w:pPr>
+        <w:pStyle w:val="Code"/>
+      </w:pPr>
+      <w:r>
+        <w:t>Typische Hinweise auf einen Kurs: Wochentag + Uhrzeit + Datum + Preis + Ort.</w:t>
+      </w:r>
+    </w:p>
+    <w:p>
+      <w:pPr>
+        <w:pStyle w:val="Code"/>
+      </w:pPr>
+      <w:r>
+        <w:t>Wenn du eine Tabelle mit Anmelde-Buttons siehst, extrahiere JEDE Zeile.</w:t>
+      </w:r>
+    </w:p>
+    <w:p>
+      <w:pPr>
+        <w:pStyle w:val="Code"/>
+      </w:pPr>
+    </w:p>
+    <w:p>
+      <w:pPr>
+        <w:pStyle w:val="Code"/>
+      </w:pPr>
+      <w:r>
+        <w:t>Für jeden Kurs gib zurück:</w:t>
+      </w:r>
+    </w:p>
+    <w:p>
+      <w:pPr>
+        <w:pStyle w:val="Code"/>
+      </w:pPr>
+      <w:r>
+        <w:t>- title: Was der Kurs auf der Seite heißt (z.B. 'Teil 1', 'Kurs A', 'Vorbereitungskurs', 'Intensivkurs Herbstferien'). Wenn kein Name erkennbar: 'Gymivorbereitung'.</w:t>
+      </w:r>
+    </w:p>
+    <w:p>
+      <w:pPr>
+        <w:pStyle w:val="Code"/>
+      </w:pPr>
+      <w:r>
+        <w:t>- weekday: Wochentag (Montag, Mittwoch, Samstag, ...)</w:t>
+      </w:r>
+    </w:p>
+    <w:p>
+      <w:pPr>
+        <w:pStyle w:val="Code"/>
+      </w:pPr>
+      <w:r>
+        <w:t>- course_time: Kurszeit (z.B. '13:30 - 16:45')</w:t>
+      </w:r>
+    </w:p>
+    <w:p>
+      <w:pPr>
+        <w:pStyle w:val="Code"/>
+      </w:pPr>
+      <w:r>
+        <w:t>- location: Ort (z.B. 'Zürich Stadelhofen', 'Winterthur', 'Horgen')</w:t>
+      </w:r>
+    </w:p>
+    <w:p>
+      <w:pPr>
+        <w:pStyle w:val="Code"/>
+      </w:pPr>
+      <w:r>
+        <w:t>- start_date, end_date: Format TT.MM.JJJJ</w:t>
+      </w:r>
+    </w:p>
+    <w:p>
+      <w:pPr>
+        <w:pStyle w:val="Code"/>
+      </w:pPr>
+      <w:r>
+        <w:t>- price_chf: Preis als Zahl</w:t>
+      </w:r>
+    </w:p>
+    <w:p>
+      <w:pPr>
+        <w:pStyle w:val="Code"/>
+      </w:pPr>
+      <w:r>
+        <w:t>- availability: 'ausgebucht' wenn ausgebucht, sonst 'viele'</w:t>
+      </w:r>
+    </w:p>
+    <w:p>
+      <w:pPr>
+        <w:pStyle w:val="Code"/>
+      </w:pPr>
+    </w:p>
+    <w:p>
+      <w:pPr>
+        <w:pStyle w:val="Code"/>
+      </w:pPr>
+      <w:r>
+        <w:t>WICHTIG: Auch wenn die Kursnamen nicht 'Teil 1+/1/2' sind — extrahiere trotzdem alles. Lieber zu viele Kurse als zu wenige.</w:t>
+      </w:r>
+    </w:p>
+    <w:p>
+      <w:pPr>
+        <w:pStyle w:val="Code"/>
+      </w:pPr>
+      <w:r>
+        <w:t>Antworte NUR mit reinem JSON: {"courses": [...]}</w:t>
+      </w:r>
+    </w:p>
+    <w:p>
+      <w:pPr/>
+      <w:r>
+        <w:t>Prompt-Key: "kurzgymi_t1"</w:t>
+      </w:r>
+    </w:p>
+    <w:p>
+      <w:pPr>
+        <w:pStyle w:val="Code"/>
+      </w:pPr>
+      <w:r>
+        <w:t>Extrahiere ALLE Teil 1+ und Teil 1 Kurstermine.</w:t>
+      </w:r>
+    </w:p>
+    <w:p>
+      <w:pPr>
+        <w:pStyle w:val="Code"/>
+      </w:pPr>
+      <w:r>
+        <w:t>Für jeden: title (Teil 1+ oder Teil 1), weekday, course_time, location, start_date, end_date (TT.MM.JJJJ), price_chf (Teil 1+: 3190, Teil 1: 1890), availability.</w:t>
+      </w:r>
+    </w:p>
+    <w:p>
+      <w:pPr>
+        <w:pStyle w:val="Code"/>
+      </w:pPr>
+      <w:r>
+        <w:t>Antworte NUR mit reinem JSON: {"courses": [...]}</w:t>
+      </w:r>
+    </w:p>
+    <w:p>
+      <w:pPr/>
+      <w:r>
+        <w:t>Prompt-Key: "kurzgymi_t2"</w:t>
+      </w:r>
+    </w:p>
+    <w:p>
+      <w:pPr>
+        <w:pStyle w:val="Code"/>
+      </w:pPr>
+      <w:r>
+        <w:t>Extrahiere die Teil 2 Kurstermine.</w:t>
+      </w:r>
+    </w:p>
+    <w:p>
+      <w:pPr>
+        <w:pStyle w:val="Code"/>
+      </w:pPr>
+      <w:r>
+        <w:t>Für jeden: title (Teil 2), weekday, course_time, location, start_date, end_date, price_chf (~2110), availability.</w:t>
+      </w:r>
+    </w:p>
+    <w:p>
+      <w:pPr>
+        <w:pStyle w:val="Code"/>
+      </w:pPr>
+      <w:r>
+        <w:t>Antworte NUR mit reinem JSON: {"courses": [...]}</w:t>
+      </w:r>
+    </w:p>
+    <w:p>
+      <w:pPr/>
+      <w:r>
+        <w:t>Prompt-Key: "probezeit"</w:t>
+      </w:r>
+    </w:p>
+    <w:p>
+      <w:pPr>
+        <w:pStyle w:val="Code"/>
+      </w:pPr>
+      <w:r>
+        <w:t>Extrahiere ALLE Probezeit-Kurse. Für jeden:</w:t>
+      </w:r>
+    </w:p>
+    <w:p>
+      <w:pPr>
+        <w:pStyle w:val="Code"/>
+      </w:pPr>
+      <w:r>
+        <w:t>- title (z.B. 'Langgymi Mathematik')</w:t>
+      </w:r>
+    </w:p>
+    <w:p>
+      <w:pPr>
+        <w:pStyle w:val="Code"/>
+      </w:pPr>
+      <w:r>
+        <w:t>- course_type: 'langgymi' oder 'kurzgymi'</w:t>
+      </w:r>
+    </w:p>
+    <w:p>
+      <w:pPr>
+        <w:pStyle w:val="Code"/>
+      </w:pPr>
+      <w:r>
+        <w:t>- weekday, course_time, location</w:t>
+      </w:r>
+    </w:p>
+    <w:p>
+      <w:pPr>
+        <w:pStyle w:val="Code"/>
+      </w:pPr>
+      <w:r>
+        <w:t>- start_date, end_date (TT.MM.JJJJ)</w:t>
+      </w:r>
+    </w:p>
+    <w:p>
+      <w:pPr>
+        <w:pStyle w:val="Code"/>
+      </w:pPr>
+      <w:r>
+        <w:t>- price_chf (~980)</w:t>
+      </w:r>
+    </w:p>
+    <w:p>
+      <w:pPr>
+        <w:pStyle w:val="Code"/>
+      </w:pPr>
+      <w:r>
+        <w:t>- availability</w:t>
+      </w:r>
+    </w:p>
+    <w:p>
+      <w:pPr>
+        <w:pStyle w:val="Code"/>
+      </w:pPr>
+      <w:r>
+        <w:t>- is_online: false</w:t>
+      </w:r>
+    </w:p>
+    <w:p>
+      <w:pPr>
+        <w:pStyle w:val="Code"/>
+      </w:pPr>
+      <w:r>
+        <w:t>Antworte NUR mit reinem JSON: {"courses": [...]}</w:t>
+      </w:r>
+    </w:p>
+    <w:p>
+      <w:pPr>
+        <w:pStyle w:val="berschrift3"/>
+      </w:pPr>
+      <w:r>
+        <w:t>Anbieter 5: Gymivorbereitung Fokus (sGAI_gymivorbereitungFokusScraper.py)</w:t>
+      </w:r>
+    </w:p>
+    <w:p>
+      <w:pPr/>
+      <w:r>
+        <w:t>Prompt-Key: "overview"</w:t>
+      </w:r>
+    </w:p>
+    <w:p>
+      <w:pPr>
+        <w:pStyle w:val="Code"/>
+      </w:pPr>
+      <w:r>
+        <w:t>Du bist ein Datenextraktions-Assistent. Extrahiere Anbieter-Metadaten von dieser Seite:</w:t>
+      </w:r>
+    </w:p>
+    <w:p>
+      <w:pPr>
+        <w:pStyle w:val="Code"/>
+      </w:pPr>
+      <w:r>
+        <w:t>- aufsatzkorrektur, einstufungstest, e_learning, pruefungsarchiv, beratungsgespraech, lernunterlagen, pruefungssimulation, einzelkurse, unterstuetzung_ausserhalb (alle als bool)</w:t>
+      </w:r>
+    </w:p>
+    <w:p>
+      <w:pPr>
+        <w:pStyle w:val="Code"/>
+      </w:pPr>
+      <w:r>
+        <w:t>- unterstuetzung_ausserhalb: true wenn Nachholoptionen, Aufholstunden, Hausaufgabenbetreuung, Wiederholung verpasster Lektionen oder Unterstützung ausserhalb der Unterrichtszeiten angeboten wird</w:t>
+      </w:r>
+    </w:p>
+    <w:p>
+      <w:pPr>
+        <w:pStyle w:val="Code"/>
+      </w:pPr>
+      <w:r>
+        <w:t>- max_teilnehmer: Zahl</w:t>
+      </w:r>
+    </w:p>
+    <w:p>
+      <w:pPr>
+        <w:pStyle w:val="Code"/>
+      </w:pPr>
+      <w:r>
+        <w:t>- standorte: Liste</w:t>
+      </w:r>
+    </w:p>
+    <w:p>
+      <w:pPr>
+        <w:pStyle w:val="Code"/>
+      </w:pPr>
+      <w:r>
+        <w:t>Antworte NUR mit reinem JSON: {"metadata": {...}}</w:t>
+      </w:r>
+    </w:p>
+    <w:p>
+      <w:pPr/>
+      <w:r>
+        <w:t>Prompt-Key: "langgymi"</w:t>
+      </w:r>
+    </w:p>
+    <w:p>
+      <w:pPr>
+        <w:pStyle w:val="Code"/>
+      </w:pPr>
+      <w:r>
+        <w:t>Du bist ein Datenextraktions-Assistent. Extrahiere ALLE Kurse und Preise.</w:t>
+      </w:r>
+    </w:p>
+    <w:p>
+      <w:pPr>
+        <w:pStyle w:val="Code"/>
+      </w:pPr>
+      <w:r>
+        <w:t>Für jeden Kurs:</w:t>
+      </w:r>
+    </w:p>
+    <w:p>
+      <w:pPr>
+        <w:pStyle w:val="Code"/>
+      </w:pPr>
+      <w:r>
+        <w:t>- kurs_id: Kurs-Buchstabe</w:t>
+      </w:r>
+    </w:p>
+    <w:p>
+      <w:pPr>
+        <w:pStyle w:val="Code"/>
+      </w:pPr>
+      <w:r>
+        <w:t>- weekday: Wochentag (Mittwoch/Samstag/...)</w:t>
+      </w:r>
+    </w:p>
+    <w:p>
+      <w:pPr>
+        <w:pStyle w:val="Code"/>
+      </w:pPr>
+      <w:r>
+        <w:t>- course_time: Kurszeit</w:t>
+      </w:r>
+    </w:p>
+    <w:p>
+      <w:pPr>
+        <w:pStyle w:val="Code"/>
+      </w:pPr>
+      <w:r>
+        <w:t>- location: echter Standortname (Zürich HB, Bülach, Winterthur, Stadelhofen, Wetzikon, Uster, Meilen, Horgen, Wädenswil, Schaffhausen, Online). NIE 'NA' oder 'unbekannt'.</w:t>
+      </w:r>
+    </w:p>
+    <w:p>
+      <w:pPr>
+        <w:pStyle w:val="Code"/>
+      </w:pPr>
+      <w:r>
+        <w:t>- is_online: bool</w:t>
+      </w:r>
+    </w:p>
+    <w:p>
+      <w:pPr>
+        <w:pStyle w:val="Code"/>
+      </w:pPr>
+      <w:r>
+        <w:t>Zusätzlich:</w:t>
+      </w:r>
+    </w:p>
+    <w:p>
+      <w:pPr>
+        <w:pStyle w:val="Code"/>
+      </w:pPr>
+      <w:r>
+        <w:t>- price_chf, price_online_chf (Zahlen)</w:t>
+      </w:r>
+    </w:p>
+    <w:p>
+      <w:pPr>
+        <w:pStyle w:val="Code"/>
+      </w:pPr>
+      <w:r>
+        <w:t>- start_kw, end_kw (Kalenderwochen als Zahl)</w:t>
+      </w:r>
+    </w:p>
+    <w:p>
+      <w:pPr>
+        <w:pStyle w:val="Code"/>
+      </w:pPr>
+      <w:r>
+        <w:t>- num_kurstage (Zahl)</w:t>
+      </w:r>
+    </w:p>
+    <w:p>
+      <w:pPr>
+        <w:pStyle w:val="Code"/>
+      </w:pPr>
+      <w:r>
+        <w:t>Antworte NUR mit JSON: {"courses": [...], "price_chf": ..., "price_online_chf": ..., "start_kw": ..., "end_kw": ..., "num_kurstage": ...}</w:t>
+      </w:r>
+    </w:p>
+    <w:p>
+      <w:pPr>
+        <w:pStyle w:val="berschrift3"/>
+      </w:pPr>
+      <w:r>
+        <w:t>Anbieter 6: Nachhilfe Akademie (sGAI_nachhilfeAkademieScraper.py)</w:t>
+      </w:r>
+    </w:p>
+    <w:p>
+      <w:pPr/>
+      <w:r>
+        <w:t>Prompt-Key: "overview"</w:t>
+      </w:r>
+    </w:p>
+    <w:p>
+      <w:pPr>
+        <w:pStyle w:val="Code"/>
+      </w:pPr>
+    </w:p>
+    <w:p>
+      <w:pPr>
+        <w:pStyle w:val="Code"/>
+      </w:pPr>
+      <w:r>
+        <w:t>Du bist ein Datenextraktions-Assistent für eine Vergleichsplattform von Gymi-Vorbereitungskursen.</w:t>
+      </w:r>
+    </w:p>
+    <w:p>
+      <w:pPr>
+        <w:pStyle w:val="Code"/>
+      </w:pPr>
+    </w:p>
+    <w:p>
+      <w:pPr>
+        <w:pStyle w:val="Code"/>
+      </w:pPr>
+      <w:r>
+        <w:t>Extrahiere ALLE Kurse (Langzeit- und Kurzzeitgymnasium, schulbegleitend und Ferienkurse)</w:t>
+      </w:r>
+    </w:p>
+    <w:p>
+      <w:pPr>
+        <w:pStyle w:val="Code"/>
+      </w:pPr>
+      <w:r>
+        <w:t>aus der Übersichtstabelle auf dieser Seite.</w:t>
+      </w:r>
+    </w:p>
+    <w:p>
+      <w:pPr>
+        <w:pStyle w:val="Code"/>
+      </w:pPr>
+      <w:r>
+        <w:t>Für jeden Kurs gib zurück:</w:t>
+      </w:r>
+    </w:p>
+    <w:p>
+      <w:pPr>
+        <w:pStyle w:val="Code"/>
+      </w:pPr>
+      <w:r>
+        <w:t>- course_type: "langgymi" oder "kurzgymi"</w:t>
+      </w:r>
+    </w:p>
+    <w:p>
+      <w:pPr>
+        <w:pStyle w:val="Code"/>
+      </w:pPr>
+      <w:r>
+        <w:t>- title: Kurzname (z.B. "Gymivorbereitung Mittwoch", "Intensivkurs Herbstferien 1")</w:t>
+      </w:r>
+    </w:p>
+    <w:p>
+      <w:pPr>
+        <w:pStyle w:val="Code"/>
+      </w:pPr>
+      <w:r>
+        <w:t>- weekday: Wochentag auf Deutsch</w:t>
+      </w:r>
+    </w:p>
+    <w:p>
+      <w:pPr>
+        <w:pStyle w:val="Code"/>
+      </w:pPr>
+      <w:r>
+        <w:t>- course_time: Kurszeit (z.B. "14:00-17:15")</w:t>
+      </w:r>
+    </w:p>
+    <w:p>
+      <w:pPr>
+        <w:pStyle w:val="Code"/>
+      </w:pPr>
+      <w:r>
+        <w:t>- start_date: TT.MM.JJJJ</w:t>
+      </w:r>
+    </w:p>
+    <w:p>
+      <w:pPr>
+        <w:pStyle w:val="Code"/>
+      </w:pPr>
+      <w:r>
+        <w:t>- end_date: TT.MM.JJJJ (leer wenn nicht vorhanden)</w:t>
+      </w:r>
+    </w:p>
+    <w:p>
+      <w:pPr>
+        <w:pStyle w:val="Code"/>
+      </w:pPr>
+      <w:r>
+        <w:t>- location: Kursort</w:t>
+      </w:r>
+    </w:p>
+    <w:p>
+      <w:pPr>
+        <w:pStyle w:val="Code"/>
+      </w:pPr>
+      <w:r>
+        <w:t>- kursart: "schulbegleitend" oder "ferienkurs"</w:t>
+      </w:r>
+    </w:p>
+    <w:p>
+      <w:pPr>
+        <w:pStyle w:val="Code"/>
+      </w:pPr>
+      <w:r>
+        <w:t>- availability: "viele"</w:t>
+      </w:r>
+    </w:p>
+    <w:p>
+      <w:pPr>
+        <w:pStyle w:val="Code"/>
+      </w:pPr>
+    </w:p>
+    <w:p>
+      <w:pPr>
+        <w:pStyle w:val="Code"/>
+      </w:pPr>
+      <w:r>
+        <w:t>Extrahiere zusätzlich Anbieter-Metadaten:</w:t>
+      </w:r>
+    </w:p>
+    <w:p>
+      <w:pPr>
+        <w:pStyle w:val="Code"/>
+      </w:pPr>
+      <w:r>
+        <w:t>- aufsatzkorrektur, einstufungstest, e_learning, pruefungsarchiv, beratungsgespraech,</w:t>
+      </w:r>
+    </w:p>
+    <w:p>
+      <w:pPr>
+        <w:pStyle w:val="Code"/>
+      </w:pPr>
+      <w:r>
+        <w:t xml:space="preserve">  lernunterlagen, pruefungssimulation, einzelkurse, unterstuetzung_ausserhalb (alle als bool)</w:t>
+      </w:r>
+    </w:p>
+    <w:p>
+      <w:pPr>
+        <w:pStyle w:val="Code"/>
+      </w:pPr>
+      <w:r>
+        <w:t>- unterstuetzung_ausserhalb: true wenn Nachholoptionen, Aufholstunden, Hausaufgabenbetreuung,</w:t>
+      </w:r>
+    </w:p>
+    <w:p>
+      <w:pPr>
+        <w:pStyle w:val="Code"/>
+      </w:pPr>
+      <w:r>
+        <w:t xml:space="preserve">  Wiederholung verpasster Lektionen oder Unterstützung ausserhalb der Unterrichtszeiten</w:t>
+      </w:r>
+    </w:p>
+    <w:p>
+      <w:pPr>
+        <w:pStyle w:val="Code"/>
+      </w:pPr>
+      <w:r>
+        <w:t xml:space="preserve">  angeboten wird</w:t>
+      </w:r>
+    </w:p>
+    <w:p>
+      <w:pPr>
+        <w:pStyle w:val="Code"/>
+      </w:pPr>
+      <w:r>
+        <w:t>- max_teilnehmer: Zahl</w:t>
+      </w:r>
+    </w:p>
+    <w:p>
+      <w:pPr>
+        <w:pStyle w:val="Code"/>
+      </w:pPr>
+      <w:r>
+        <w:t>- standorte: Liste aller Standorte</w:t>
+      </w:r>
+    </w:p>
+    <w:p>
+      <w:pPr>
+        <w:pStyle w:val="Code"/>
+      </w:pPr>
+    </w:p>
+    <w:p>
+      <w:pPr>
+        <w:pStyle w:val="Code"/>
+      </w:pPr>
+      <w:r>
+        <w:t>Antworte NUR mit reinem JSON: {"courses": [...], "metadata": {...}}</w:t>
+      </w:r>
+    </w:p>
+    <w:p>
+      <w:pPr>
+        <w:pStyle w:val="Code"/>
+      </w:pPr>
+    </w:p>
+    <w:p>
+      <w:pPr/>
+      <w:r>
+        <w:t>Prompt-Key: "preise_lang"</w:t>
+      </w:r>
+    </w:p>
+    <w:p>
+      <w:pPr>
+        <w:pStyle w:val="Code"/>
+      </w:pPr>
+    </w:p>
+    <w:p>
+      <w:pPr>
+        <w:pStyle w:val="Code"/>
+      </w:pPr>
+      <w:r>
+        <w:t>Extrahiere die Preise für Gymivorbereitungskurse Langgymnasium.</w:t>
+      </w:r>
+    </w:p>
+    <w:p>
+      <w:pPr>
+        <w:pStyle w:val="Code"/>
+      </w:pPr>
+    </w:p>
+    <w:p>
+      <w:pPr>
+        <w:pStyle w:val="Code"/>
+      </w:pPr>
+      <w:r>
+        <w:t>Gib zurück:</w:t>
+      </w:r>
+    </w:p>
+    <w:p>
+      <w:pPr>
+        <w:pStyle w:val="Code"/>
+      </w:pPr>
+      <w:r>
+        <w:t>- preis_4er_gruppe_gesamt: Gesamtpreis für 4er-Gruppe als Zahl in CHF</w:t>
+      </w:r>
+    </w:p>
+    <w:p>
+      <w:pPr>
+        <w:pStyle w:val="Code"/>
+      </w:pPr>
+      <w:r>
+        <w:t>- preis_2er_gruppe_gesamt: Gesamtpreis für 2er-Gruppe als Zahl in CHF</w:t>
+      </w:r>
+    </w:p>
+    <w:p>
+      <w:pPr>
+        <w:pStyle w:val="Code"/>
+      </w:pPr>
+      <w:r>
+        <w:t>- preis_privat_gesamt: Gesamtpreis für Einzelunterricht als Zahl in CHF</w:t>
+      </w:r>
+    </w:p>
+    <w:p>
+      <w:pPr>
+        <w:pStyle w:val="Code"/>
+      </w:pPr>
+      <w:r>
+        <w:t>- preis_ferienkurs_gruppe: Preis Ferienkurs Gruppe als Zahl in CHF</w:t>
+      </w:r>
+    </w:p>
+    <w:p>
+      <w:pPr>
+        <w:pStyle w:val="Code"/>
+      </w:pPr>
+      <w:r>
+        <w:t>- preis_ferienkurs_privat: Preis Ferienkurs Privat als Zahl in CHF</w:t>
+      </w:r>
+    </w:p>
+    <w:p>
+      <w:pPr>
+        <w:pStyle w:val="Code"/>
+      </w:pPr>
+      <w:r>
+        <w:t>- anmeldegebuehr: Anmeldegebühr als Zahl in CHF</w:t>
+      </w:r>
+    </w:p>
+    <w:p>
+      <w:pPr>
+        <w:pStyle w:val="Code"/>
+      </w:pPr>
+    </w:p>
+    <w:p>
+      <w:pPr>
+        <w:pStyle w:val="Code"/>
+      </w:pPr>
+      <w:r>
+        <w:t>Antworte NUR mit reinem JSON: {"preise": {...}}</w:t>
+      </w:r>
+    </w:p>
+    <w:p>
+      <w:pPr>
+        <w:pStyle w:val="Code"/>
+      </w:pPr>
+    </w:p>
+    <w:p>
+      <w:pPr>
+        <w:pStyle w:val="berschrift3"/>
+      </w:pPr>
+      <w:r>
+        <w:t>Anbieter 7: Schule Zürich Nord (sGAI_schuleZuerichNordScraper.py)</w:t>
+      </w:r>
+    </w:p>
+    <w:p>
+      <w:pPr/>
+      <w:r>
+        <w:t>Prompt-Key: "overview"</w:t>
+      </w:r>
+    </w:p>
+    <w:p>
+      <w:pPr>
+        <w:pStyle w:val="Code"/>
+      </w:pPr>
+    </w:p>
+    <w:p>
+      <w:pPr>
+        <w:pStyle w:val="Code"/>
+      </w:pPr>
+      <w:r>
+        <w:t>Du bist ein Datenextraktions-Assistent. Extrahiere Anbieter-Metadaten:</w:t>
+      </w:r>
+    </w:p>
+    <w:p>
+      <w:pPr>
+        <w:pStyle w:val="Code"/>
+      </w:pPr>
+    </w:p>
+    <w:p>
+      <w:pPr>
+        <w:pStyle w:val="Code"/>
+      </w:pPr>
+      <w:r>
+        <w:t>- aufsatzkorrektur, einstufungstest, e_learning, pruefungsarchiv, beratungsgespraech,</w:t>
+      </w:r>
+    </w:p>
+    <w:p>
+      <w:pPr>
+        <w:pStyle w:val="Code"/>
+      </w:pPr>
+      <w:r>
+        <w:t xml:space="preserve">  lernunterlagen, pruefungssimulation, einzelkurse, unterstuetzung_ausserhalb (alle als bool)</w:t>
+      </w:r>
+    </w:p>
+    <w:p>
+      <w:pPr>
+        <w:pStyle w:val="Code"/>
+      </w:pPr>
+      <w:r>
+        <w:t>- unterstuetzung_ausserhalb: true wenn Nachholoptionen, Aufholstunden, Hausaufgabenbetreuung,</w:t>
+      </w:r>
+    </w:p>
+    <w:p>
+      <w:pPr>
+        <w:pStyle w:val="Code"/>
+      </w:pPr>
+      <w:r>
+        <w:t xml:space="preserve">  Wiederholung verpasster Lektionen oder Unterstützung ausserhalb der Unterrichtszeiten</w:t>
+      </w:r>
+    </w:p>
+    <w:p>
+      <w:pPr>
+        <w:pStyle w:val="Code"/>
+      </w:pPr>
+      <w:r>
+        <w:t xml:space="preserve">  angeboten wird</w:t>
+      </w:r>
+    </w:p>
+    <w:p>
+      <w:pPr>
+        <w:pStyle w:val="Code"/>
+      </w:pPr>
+      <w:r>
+        <w:t>- max_teilnehmer: Zahl oder null</w:t>
+      </w:r>
+    </w:p>
+    <w:p>
+      <w:pPr>
+        <w:pStyle w:val="Code"/>
+      </w:pPr>
+      <w:r>
+        <w:t>- standort: Adresse</w:t>
+      </w:r>
+    </w:p>
+    <w:p>
+      <w:pPr>
+        <w:pStyle w:val="Code"/>
+      </w:pPr>
+      <w:r>
+        <w:t>- ausgebuchte_kurse: Liste der als AUSGEBUCHT markierten Kurse</w:t>
+      </w:r>
+    </w:p>
+    <w:p>
+      <w:pPr>
+        <w:pStyle w:val="Code"/>
+      </w:pPr>
+    </w:p>
+    <w:p>
+      <w:pPr>
+        <w:pStyle w:val="Code"/>
+      </w:pPr>
+      <w:r>
+        <w:t>Antworte NUR mit reinem JSON: {"metadata": {...}}</w:t>
+      </w:r>
+    </w:p>
+    <w:p>
+      <w:pPr>
+        <w:pStyle w:val="Code"/>
+      </w:pPr>
+    </w:p>
+    <w:p>
+      <w:pPr/>
+      <w:r>
+        <w:t>Prompt-Key: "pdf_langgymi"</w:t>
+      </w:r>
+    </w:p>
+    <w:p>
+      <w:pPr>
+        <w:pStyle w:val="Code"/>
+      </w:pPr>
+    </w:p>
+    <w:p>
+      <w:pPr>
+        <w:pStyle w:val="Code"/>
+      </w:pPr>
+      <w:r>
+        <w:t>Extrahiere alle Kursinformationen aus diesem PDF-Text.</w:t>
+      </w:r>
+    </w:p>
+    <w:p>
+      <w:pPr>
+        <w:pStyle w:val="Code"/>
+      </w:pPr>
+      <w:r>
+        <w:t>Es gibt Kurs M (Mittwoch), Kurs S (Samstag), Kurs F (Ferienkurs).</w:t>
+      </w:r>
+    </w:p>
+    <w:p>
+      <w:pPr>
+        <w:pStyle w:val="Code"/>
+      </w:pPr>
+    </w:p>
+    <w:p>
+      <w:pPr>
+        <w:pStyle w:val="Code"/>
+      </w:pPr>
+      <w:r>
+        <w:t>Für jeden Kurs:</w:t>
+      </w:r>
+    </w:p>
+    <w:p>
+      <w:pPr>
+        <w:pStyle w:val="Code"/>
+      </w:pPr>
+      <w:r>
+        <w:t>- kurs_name: NUR "Kurs M", "Kurs S" oder "Kurs F"</w:t>
+      </w:r>
+    </w:p>
+    <w:p>
+      <w:pPr>
+        <w:pStyle w:val="Code"/>
+      </w:pPr>
+      <w:r>
+        <w:t>- course_type: "langgymi"</w:t>
+      </w:r>
+    </w:p>
+    <w:p>
+      <w:pPr>
+        <w:pStyle w:val="Code"/>
+      </w:pPr>
+      <w:r>
+        <w:t>- weekday: Wochentag (z.B. "Mittwoch", "Samstag")</w:t>
+      </w:r>
+    </w:p>
+    <w:p>
+      <w:pPr>
+        <w:pStyle w:val="Code"/>
+      </w:pPr>
+      <w:r>
+        <w:t>- course_time: Kurszeit (z.B. "13:30-16:00")</w:t>
+      </w:r>
+    </w:p>
+    <w:p>
+      <w:pPr>
+        <w:pStyle w:val="Code"/>
+      </w:pPr>
+      <w:r>
+        <w:t>- start_date, end_date (TT.MM.JJJJ)</w:t>
+      </w:r>
+    </w:p>
+    <w:p>
+      <w:pPr>
+        <w:pStyle w:val="Code"/>
+      </w:pPr>
+      <w:r>
+        <w:t>- price_chf: Zahl</w:t>
+      </w:r>
+    </w:p>
+    <w:p>
+      <w:pPr>
+        <w:pStyle w:val="Code"/>
+      </w:pPr>
+      <w:r>
+        <w:t>- availability: "ausgebucht" oder "viele"</w:t>
+      </w:r>
+    </w:p>
+    <w:p>
+      <w:pPr>
+        <w:pStyle w:val="Code"/>
+      </w:pPr>
+    </w:p>
+    <w:p>
+      <w:pPr>
+        <w:pStyle w:val="Code"/>
+      </w:pPr>
+      <w:r>
+        <w:t>Antworte NUR mit reinem JSON: {"courses": [...]}</w:t>
+      </w:r>
+    </w:p>
+    <w:p>
+      <w:pPr>
+        <w:pStyle w:val="Code"/>
+      </w:pPr>
+    </w:p>
+    <w:p>
+      <w:pPr>
+        <w:pStyle w:val="Code"/>
+      </w:pPr>
+      <w:r>
+        <w:t>PDF-Inhalt:</w:t>
+      </w:r>
+    </w:p>
+    <w:p>
+      <w:pPr>
+        <w:pStyle w:val="Code"/>
+      </w:pPr>
+    </w:p>
+    <w:p>
+      <w:pPr/>
+      <w:r>
+        <w:t>Prompt-Key: "pdf_kurzgymi"</w:t>
+      </w:r>
+    </w:p>
+    <w:p>
+      <w:pPr>
+        <w:pStyle w:val="Code"/>
+      </w:pPr>
+    </w:p>
+    <w:p>
+      <w:pPr>
+        <w:pStyle w:val="Code"/>
+      </w:pPr>
+      <w:r>
+        <w:t>Extrahiere alle Kursinformationen aus diesem PDF-Text.</w:t>
+      </w:r>
+    </w:p>
+    <w:p>
+      <w:pPr>
+        <w:pStyle w:val="Code"/>
+      </w:pPr>
+    </w:p>
+    <w:p>
+      <w:pPr>
+        <w:pStyle w:val="Code"/>
+      </w:pPr>
+      <w:r>
+        <w:t>Für jeden Kurs:</w:t>
+      </w:r>
+    </w:p>
+    <w:p>
+      <w:pPr>
+        <w:pStyle w:val="Code"/>
+      </w:pPr>
+      <w:r>
+        <w:t>- kurs_name: NUR kurze Bezeichnung (z.B. "Kurzgymi Mittwoch")</w:t>
+      </w:r>
+    </w:p>
+    <w:p>
+      <w:pPr>
+        <w:pStyle w:val="Code"/>
+      </w:pPr>
+      <w:r>
+        <w:t>- course_type: "kurzgymi"</w:t>
+      </w:r>
+    </w:p>
+    <w:p>
+      <w:pPr>
+        <w:pStyle w:val="Code"/>
+      </w:pPr>
+      <w:r>
+        <w:t>- weekday: Wochentag</w:t>
+      </w:r>
+    </w:p>
+    <w:p>
+      <w:pPr>
+        <w:pStyle w:val="Code"/>
+      </w:pPr>
+      <w:r>
+        <w:t>- course_time: Kurszeit</w:t>
+      </w:r>
+    </w:p>
+    <w:p>
+      <w:pPr>
+        <w:pStyle w:val="Code"/>
+      </w:pPr>
+      <w:r>
+        <w:t>- start_date, end_date (TT.MM.JJJJ)</w:t>
+      </w:r>
+    </w:p>
+    <w:p>
+      <w:pPr>
+        <w:pStyle w:val="Code"/>
+      </w:pPr>
+      <w:r>
+        <w:t>- price_chf: Zahl</w:t>
+      </w:r>
+    </w:p>
+    <w:p>
+      <w:pPr>
+        <w:pStyle w:val="Code"/>
+      </w:pPr>
+      <w:r>
+        <w:t>- availability: "ausgebucht" oder "viele"</w:t>
+      </w:r>
+    </w:p>
+    <w:p>
+      <w:pPr>
+        <w:pStyle w:val="Code"/>
+      </w:pPr>
+    </w:p>
+    <w:p>
+      <w:pPr>
+        <w:pStyle w:val="Code"/>
+      </w:pPr>
+      <w:r>
+        <w:t>Antworte NUR mit reinem JSON: {"courses": [...]}</w:t>
+      </w:r>
+    </w:p>
+    <w:p>
+      <w:pPr>
+        <w:pStyle w:val="Code"/>
+      </w:pPr>
+    </w:p>
+    <w:p>
+      <w:pPr>
+        <w:pStyle w:val="Code"/>
+      </w:pPr>
+      <w:r>
+        <w:t>PDF-Inhalt:</w:t>
+      </w:r>
+    </w:p>
+    <w:p>
+      <w:pPr>
+        <w:pStyle w:val="Code"/>
+      </w:pPr>
+    </w:p>
+    <w:p>
+      <w:pPr>
+        <w:pStyle w:val="berschrift3"/>
+      </w:pPr>
+      <w:r>
+        <w:t>Anbieter 8: Open Learning Space (sGAI_openLearningSpaceScraper.py)</w:t>
+      </w:r>
+    </w:p>
+    <w:p>
+      <w:pPr/>
+      <w:r>
+        <w:t>Prompt-Key: "overview"</w:t>
+      </w:r>
+    </w:p>
+    <w:p>
+      <w:pPr>
+        <w:pStyle w:val="Code"/>
+      </w:pPr>
+    </w:p>
+    <w:p>
+      <w:pPr>
+        <w:pStyle w:val="Code"/>
+      </w:pPr>
+      <w:r>
+        <w:t>Du bist ein Datenextraktions-Assistent für eine Vergleichsplattform von Gymi-Vorbereitungskursen.</w:t>
+      </w:r>
+    </w:p>
+    <w:p>
+      <w:pPr>
+        <w:pStyle w:val="Code"/>
+      </w:pPr>
+    </w:p>
+    <w:p>
+      <w:pPr>
+        <w:pStyle w:val="Code"/>
+      </w:pPr>
+      <w:r>
+        <w:t>Extrahiere ALLE Kurse (Langzeit- und Kurzzeitgymnasium) von dieser Seite.</w:t>
+      </w:r>
+    </w:p>
+    <w:p>
+      <w:pPr>
+        <w:pStyle w:val="Code"/>
+      </w:pPr>
+      <w:r>
+        <w:t>Für jeden Kurs gib zurück:</w:t>
+      </w:r>
+    </w:p>
+    <w:p>
+      <w:pPr>
+        <w:pStyle w:val="Code"/>
+      </w:pPr>
+      <w:r>
+        <w:t>- course_type: "langgymi" oder "kurzgymi"</w:t>
+      </w:r>
+    </w:p>
+    <w:p>
+      <w:pPr>
+        <w:pStyle w:val="Code"/>
+      </w:pPr>
+      <w:r>
+        <w:t>- weekday: Wochentag auf Deutsch</w:t>
+      </w:r>
+    </w:p>
+    <w:p>
+      <w:pPr>
+        <w:pStyle w:val="Code"/>
+      </w:pPr>
+      <w:r>
+        <w:t>- course_time: Kurszeit (z.B. "14:00-16:45")</w:t>
+      </w:r>
+    </w:p>
+    <w:p>
+      <w:pPr>
+        <w:pStyle w:val="Code"/>
+      </w:pPr>
+      <w:r>
+        <w:t>- start_date: TT.MM.JJJJ</w:t>
+      </w:r>
+    </w:p>
+    <w:p>
+      <w:pPr>
+        <w:pStyle w:val="Code"/>
+      </w:pPr>
+      <w:r>
+        <w:t>- end_date: TT.MM.JJJJ</w:t>
+      </w:r>
+    </w:p>
+    <w:p>
+      <w:pPr>
+        <w:pStyle w:val="Code"/>
+      </w:pPr>
+      <w:r>
+        <w:t>- price_chf: Preis als Zahl</w:t>
+      </w:r>
+    </w:p>
+    <w:p>
+      <w:pPr>
+        <w:pStyle w:val="Code"/>
+      </w:pPr>
+      <w:r>
+        <w:t>- location: Kursort</w:t>
+      </w:r>
+    </w:p>
+    <w:p>
+      <w:pPr>
+        <w:pStyle w:val="Code"/>
+      </w:pPr>
+      <w:r>
+        <w:t>- max_teilnehmer: Zahl</w:t>
+      </w:r>
+    </w:p>
+    <w:p>
+      <w:pPr>
+        <w:pStyle w:val="Code"/>
+      </w:pPr>
+    </w:p>
+    <w:p>
+      <w:pPr>
+        <w:pStyle w:val="Code"/>
+      </w:pPr>
+      <w:r>
+        <w:t>Extrahiere zusätzlich Anbieter-Metadaten:</w:t>
+      </w:r>
+    </w:p>
+    <w:p>
+      <w:pPr>
+        <w:pStyle w:val="Code"/>
+      </w:pPr>
+      <w:r>
+        <w:t>- aufsatzkorrektur, einstufungstest, e_learning, pruefungsarchiv, beratungsgespraech,</w:t>
+      </w:r>
+    </w:p>
+    <w:p>
+      <w:pPr>
+        <w:pStyle w:val="Code"/>
+      </w:pPr>
+      <w:r>
+        <w:t xml:space="preserve">  lernunterlagen, pruefungssimulation, einzelkurse, unterstuetzung_ausserhalb (alle als bool)</w:t>
+      </w:r>
+    </w:p>
+    <w:p>
+      <w:pPr>
+        <w:pStyle w:val="Code"/>
+      </w:pPr>
+      <w:r>
+        <w:t>- unterstuetzung_ausserhalb: true wenn Nachholoptionen, Aufholstunden, Hausaufgabenbetreuung,</w:t>
+      </w:r>
+    </w:p>
+    <w:p>
+      <w:pPr>
+        <w:pStyle w:val="Code"/>
+      </w:pPr>
+      <w:r>
+        <w:t xml:space="preserve">  Wiederholung verpasster Lektionen oder Unterstützung ausserhalb der Unterrichtszeiten</w:t>
+      </w:r>
+    </w:p>
+    <w:p>
+      <w:pPr>
+        <w:pStyle w:val="Code"/>
+      </w:pPr>
+      <w:r>
+        <w:t xml:space="preserve">  angeboten wird</w:t>
+      </w:r>
+    </w:p>
+    <w:p>
+      <w:pPr>
+        <w:pStyle w:val="Code"/>
+      </w:pPr>
+      <w:r>
+        <w:t>- max_teilnehmer: Zahl</w:t>
+      </w:r>
+    </w:p>
+    <w:p>
+      <w:pPr>
+        <w:pStyle w:val="Code"/>
+      </w:pPr>
+      <w:r>
+        <w:t>- standorte: Liste aller Standorte</w:t>
+      </w:r>
+    </w:p>
+    <w:p>
+      <w:pPr>
+        <w:pStyle w:val="Code"/>
+      </w:pPr>
+    </w:p>
+    <w:p>
+      <w:pPr>
+        <w:pStyle w:val="Code"/>
+      </w:pPr>
+      <w:r>
+        <w:t>Antworte NUR mit reinem JSON: {"courses": [...], "metadata": {...}}</w:t>
+      </w:r>
+    </w:p>
+    <w:p>
+      <w:pPr>
+        <w:pStyle w:val="Code"/>
+      </w:pPr>
+    </w:p>
+    <w:p>
+      <w:pPr/>
+      <w:r>
+        <w:t>Prompt-Key: "kursseite"</w:t>
+      </w:r>
+    </w:p>
+    <w:p>
+      <w:pPr>
+        <w:pStyle w:val="Code"/>
+      </w:pPr>
+    </w:p>
+    <w:p>
+      <w:pPr>
+        <w:pStyle w:val="Code"/>
+      </w:pPr>
+      <w:r>
+        <w:t>Du bist ein Datenextraktions-Assistent. Extrahiere alle Kurse von dieser Seite.</w:t>
+      </w:r>
+    </w:p>
+    <w:p>
+      <w:pPr>
+        <w:pStyle w:val="Code"/>
+      </w:pPr>
+    </w:p>
+    <w:p>
+      <w:pPr>
+        <w:pStyle w:val="Code"/>
+      </w:pPr>
+      <w:r>
+        <w:t>Für jeden Kurs gib zurück:</w:t>
+      </w:r>
+    </w:p>
+    <w:p>
+      <w:pPr>
+        <w:pStyle w:val="Code"/>
+      </w:pPr>
+      <w:r>
+        <w:t>- course_type: "langgymi" oder "kurzgymi"</w:t>
+      </w:r>
+    </w:p>
+    <w:p>
+      <w:pPr>
+        <w:pStyle w:val="Code"/>
+      </w:pPr>
+      <w:r>
+        <w:t>- weekday: Wochentag</w:t>
+      </w:r>
+    </w:p>
+    <w:p>
+      <w:pPr>
+        <w:pStyle w:val="Code"/>
+      </w:pPr>
+      <w:r>
+        <w:t>- course_time: Kurszeit</w:t>
+      </w:r>
+    </w:p>
+    <w:p>
+      <w:pPr>
+        <w:pStyle w:val="Code"/>
+      </w:pPr>
+      <w:r>
+        <w:t>- start_date: TT.MM.JJJJ</w:t>
+      </w:r>
+    </w:p>
+    <w:p>
+      <w:pPr>
+        <w:pStyle w:val="Code"/>
+      </w:pPr>
+      <w:r>
+        <w:t>- end_date: TT.MM.JJJJ</w:t>
+      </w:r>
+    </w:p>
+    <w:p>
+      <w:pPr>
+        <w:pStyle w:val="Code"/>
+      </w:pPr>
+      <w:r>
+        <w:t>- price_chf: Zahl</w:t>
+      </w:r>
+    </w:p>
+    <w:p>
+      <w:pPr>
+        <w:pStyle w:val="Code"/>
+      </w:pPr>
+      <w:r>
+        <w:t>- location: Kursort</w:t>
+      </w:r>
+    </w:p>
+    <w:p>
+      <w:pPr>
+        <w:pStyle w:val="Code"/>
+      </w:pPr>
+      <w:r>
+        <w:t>- max_teilnehmer: Zahl</w:t>
+      </w:r>
+    </w:p>
+    <w:p>
+      <w:pPr>
+        <w:pStyle w:val="Code"/>
+      </w:pPr>
+      <w:r>
+        <w:t>- availability: "ausgebucht" oder "viele"</w:t>
+      </w:r>
+    </w:p>
+    <w:p>
+      <w:pPr>
+        <w:pStyle w:val="Code"/>
+      </w:pPr>
+    </w:p>
+    <w:p>
+      <w:pPr>
+        <w:pStyle w:val="Code"/>
+      </w:pPr>
+      <w:r>
+        <w:t>Extrahiere zusätzlich Metadaten (dieselben Felder wie in der Übersicht, inkl. unterstuetzung_ausserhalb).</w:t>
+      </w:r>
+    </w:p>
+    <w:p>
+      <w:pPr>
+        <w:pStyle w:val="Code"/>
+      </w:pPr>
+    </w:p>
+    <w:p>
+      <w:pPr>
+        <w:pStyle w:val="Code"/>
+      </w:pPr>
+      <w:r>
+        <w:t>Antworte NUR mit reinem JSON: {"courses": [...], "metadata": {...}}</w:t>
+      </w:r>
+    </w:p>
+    <w:p>
+      <w:pPr>
+        <w:pStyle w:val="Code"/>
+      </w:pPr>
+    </w:p>
+    <w:p>
+      <w:pPr>
+        <w:pStyle w:val="berschrift3"/>
+      </w:pPr>
+      <w:r>
+        <w:t>Anbieter 9: Schlaumacher (sGAI_schlaumacherScraper.py)</w:t>
+      </w:r>
+    </w:p>
+    <w:p>
+      <w:pPr/>
+      <w:r>
+        <w:t>Prompt-Key: "overview"</w:t>
+      </w:r>
+    </w:p>
+    <w:p>
+      <w:pPr>
+        <w:pStyle w:val="Code"/>
+      </w:pPr>
+    </w:p>
+    <w:p>
+      <w:pPr>
+        <w:pStyle w:val="Code"/>
+      </w:pPr>
+      <w:r>
+        <w:t>Du bist ein Datenextraktions-Assistent für eine Vergleichsplattform von Gymi-Vorbereitungskursen.</w:t>
+      </w:r>
+    </w:p>
+    <w:p>
+      <w:pPr>
+        <w:pStyle w:val="Code"/>
+      </w:pPr>
+    </w:p>
+    <w:p>
+      <w:pPr>
+        <w:pStyle w:val="Code"/>
+      </w:pPr>
+      <w:r>
+        <w:t>Extrahiere ALLE Kurse von dieser Seite. Für jeden Kurs gib zurück:</w:t>
+      </w:r>
+    </w:p>
+    <w:p>
+      <w:pPr>
+        <w:pStyle w:val="Code"/>
+      </w:pPr>
+      <w:r>
+        <w:t>- title: Kursname (z.B. "Langzeitgymnasium: Vorbereitung Start September: Mittwoch")</w:t>
+      </w:r>
+    </w:p>
+    <w:p>
+      <w:pPr>
+        <w:pStyle w:val="Code"/>
+      </w:pPr>
+      <w:r>
+        <w:t>- course_type: "langgymi" oder "kurzgymi"</w:t>
+      </w:r>
+    </w:p>
+    <w:p>
+      <w:pPr>
+        <w:pStyle w:val="Code"/>
+      </w:pPr>
+      <w:r>
+        <w:t>- weekday: Wochentag(e) auf Deutsch</w:t>
+      </w:r>
+    </w:p>
+    <w:p>
+      <w:pPr>
+        <w:pStyle w:val="Code"/>
+      </w:pPr>
+      <w:r>
+        <w:t>- course_time: Kurszeit (z.B. "13:30-16:30")</w:t>
+      </w:r>
+    </w:p>
+    <w:p>
+      <w:pPr>
+        <w:pStyle w:val="Code"/>
+      </w:pPr>
+      <w:r>
+        <w:t>- start_date: TT.MM.JJJJ</w:t>
+      </w:r>
+    </w:p>
+    <w:p>
+      <w:pPr>
+        <w:pStyle w:val="Code"/>
+      </w:pPr>
+      <w:r>
+        <w:t>- end_date: TT.MM.JJJJ</w:t>
+      </w:r>
+    </w:p>
+    <w:p>
+      <w:pPr>
+        <w:pStyle w:val="Code"/>
+      </w:pPr>
+      <w:r>
+        <w:t>- price_chf: Gesamtpreis als Zahl</w:t>
+      </w:r>
+    </w:p>
+    <w:p>
+      <w:pPr>
+        <w:pStyle w:val="Code"/>
+      </w:pPr>
+      <w:r>
+        <w:t>- location: Kursort</w:t>
+      </w:r>
+    </w:p>
+    <w:p>
+      <w:pPr>
+        <w:pStyle w:val="Code"/>
+      </w:pPr>
+      <w:r>
+        <w:t>- course_url: URL des Kurses falls vorhanden</w:t>
+      </w:r>
+    </w:p>
+    <w:p>
+      <w:pPr>
+        <w:pStyle w:val="Code"/>
+      </w:pPr>
+      <w:r>
+        <w:t>- availability: "ausgebucht" wenn ausgebucht, sonst "viele"</w:t>
+      </w:r>
+    </w:p>
+    <w:p>
+      <w:pPr>
+        <w:pStyle w:val="Code"/>
+      </w:pPr>
+    </w:p>
+    <w:p>
+      <w:pPr>
+        <w:pStyle w:val="Code"/>
+      </w:pPr>
+      <w:r>
+        <w:t>Extrahiere ausserdem Anbieter-Metadaten:</w:t>
+      </w:r>
+    </w:p>
+    <w:p>
+      <w:pPr>
+        <w:pStyle w:val="Code"/>
+      </w:pPr>
+      <w:r>
+        <w:t>- aufsatzkorrektur, einstufungstest, e_learning, pruefungsarchiv, beratungsgespraech,</w:t>
+      </w:r>
+    </w:p>
+    <w:p>
+      <w:pPr>
+        <w:pStyle w:val="Code"/>
+      </w:pPr>
+      <w:r>
+        <w:t xml:space="preserve">  lernunterlagen, pruefungssimulation, einzelkurse, unterstuetzung_ausserhalb (alle als bool)</w:t>
+      </w:r>
+    </w:p>
+    <w:p>
+      <w:pPr>
+        <w:pStyle w:val="Code"/>
+      </w:pPr>
+      <w:r>
+        <w:t>- unterstuetzung_ausserhalb: true wenn Nachholoptionen, Aufholstunden, Hausaufgabenbetreuung,</w:t>
+      </w:r>
+    </w:p>
+    <w:p>
+      <w:pPr>
+        <w:pStyle w:val="Code"/>
+      </w:pPr>
+      <w:r>
+        <w:t xml:space="preserve">  Wiederholung verpasster Lektionen oder Unterstützung ausserhalb der Unterrichtszeiten</w:t>
+      </w:r>
+    </w:p>
+    <w:p>
+      <w:pPr>
+        <w:pStyle w:val="Code"/>
+      </w:pPr>
+      <w:r>
+        <w:t xml:space="preserve">  angeboten wird</w:t>
+      </w:r>
+    </w:p>
+    <w:p>
+      <w:pPr>
+        <w:pStyle w:val="Code"/>
+      </w:pPr>
+      <w:r>
+        <w:t>- max_teilnehmer: Zahl</w:t>
+      </w:r>
+    </w:p>
+    <w:p>
+      <w:pPr>
+        <w:pStyle w:val="Code"/>
+      </w:pPr>
+      <w:r>
+        <w:t>- standorte: Liste</w:t>
+      </w:r>
+    </w:p>
+    <w:p>
+      <w:pPr>
+        <w:pStyle w:val="Code"/>
+      </w:pPr>
+    </w:p>
+    <w:p>
+      <w:pPr>
+        <w:pStyle w:val="Code"/>
+      </w:pPr>
+      <w:r>
+        <w:t>Antworte NUR mit reinem JSON: {"courses": [...], "metadata": {...}}</w:t>
+      </w:r>
+    </w:p>
+    <w:p>
+      <w:pPr>
+        <w:pStyle w:val="Code"/>
+      </w:pPr>
+    </w:p>
+    <w:p>
+      <w:pPr>
+        <w:pStyle w:val="berschrift3"/>
+      </w:pPr>
+      <w:r>
+        <w:t>Anbieter 10: Logos Lehrerteam (sGAI_logosLehrerteamScraper.py)</w:t>
+      </w:r>
+    </w:p>
+    <w:p>
+      <w:pPr/>
+      <w:r>
+        <w:t>Prompt-Key: "metadata"</w:t>
+      </w:r>
+    </w:p>
+    <w:p>
+      <w:pPr>
+        <w:pStyle w:val="Code"/>
+      </w:pPr>
+    </w:p>
+    <w:p>
+      <w:pPr>
+        <w:pStyle w:val="Code"/>
+      </w:pPr>
+      <w:r>
+        <w:t>Du bist ein Datenextraktions-Assistent. Analysiere diese Seite semantisch:</w:t>
+      </w:r>
+    </w:p>
+    <w:p>
+      <w:pPr>
+        <w:pStyle w:val="Code"/>
+      </w:pPr>
+    </w:p>
+    <w:p>
+      <w:pPr>
+        <w:pStyle w:val="Code"/>
+      </w:pPr>
+      <w:r>
+        <w:t>- aufsatzkorrektur: true wenn Aufsatztraining, Aufsatzkurs oder Schreibtraining erwähnt wird</w:t>
+      </w:r>
+    </w:p>
+    <w:p>
+      <w:pPr>
+        <w:pStyle w:val="Code"/>
+      </w:pPr>
+      <w:r>
+        <w:t>- einstufungstest: true wenn Einstufungstest, Standortbestimmung, Minimalnoten erwähnt werden</w:t>
+      </w:r>
+    </w:p>
+    <w:p>
+      <w:pPr>
+        <w:pStyle w:val="Code"/>
+      </w:pPr>
+      <w:r>
+        <w:t>- e_learning: true wenn digitales Lehrmittel, E-Learning oder Online-Plattform (z.B. edulo) erwähnt wird</w:t>
+      </w:r>
+    </w:p>
+    <w:p>
+      <w:pPr>
+        <w:pStyle w:val="Code"/>
+      </w:pPr>
+      <w:r>
+        <w:t>- pruefungsarchiv: true wenn Probeprüfungen oder Simulationsprüfungen erwähnt werden</w:t>
+      </w:r>
+    </w:p>
+    <w:p>
+      <w:pPr>
+        <w:pStyle w:val="Code"/>
+      </w:pPr>
+      <w:r>
+        <w:t>- beratungsgespraech: true wenn Beratung oder Kontakt angeboten wird</w:t>
+      </w:r>
+    </w:p>
+    <w:p>
+      <w:pPr>
+        <w:pStyle w:val="Code"/>
+      </w:pPr>
+      <w:r>
+        <w:t>- lernunterlagen: true wenn Lehrmittel, Arbeitsheft oder Kursmaterial inbegriffen ist</w:t>
+      </w:r>
+    </w:p>
+    <w:p>
+      <w:pPr>
+        <w:pStyle w:val="Code"/>
+      </w:pPr>
+      <w:r>
+        <w:t>- pruefungssimulation: true wenn Simulationsprüfung explizit erwähnt wird</w:t>
+      </w:r>
+    </w:p>
+    <w:p>
+      <w:pPr>
+        <w:pStyle w:val="Code"/>
+      </w:pPr>
+      <w:r>
+        <w:t>- einzelkurse: true wenn Einzelunterricht oder Privatunterricht angeboten werden</w:t>
+      </w:r>
+    </w:p>
+    <w:p>
+      <w:pPr>
+        <w:pStyle w:val="Code"/>
+      </w:pPr>
+      <w:r>
+        <w:t>- unterstuetzung_ausserhalb: true wenn Nachholoptionen, Aufholstunden, Hausaufgabenbetreuung, Wiederholung verpasster Lektionen oder Unterstützung ausserhalb der Unterrichtszeiten angeboten wird</w:t>
+      </w:r>
+    </w:p>
+    <w:p>
+      <w:pPr>
+        <w:pStyle w:val="Code"/>
+      </w:pPr>
+      <w:r>
+        <w:t>- max_teilnehmer: maximale Gruppengrösse als Zahl</w:t>
+      </w:r>
+    </w:p>
+    <w:p>
+      <w:pPr>
+        <w:pStyle w:val="Code"/>
+      </w:pPr>
+      <w:r>
+        <w:t>- standorte: Liste aller Kursorte</w:t>
+      </w:r>
+    </w:p>
+    <w:p>
+      <w:pPr>
+        <w:pStyle w:val="Code"/>
+      </w:pPr>
+    </w:p>
+    <w:p>
+      <w:pPr>
+        <w:pStyle w:val="Code"/>
+      </w:pPr>
+      <w:r>
+        <w:t>Antworte NUR mit reinem JSON: {"metadata": {...}}</w:t>
+      </w:r>
+    </w:p>
+    <w:p>
+      <w:pPr>
+        <w:pStyle w:val="Code"/>
+      </w:pPr>
+    </w:p>
+    <w:p>
+      <w:pPr/>
+      <w:r>
+        <w:t>Prompt-Key: "kursdaten"</w:t>
+      </w:r>
+    </w:p>
+    <w:p>
+      <w:pPr>
+        <w:pStyle w:val="Code"/>
+      </w:pPr>
+    </w:p>
+    <w:p>
+      <w:pPr>
+        <w:pStyle w:val="Code"/>
+      </w:pPr>
+      <w:r>
+        <w:t>Extrahiere alle Kursinformationen. Kurse in 3 Teile (Teil 1, 2, 3) an Mittwoch oder Samstag.</w:t>
+      </w:r>
+    </w:p>
+    <w:p>
+      <w:pPr>
+        <w:pStyle w:val="Code"/>
+      </w:pPr>
+      <w:r>
+        <w:t>Ausserdem Ferienkurse (Intensivkurse).</w:t>
+      </w:r>
+    </w:p>
+    <w:p>
+      <w:pPr>
+        <w:pStyle w:val="Code"/>
+      </w:pPr>
+    </w:p>
+    <w:p>
+      <w:pPr>
+        <w:pStyle w:val="Code"/>
+      </w:pPr>
+      <w:r>
+        <w:t>Für jeden Kursabschnitt:</w:t>
+      </w:r>
+    </w:p>
+    <w:p>
+      <w:pPr>
+        <w:pStyle w:val="Code"/>
+      </w:pPr>
+      <w:r>
+        <w:t>- kursabschnitt: "Teil 1", "Teil 2", "Teil 3", "Herbstferienkurs 1", etc.</w:t>
+      </w:r>
+    </w:p>
+    <w:p>
+      <w:pPr>
+        <w:pStyle w:val="Code"/>
+      </w:pPr>
+      <w:r>
+        <w:t>- kurstyp_intern: "schulbegleitend" oder "ferienkurs"</w:t>
+      </w:r>
+    </w:p>
+    <w:p>
+      <w:pPr>
+        <w:pStyle w:val="Code"/>
+      </w:pPr>
+      <w:r>
+        <w:t>- weekdays: Liste der Wochentage (z.B. ["Mittwoch", "Samstag"])</w:t>
+      </w:r>
+    </w:p>
+    <w:p>
+      <w:pPr>
+        <w:pStyle w:val="Code"/>
+      </w:pPr>
+      <w:r>
+        <w:t>- start_date_mi, end_date_mi (TT.MM.JJJJ, für Mittwochkurse)</w:t>
+      </w:r>
+    </w:p>
+    <w:p>
+      <w:pPr>
+        <w:pStyle w:val="Code"/>
+      </w:pPr>
+      <w:r>
+        <w:t>- start_date_sa, end_date_sa (TT.MM.JJJJ, für Samstagkurse)</w:t>
+      </w:r>
+    </w:p>
+    <w:p>
+      <w:pPr>
+        <w:pStyle w:val="Code"/>
+      </w:pPr>
+      <w:r>
+        <w:t>- dauer_wochen: Zahl</w:t>
+      </w:r>
+    </w:p>
+    <w:p>
+      <w:pPr>
+        <w:pStyle w:val="Code"/>
+      </w:pPr>
+    </w:p>
+    <w:p>
+      <w:pPr>
+        <w:pStyle w:val="Code"/>
+      </w:pPr>
+      <w:r>
+        <w:t>Antworte NUR mit reinem JSON: {"kurse": [...]}</w:t>
+      </w:r>
+    </w:p>
+    <w:p>
+      <w:pPr>
+        <w:pStyle w:val="Code"/>
+      </w:pPr>
+    </w:p>
+    <w:p>
+      <w:pPr/>
+      <w:r>
+        <w:t>Prompt-Key: "kosten"</w:t>
+      </w:r>
+    </w:p>
+    <w:p>
+      <w:pPr>
+        <w:pStyle w:val="Code"/>
+      </w:pPr>
+    </w:p>
+    <w:p>
+      <w:pPr>
+        <w:pStyle w:val="Code"/>
+      </w:pPr>
+      <w:r>
+        <w:t>Extrahiere Preisinformationen:</w:t>
+      </w:r>
+    </w:p>
+    <w:p>
+      <w:pPr>
+        <w:pStyle w:val="Code"/>
+      </w:pPr>
+      <w:r>
+        <w:t>- preis_gesamt: Gesamtpreis alle 3 Teile bei Frühbuchung als Zahl in CHF</w:t>
+      </w:r>
+    </w:p>
+    <w:p>
+      <w:pPr>
+        <w:pStyle w:val="Code"/>
+      </w:pPr>
+      <w:r>
+        <w:t>- preis_regulaer: Regulärpreis ohne Rabatt in CHF</w:t>
+      </w:r>
+    </w:p>
+    <w:p>
+      <w:pPr>
+        <w:pStyle w:val="Code"/>
+      </w:pPr>
+      <w:r>
+        <w:t>- fruehbucher_rabatt_prozent: Rabatt in Prozent</w:t>
+      </w:r>
+    </w:p>
+    <w:p>
+      <w:pPr>
+        <w:pStyle w:val="Code"/>
+      </w:pPr>
+      <w:r>
+        <w:t>- lehrmittel_inbegriffen: bool</w:t>
+      </w:r>
+    </w:p>
+    <w:p>
+      <w:pPr>
+        <w:pStyle w:val="Code"/>
+      </w:pPr>
+    </w:p>
+    <w:p>
+      <w:pPr>
+        <w:pStyle w:val="Code"/>
+      </w:pPr>
+      <w:r>
+        <w:t>Antworte NUR mit reinem JSON: {"kosten": {...}}</w:t>
+      </w:r>
+    </w:p>
+    <w:p>
+      <w:pPr>
+        <w:pStyle w:val="Code"/>
+      </w:pPr>
+    </w:p>
+    <w:p>
+      <w:pPr>
+        <w:pStyle w:val="berschrift3"/>
+      </w:pPr>
+      <w:r>
+        <w:t>Anbieter 11: Lernterrasse (sGAI_lernTerrasseScraper.py)</w:t>
+      </w:r>
+    </w:p>
+    <w:p>
+      <w:pPr/>
+      <w:r>
+        <w:t>Prompt-Key: "main"</w:t>
+      </w:r>
+    </w:p>
+    <w:p>
+      <w:pPr>
+        <w:pStyle w:val="Code"/>
+      </w:pPr>
+    </w:p>
+    <w:p>
+      <w:pPr>
+        <w:pStyle w:val="Code"/>
+      </w:pPr>
+      <w:r>
+        <w:t>Du bist ein Datenextraktions-Assistent. Extrahiere alle Kurszeilen aus den Tabellen.</w:t>
+      </w:r>
+    </w:p>
+    <w:p>
+      <w:pPr>
+        <w:pStyle w:val="Code"/>
+      </w:pPr>
+    </w:p>
+    <w:p>
+      <w:pPr>
+        <w:pStyle w:val="Code"/>
+      </w:pPr>
+      <w:r>
+        <w:t>Jede Tabelle hat Spalten: Kurs, Stufe, Kurstag, Beginn am, Preis (Fr.), Anmeldung.</w:t>
+      </w:r>
+    </w:p>
+    <w:p>
+      <w:pPr>
+        <w:pStyle w:val="Code"/>
+      </w:pPr>
+    </w:p>
+    <w:p>
+      <w:pPr>
+        <w:pStyle w:val="Code"/>
+      </w:pPr>
+      <w:r>
+        <w:t>Für jeden Kurs (Tabellenzeile):</w:t>
+      </w:r>
+    </w:p>
+    <w:p>
+      <w:pPr>
+        <w:pStyle w:val="Code"/>
+      </w:pPr>
+      <w:r>
+        <w:t>- course_name: Name und Zeitraum (z.B. "Kurs A August-Februar")</w:t>
+      </w:r>
+    </w:p>
+    <w:p>
+      <w:pPr>
+        <w:pStyle w:val="Code"/>
+      </w:pPr>
+      <w:r>
+        <w:t>- stufe: Schulstufe</w:t>
+      </w:r>
+    </w:p>
+    <w:p>
+      <w:pPr>
+        <w:pStyle w:val="Code"/>
+      </w:pPr>
+      <w:r>
+        <w:t>- weekday: Nur Wochentag (z.B. "Mittwoch", "Samstag", "Di &amp; Do")</w:t>
+      </w:r>
+    </w:p>
+    <w:p>
+      <w:pPr>
+        <w:pStyle w:val="Code"/>
+      </w:pPr>
+      <w:r>
+        <w:t>- course_time: Nur Uhrzeit (z.B. "14:00-16:55")</w:t>
+      </w:r>
+    </w:p>
+    <w:p>
+      <w:pPr>
+        <w:pStyle w:val="Code"/>
+      </w:pPr>
+      <w:r>
+        <w:t>- start_date: TT.MM.JJJJ</w:t>
+      </w:r>
+    </w:p>
+    <w:p>
+      <w:pPr>
+        <w:pStyle w:val="Code"/>
+      </w:pPr>
+      <w:r>
+        <w:t>- end_date: TT.MM.JJJJ oder null</w:t>
+      </w:r>
+    </w:p>
+    <w:p>
+      <w:pPr>
+        <w:pStyle w:val="Code"/>
+      </w:pPr>
+      <w:r>
+        <w:t>- price_chf: Zahl</w:t>
+      </w:r>
+    </w:p>
+    <w:p>
+      <w:pPr>
+        <w:pStyle w:val="Code"/>
+      </w:pPr>
+      <w:r>
+        <w:t>- availability: "ausgebucht" wenn AUSGEBUCHT, sonst "viele"</w:t>
+      </w:r>
+    </w:p>
+    <w:p>
+      <w:pPr>
+        <w:pStyle w:val="Code"/>
+      </w:pPr>
+      <w:r>
+        <w:t>- kursabschnitt: z.B. "Teil I-III"</w:t>
+      </w:r>
+    </w:p>
+    <w:p>
+      <w:pPr>
+        <w:pStyle w:val="Code"/>
+      </w:pPr>
+    </w:p>
+    <w:p>
+      <w:pPr>
+        <w:pStyle w:val="Code"/>
+      </w:pPr>
+      <w:r>
+        <w:t>Einmalig Anbieter-Metadaten:</w:t>
+      </w:r>
+    </w:p>
+    <w:p>
+      <w:pPr>
+        <w:pStyle w:val="Code"/>
+      </w:pPr>
+      <w:r>
+        <w:t>- aufsatzkorrektur, einstufungstest, e_learning, pruefungsarchiv, beratungsgespraech,</w:t>
+      </w:r>
+    </w:p>
+    <w:p>
+      <w:pPr>
+        <w:pStyle w:val="Code"/>
+      </w:pPr>
+      <w:r>
+        <w:t xml:space="preserve">  lernunterlagen, pruefungssimulation, unterstuetzung_ausserhalb (alle als bool)</w:t>
+      </w:r>
+    </w:p>
+    <w:p>
+      <w:pPr>
+        <w:pStyle w:val="Code"/>
+      </w:pPr>
+      <w:r>
+        <w:t>- unterstuetzung_ausserhalb: true wenn Nachholoptionen, Aufholstunden, Hausaufgabenbetreuung,</w:t>
+      </w:r>
+    </w:p>
+    <w:p>
+      <w:pPr>
+        <w:pStyle w:val="Code"/>
+      </w:pPr>
+      <w:r>
+        <w:t xml:space="preserve">  Wiederholung verpasster Lektionen oder Unterstützung ausserhalb der Unterrichtszeiten</w:t>
+      </w:r>
+    </w:p>
+    <w:p>
+      <w:pPr>
+        <w:pStyle w:val="Code"/>
+      </w:pPr>
+      <w:r>
+        <w:t xml:space="preserve">  angeboten wird</w:t>
+      </w:r>
+    </w:p>
+    <w:p>
+      <w:pPr>
+        <w:pStyle w:val="Code"/>
+      </w:pPr>
+      <w:r>
+        <w:t>- max_teilnehmer: Zahl</w:t>
+      </w:r>
+    </w:p>
+    <w:p>
+      <w:pPr>
+        <w:pStyle w:val="Code"/>
+      </w:pPr>
+    </w:p>
+    <w:p>
+      <w:pPr>
+        <w:pStyle w:val="Code"/>
+      </w:pPr>
+      <w:r>
+        <w:t>Antworte NUR mit reinem JSON: {"courses": [...], "metadata": {...}}</w:t>
+      </w:r>
+    </w:p>
+    <w:p>
+      <w:pPr>
+        <w:pStyle w:val="Code"/>
+      </w:pPr>
+    </w:p>
+    <w:p>
+      <w:pPr>
+        <w:pStyle w:val="berschrift3"/>
+      </w:pPr>
+      <w:r>
+        <w:t>Anbieter 12: LearningCube (sGAI_learningCubeScraper.py)</w:t>
+      </w:r>
+    </w:p>
+    <w:p>
+      <w:pPr/>
+      <w:r>
+        <w:t>Prompt-Key: "overview"</w:t>
+      </w:r>
+    </w:p>
+    <w:p>
+      <w:pPr>
+        <w:pStyle w:val="Code"/>
+      </w:pPr>
+    </w:p>
+    <w:p>
+      <w:pPr>
+        <w:pStyle w:val="Code"/>
+      </w:pPr>
+      <w:r>
+        <w:t>Du bist ein Datenextraktions-Assistent.</w:t>
+      </w:r>
+    </w:p>
+    <w:p>
+      <w:pPr>
+        <w:pStyle w:val="Code"/>
+      </w:pPr>
+      <w:r>
+        <w:t>Extrahiere Anbieter-Metadaten von dieser Gymivorbereitung-Übersichtsseite.</w:t>
+      </w:r>
+    </w:p>
+    <w:p>
+      <w:pPr>
+        <w:pStyle w:val="Code"/>
+      </w:pPr>
+      <w:r>
+        <w:t>Interpretiere die Texte semantisch — es müssen nicht die exakten Begriffe vorkommen.</w:t>
+      </w:r>
+    </w:p>
+    <w:p>
+      <w:pPr>
+        <w:pStyle w:val="Code"/>
+      </w:pPr>
+    </w:p>
+    <w:p>
+      <w:pPr>
+        <w:pStyle w:val="Code"/>
+      </w:pPr>
+      <w:r>
+        <w:t>Gib zurück:</w:t>
+      </w:r>
+    </w:p>
+    <w:p>
+      <w:pPr>
+        <w:pStyle w:val="Code"/>
+      </w:pPr>
+      <w:r>
+        <w:t>- aufsatzkorrektur: true wenn Aufsatztraining, Aufsatzkorrektur oder Schreibtraining erwähnt wird</w:t>
+      </w:r>
+    </w:p>
+    <w:p>
+      <w:pPr>
+        <w:pStyle w:val="Code"/>
+      </w:pPr>
+      <w:r>
+        <w:t>- einstufungstest: true wenn Einstufungstest, Standortbestimmung oder Lernstand ermitteln erwähnt wird</w:t>
+      </w:r>
+    </w:p>
+    <w:p>
+      <w:pPr>
+        <w:pStyle w:val="Code"/>
+      </w:pPr>
+      <w:r>
+        <w:t>- e_learning: true wenn Online-Kurs, E-Learning oder digitale Lernmittel erwähnt wird</w:t>
+      </w:r>
+    </w:p>
+    <w:p>
+      <w:pPr>
+        <w:pStyle w:val="Code"/>
+      </w:pPr>
+      <w:r>
+        <w:t>- pruefungsarchiv: true wenn alte Prüfungen oder Prüfungsarchiv erwähnt wird</w:t>
+      </w:r>
+    </w:p>
+    <w:p>
+      <w:pPr>
+        <w:pStyle w:val="Code"/>
+      </w:pPr>
+      <w:r>
+        <w:t>- beratungsgespraech: true wenn Beratungsgespräch oder Erstgespräch erwähnt wird</w:t>
+      </w:r>
+    </w:p>
+    <w:p>
+      <w:pPr>
+        <w:pStyle w:val="Code"/>
+      </w:pPr>
+      <w:r>
+        <w:t>- lernunterlagen: true wenn Lernmaterial oder Lehrmittel inbegriffen</w:t>
+      </w:r>
+    </w:p>
+    <w:p>
+      <w:pPr>
+        <w:pStyle w:val="Code"/>
+      </w:pPr>
+      <w:r>
+        <w:t>- pruefungssimulation: true wenn Simulationsprüfung oder Probeprüfung erwähnt wird</w:t>
+      </w:r>
+    </w:p>
+    <w:p>
+      <w:pPr>
+        <w:pStyle w:val="Code"/>
+      </w:pPr>
+      <w:r>
+        <w:t>- einzelkurse: true wenn Einzelunterricht angeboten wird</w:t>
+      </w:r>
+    </w:p>
+    <w:p>
+      <w:pPr>
+        <w:pStyle w:val="Code"/>
+      </w:pPr>
+      <w:r>
+        <w:t>- unterstuetzung_ausserhalb: true wenn Nachholoptionen, Aufholstunden, Hausaufgabenbetreuung, Wiederholung verpasster Lektionen oder Unterstützung ausserhalb der Unterrichtszeiten angeboten wird</w:t>
+      </w:r>
+    </w:p>
+    <w:p>
+      <w:pPr>
+        <w:pStyle w:val="Code"/>
+      </w:pPr>
+      <w:r>
+        <w:t>- max_teilnehmer: maximale Gruppengrösse als Zahl (z.B. 3)</w:t>
+      </w:r>
+    </w:p>
+    <w:p>
+      <w:pPr>
+        <w:pStyle w:val="Code"/>
+      </w:pPr>
+      <w:r>
+        <w:t>- standort: Kursort (z.B. "Meilen")</w:t>
+      </w:r>
+    </w:p>
+    <w:p>
+      <w:pPr>
+        <w:pStyle w:val="Code"/>
+      </w:pPr>
+    </w:p>
+    <w:p>
+      <w:pPr>
+        <w:pStyle w:val="Code"/>
+      </w:pPr>
+      <w:r>
+        <w:t>Antworte NUR mit reinem JSON: {"metadata": {...}}</w:t>
+      </w:r>
+    </w:p>
+    <w:p>
+      <w:pPr>
+        <w:pStyle w:val="Code"/>
+      </w:pPr>
+    </w:p>
+    <w:p>
+      <w:pPr/>
+      <w:r>
+        <w:t>Prompt-Key: "course"</w:t>
+      </w:r>
+    </w:p>
+    <w:p>
+      <w:pPr>
+        <w:pStyle w:val="Code"/>
+      </w:pPr>
+    </w:p>
+    <w:p>
+      <w:pPr>
+        <w:pStyle w:val="Code"/>
+      </w:pPr>
+      <w:r>
+        <w:t>Du bist ein Datenextraktions-Assistent. Extrahiere ALLE Kursinformationen von dieser Kursseite.</w:t>
+      </w:r>
+    </w:p>
+    <w:p>
+      <w:pPr>
+        <w:pStyle w:val="Code"/>
+      </w:pPr>
+      <w:r>
+        <w:t>Es können mehrere Kurstermine auf einer Seite sein (z.B. Mittwoch und Samstag).</w:t>
+      </w:r>
+    </w:p>
+    <w:p>
+      <w:pPr>
+        <w:pStyle w:val="Code"/>
+      </w:pPr>
+    </w:p>
+    <w:p>
+      <w:pPr>
+        <w:pStyle w:val="Code"/>
+      </w:pPr>
+      <w:r>
+        <w:t>Für jeden Kurs/Termin gib zurück:</w:t>
+      </w:r>
+    </w:p>
+    <w:p>
+      <w:pPr>
+        <w:pStyle w:val="Code"/>
+      </w:pPr>
+      <w:r>
+        <w:t>- course_name: Name des Kurses</w:t>
+      </w:r>
+    </w:p>
+    <w:p>
+      <w:pPr>
+        <w:pStyle w:val="Code"/>
+      </w:pPr>
+      <w:r>
+        <w:t>- course_type: "langgymi" oder "kurzgymi"</w:t>
+      </w:r>
+    </w:p>
+    <w:p>
+      <w:pPr>
+        <w:pStyle w:val="Code"/>
+      </w:pPr>
+      <w:r>
+        <w:t>- weekday: Wochentag auf Deutsch</w:t>
+      </w:r>
+    </w:p>
+    <w:p>
+      <w:pPr>
+        <w:pStyle w:val="Code"/>
+      </w:pPr>
+      <w:r>
+        <w:t>- course_time: Kurszeit (z.B. "17:30-19:30")</w:t>
+      </w:r>
+    </w:p>
+    <w:p>
+      <w:pPr>
+        <w:pStyle w:val="Code"/>
+      </w:pPr>
+      <w:r>
+        <w:t>- start_date: Startdatum im Format TT.MM.JJJJ</w:t>
+      </w:r>
+    </w:p>
+    <w:p>
+      <w:pPr>
+        <w:pStyle w:val="Code"/>
+      </w:pPr>
+      <w:r>
+        <w:t>- end_date: Enddatum im Format TT.MM.JJJJ</w:t>
+      </w:r>
+    </w:p>
+    <w:p>
+      <w:pPr>
+        <w:pStyle w:val="Code"/>
+      </w:pPr>
+      <w:r>
+        <w:t>- location: Kursort (z.B. "Meilen")</w:t>
+      </w:r>
+    </w:p>
+    <w:p>
+      <w:pPr>
+        <w:pStyle w:val="Code"/>
+      </w:pPr>
+      <w:r>
+        <w:t>- price_chf: Preis in CHF als Zahl</w:t>
+      </w:r>
+    </w:p>
+    <w:p>
+      <w:pPr>
+        <w:pStyle w:val="Code"/>
+      </w:pPr>
+      <w:r>
+        <w:t>- max_teilnehmer: Maximale Teilnehmerzahl als Zahl</w:t>
+      </w:r>
+    </w:p>
+    <w:p>
+      <w:pPr>
+        <w:pStyle w:val="Code"/>
+      </w:pPr>
+      <w:r>
+        <w:t>- availability: "ausgebucht" wenn ausgebucht, sonst "viele"</w:t>
+      </w:r>
+    </w:p>
+    <w:p>
+      <w:pPr>
+        <w:pStyle w:val="Code"/>
+      </w:pPr>
+    </w:p>
+    <w:p>
+      <w:pPr>
+        <w:pStyle w:val="Code"/>
+      </w:pPr>
+      <w:r>
+        <w:t>Gib ausserdem einmalig Anbieter-Metadaten zurück (dieselben Felder wie oben, inkl. unterstuetzung_ausserhalb).</w:t>
+      </w:r>
+    </w:p>
+    <w:p>
+      <w:pPr>
+        <w:pStyle w:val="Code"/>
+      </w:pPr>
+    </w:p>
+    <w:p>
+      <w:pPr>
+        <w:pStyle w:val="Code"/>
+      </w:pPr>
+      <w:r>
+        <w:t>Antworte NUR mit reinem JSON: {"courses": [{...}], "metadata": {...}}</w:t>
+      </w:r>
+    </w:p>
+    <w:p>
+      <w:pPr>
+        <w:pStyle w:val="Code"/>
+      </w:pPr>
+    </w:p>
+    <w:p>
+      <w:pPr>
+        <w:pStyle w:val="berschrift2"/>
+        <w:rPr>
+          <w:lang w:val="de-CH"/>
+        </w:rPr>
+      </w:pPr>
+      <w:r>
+        <w:t>17.5 Offene Punkte und Annahmen</w:t>
+      </w:r>
     </w:p>
     <w:p>
       <w:pPr>

</xml_diff>

<commit_message>
Clarify prompt storage locations and add venv-switch pitfall note
Expand the chapter 17.4 intro to explicitly explain the two places a
ScrapeGraphAI prompt can live (hardcoded in the scraper file vs.
overridden at runtime in scraper_registry), and add a note under
chapter 6.3 "Manuelles Auslösen" about deactivating another scraper's
venv and using a relative cd path when switching between scraping
technologies from the terminal.

Co-Authored-By: Claude Sonnet 5 <noreply@anthropic.com>
</commit_message>
<xml_diff>
--- a/docs/Technische-Dokumentation.docx
+++ b/docs/Technische-Dokumentation.docx
@@ -20888,6 +20888,12 @@
       </w:r>
     </w:p>
     <w:p>
+      <w:pPr/>
+      <w:r>
+        <w:t>Hinweis: Wechselst du direkt von einer anderen Scraper-venv hierher (z. B. von scraping/brightdata kommend), zuerst deactivate ausführen, bevor die scrapegraphai-venv aktiviert wird – sonst läuft der Scraper mit der falschen, inkompatiblen venv weiter. Ausserdem löst PowerShell cd relativ zum aktuellen Verzeichnis auf: Aus scraping/brightdata heraus funktioniert nur cd ..\scrapegraphai, nicht cd scraping/scrapegraphai (das würde scraping/brightdata/scraping/scrapegraphai suchen, das es nicht gibt).</w:t>
+      </w:r>
+    </w:p>
+    <w:p>
       <w:pPr>
         <w:pStyle w:val="Code"/>
         <w:pBdr>
@@ -29383,7 +29389,7 @@
     <w:p>
       <w:pPr/>
       <w:r>
-        <w:t>Referenz aller Extraktions-Prompts der zwölf ScrapeGraphAI-Scraper, direkt aus dem jeweiligen HARDCODED_PROMPT bzw. HARDCODED_PROMPTS-Dict extrahiert (siehe Kapitel 6.3 für das grundlegende Muster am Beispiel Avidii). Dies sind die fest codierten Fallback-Prompts; zur Laufzeit kann bei elf der zwölf Scraper ein über den Self-Healing-Loop reparierter Prompt aus scraper_registry Vorrang haben (Kapitel 6.3, "Self-Healing-Rücklese").</w:t>
+        <w:t>Die Prompts liegen an zwei Orten, je nachdem ob original oder repariert: (1) fest im Code, als HARDCODED_PROMPT (Avidii, GZ) bzw. HARDCODED_PROMPTS-Dict (die übrigen zehn) direkt in der jeweiligen Datei scraping/scrapegraphai/sGAI_&lt;name&gt;Scraper.py – das ist die Quelle für die folgende Referenz (siehe Kapitel 6.3 für das grundlegende Muster am Beispiel Avidii); (2) zur Laufzeit ggf. überschrieben in der Supabase-Tabelle scraper_registry, Feld current_value, mit field_name = 'main_prompt' (Avidii) bzw. field_name = 'prompts' (die anderen zehn, als JSON) – dort legt der Self-Healing-Loop (Kapitel 7) reparierte Prompts ab, und elf der zwölf Scraper lesen dort bei jedem Lauf zuerst nach, bevor sie auf die hartcodierte Version zurückfallen (Ausnahme: sGAI_gymivorbereitungZuerichScraper.py, siehe Kapitel 6.3, "Self-Healing-Rücklese"). Die folgende Referenz ist eine statische Momentaufnahme der hartcodierten Variante – falls der Self-Healing-Loop seither einen Prompt repariert hat, weicht der tatsächlich laufende Prompt in scraper_registry davon ab.</w:t>
       </w:r>
     </w:p>
     <w:p>

</xml_diff>

<commit_message>
Fix missing GymiProviders seed rows and document Playwright dependency
Extend seed_gymi_providers.sql to cover all 12 providers instead of
just 1,2,3,4,6 - the missing rows for 5,7-12 were causing
scrape_runs_provider_id_fkey violations during ScrapeGraphAI runs.
Applied the same INSERT against the live Supabase project.

Also document in chapter 6.3 why ScrapeGraphAI needs Playwright
(internal rendering, separate browser install from Puppeteer) and
add the "playwright install" fix as a new row in the chapter 15
troubleshooting table.

Co-Authored-By: Claude Sonnet 5 <noreply@anthropic.com>
</commit_message>
<xml_diff>
--- a/docs/Technische-Dokumentation.docx
+++ b/docs/Technische-Dokumentation.docx
@@ -11588,7 +11588,21 @@
         <w:rPr>
           <w:lang w:val="de-CH"/>
         </w:rPr>
-        <w:t xml:space="preserve"> install                          # installiert u. a. </w:t>
+        <w:t xml:space="preserve"> </w:t>
+      </w:r>
+      <w:proofErr w:type="spellStart"/>
+      <w:r>
+        <w:rPr>
+          <w:lang w:val="de-CH"/>
+        </w:rPr>
+        <w:t>install</w:t>
+      </w:r>
+      <w:proofErr w:type="spellEnd"/>
+      <w:r>
+        <w:rPr>
+          <w:lang w:val="de-CH"/>
+        </w:rPr>
+        <w:t xml:space="preserve">                          # installiert u. a. </w:t>
       </w:r>
       <w:proofErr w:type="spellStart"/>
       <w:r>
@@ -12067,54 +12081,54 @@
         </w:pBdr>
         <w:shd w:val="clear" w:color="auto" w:fill="F2F2F2"/>
         <w:rPr>
-          <w:lang w:val="de-CH"/>
-        </w:rPr>
-      </w:pPr>
-      <w:r>
-        <w:rPr>
-          <w:lang w:val="de-CH"/>
+          <w:lang w:val="fr-CH"/>
+        </w:rPr>
+      </w:pPr>
+      <w:r>
+        <w:rPr>
+          <w:lang w:val="fr-CH"/>
         </w:rPr>
         <w:t xml:space="preserve"># source </w:t>
       </w:r>
       <w:proofErr w:type="spellStart"/>
       <w:r>
         <w:rPr>
-          <w:lang w:val="de-CH"/>
+          <w:lang w:val="fr-CH"/>
         </w:rPr>
         <w:t>venv</w:t>
       </w:r>
       <w:proofErr w:type="spellEnd"/>
       <w:r>
         <w:rPr>
-          <w:lang w:val="de-CH"/>
+          <w:lang w:val="fr-CH"/>
         </w:rPr>
         <w:t>/bin/</w:t>
       </w:r>
       <w:proofErr w:type="spellStart"/>
       <w:r>
         <w:rPr>
-          <w:lang w:val="de-CH"/>
+          <w:lang w:val="fr-CH"/>
         </w:rPr>
         <w:t>activate</w:t>
       </w:r>
       <w:proofErr w:type="spellEnd"/>
       <w:r>
         <w:rPr>
-          <w:lang w:val="de-CH"/>
+          <w:lang w:val="fr-CH"/>
         </w:rPr>
         <w:t xml:space="preserve">         # </w:t>
       </w:r>
       <w:proofErr w:type="spellStart"/>
       <w:r>
         <w:rPr>
-          <w:lang w:val="de-CH"/>
+          <w:lang w:val="fr-CH"/>
         </w:rPr>
         <w:t>macOS</w:t>
       </w:r>
       <w:proofErr w:type="spellEnd"/>
       <w:r>
         <w:rPr>
-          <w:lang w:val="de-CH"/>
+          <w:lang w:val="fr-CH"/>
         </w:rPr>
         <w:t>/Linux</w:t>
       </w:r>
@@ -12129,37 +12143,9 @@
           <w:right w:val="single" w:sz="4" w:space="4" w:color="CCCCCC"/>
         </w:pBdr>
         <w:shd w:val="clear" w:color="auto" w:fill="F2F2F2"/>
-        <w:rPr>
-          <w:lang w:val="de-CH"/>
-        </w:rPr>
-      </w:pPr>
-      <w:proofErr w:type="spellStart"/>
-      <w:r>
-        <w:rPr>
-          <w:lang w:val="de-CH"/>
-        </w:rPr>
-        <w:t>pip</w:t>
-      </w:r>
-      <w:proofErr w:type="spellEnd"/>
-      <w:r>
-        <w:rPr>
-          <w:lang w:val="de-CH"/>
-        </w:rPr>
-        <w:t xml:space="preserve"> </w:t>
-      </w:r>
-      <w:proofErr w:type="spellStart"/>
-      <w:r>
-        <w:rPr>
-          <w:lang w:val="de-CH"/>
-        </w:rPr>
-        <w:t>install</w:t>
-      </w:r>
-      <w:proofErr w:type="spellEnd"/>
-      <w:r>
-        <w:rPr>
-          <w:lang w:val="de-CH"/>
-        </w:rPr>
-        <w:t xml:space="preserve"> -r requirements.txt</w:t>
+      </w:pPr>
+      <w:r>
+        <w:t>pip install -r requirements.txt</w:t>
       </w:r>
     </w:p>
     <w:p>
@@ -12217,16 +12203,23 @@
           <w:right w:val="single" w:sz="4" w:space="4" w:color="CCCCCC"/>
         </w:pBdr>
         <w:shd w:val="clear" w:color="auto" w:fill="F2F2F2"/>
-        <w:rPr>
-          <w:lang w:val="pt-BR"/>
-        </w:rPr>
-      </w:pPr>
-      <w:r>
-        <w:rPr>
-          <w:lang w:val="pt-BR"/>
-        </w:rPr>
-        <w:t>cd ../brightdata</w:t>
-      </w:r>
+      </w:pPr>
+      <w:r>
+        <w:t>cd</w:t>
+      </w:r>
+      <w:proofErr w:type="gramStart"/>
+      <w:r>
+        <w:t xml:space="preserve"> ..</w:t>
+      </w:r>
+      <w:proofErr w:type="gramEnd"/>
+      <w:r>
+        <w:t>/</w:t>
+      </w:r>
+      <w:proofErr w:type="spellStart"/>
+      <w:r>
+        <w:t>brightdata</w:t>
+      </w:r>
+      <w:proofErr w:type="spellEnd"/>
     </w:p>
     <w:p>
       <w:pPr>
@@ -12238,16 +12231,23 @@
           <w:right w:val="single" w:sz="4" w:space="4" w:color="CCCCCC"/>
         </w:pBdr>
         <w:shd w:val="clear" w:color="auto" w:fill="F2F2F2"/>
-        <w:rPr>
-          <w:lang w:val="pt-BR"/>
-        </w:rPr>
-      </w:pPr>
-      <w:r>
-        <w:rPr>
-          <w:lang w:val="pt-BR"/>
-        </w:rPr>
-        <w:t>python -m venv venv</w:t>
-      </w:r>
+      </w:pPr>
+      <w:r>
+        <w:t xml:space="preserve">python -m </w:t>
+      </w:r>
+      <w:proofErr w:type="spellStart"/>
+      <w:r>
+        <w:t>venv</w:t>
+      </w:r>
+      <w:proofErr w:type="spellEnd"/>
+      <w:r>
+        <w:t xml:space="preserve"> </w:t>
+      </w:r>
+      <w:proofErr w:type="spellStart"/>
+      <w:r>
+        <w:t>venv</w:t>
+      </w:r>
+      <w:proofErr w:type="spellEnd"/>
     </w:p>
     <w:p>
       <w:pPr>
@@ -18466,18 +18466,30 @@
           <w:right w:val="single" w:sz="4" w:space="4" w:color="CCCCCC"/>
         </w:pBdr>
         <w:shd w:val="clear" w:color="auto" w:fill="F2F2F2"/>
-      </w:pPr>
-      <w:r>
+        <w:rPr>
+          <w:lang w:val="de-CH"/>
+        </w:rPr>
+      </w:pPr>
+      <w:r>
+        <w:rPr>
+          <w:lang w:val="de-CH"/>
+        </w:rPr>
         <w:t xml:space="preserve">BRIGHT_DATA_API_TOKEN = </w:t>
       </w:r>
       <w:proofErr w:type="spellStart"/>
       <w:proofErr w:type="gramStart"/>
       <w:r>
+        <w:rPr>
+          <w:lang w:val="de-CH"/>
+        </w:rPr>
         <w:t>os.getenv</w:t>
       </w:r>
       <w:proofErr w:type="spellEnd"/>
       <w:proofErr w:type="gramEnd"/>
       <w:r>
+        <w:rPr>
+          <w:lang w:val="de-CH"/>
+        </w:rPr>
         <w:t>("BRIGHT_DATA_API_TOKEN")</w:t>
       </w:r>
     </w:p>
@@ -19191,7 +19203,7 @@
         <w:rPr>
           <w:lang w:val="de-CH"/>
         </w:rPr>
-        <w:t xml:space="preserve"> der drei Ansätze, der alle 12 Anbieter abdeckt, und deshalb auch die von der Webanwendung standardmässig angezeigte Datenquelle (PRIMARY_SCRAPER_METHOD = 'scrapegraphai'). Statt CSS-Selektoren zu pflegen, beschreibt jeder der zwölf sGAI_*.py-Scraper in natürlicher Sprache, welche Felder extrahiert werden sollen, und übergibt Prompt + Ziel-URL an SmartScraperGraph(...).run(). Die Bibliothek lädt die Seite intern selbst, rendert sie (auch JavaScript-generierte Inhalte) und lässt ein LLM daraus strukturiertes JSON extrahieren.</w:t>
+        <w:t xml:space="preserve"> der drei Ansätze, der alle 12 Anbieter abdeckt, und deshalb auch die von der Webanwendung standardmässig angezeigte Datenquelle (PRIMARY_SCRAPER_METHOD = 'scrapegraphai'). Statt CSS-Selektoren zu pflegen, beschreibt jeder der zwölf sGAI_*.py-Scraper in natürlicher Sprache, welche Felder extrahiert werden sollen, und übergibt Prompt + Ziel-URL an SmartScraperGraph(...).run(). Die Bibliothek lädt die Seite intern selbst, rendert sie (auch JavaScript-generierte Inhalte) und lässt ein LLM daraus strukturiertes JSON extrahieren. Für dieses Rendering nutzt ScrapeGraphAI intern Playwright (statt Puppeteer, das die TypeScript-Scraper verwenden) und steuert damit einen Headless-Chromium-Browser – Playwright muss deshalb einmalig eigene Browser-Binaries herunterladen (playwright install), getrennt von der Puppeteer-Chrome-Installation aus Kapitel 3.3 (siehe Kapitel 15 bei fehlenden Binaries).</w:t>
       </w:r>
     </w:p>
     <w:p>
@@ -20850,359 +20862,6 @@
     </w:p>
     <w:p>
       <w:pPr>
-        <w:rPr>
-          <w:lang w:val="de-CH"/>
-        </w:rPr>
-      </w:pPr>
-      <w:r>
-        <w:rPr>
-          <w:lang w:val="de-CH"/>
-        </w:rPr>
-        <w:t>Hinweis: Wechselst du direkt von einer anderen Scraper-</w:t>
-      </w:r>
-      <w:proofErr w:type="spellStart"/>
-      <w:r>
-        <w:rPr>
-          <w:lang w:val="de-CH"/>
-        </w:rPr>
-        <w:t>venv</w:t>
-      </w:r>
-      <w:proofErr w:type="spellEnd"/>
-      <w:r>
-        <w:rPr>
-          <w:lang w:val="de-CH"/>
-        </w:rPr>
-        <w:t xml:space="preserve"> hierher (z. B. von </w:t>
-      </w:r>
-      <w:proofErr w:type="spellStart"/>
-      <w:r>
-        <w:rPr>
-          <w:lang w:val="de-CH"/>
-        </w:rPr>
-        <w:t>scraping</w:t>
-      </w:r>
-      <w:proofErr w:type="spellEnd"/>
-      <w:r>
-        <w:rPr>
-          <w:lang w:val="de-CH"/>
-        </w:rPr>
-        <w:t>/</w:t>
-      </w:r>
-      <w:proofErr w:type="spellStart"/>
-      <w:r>
-        <w:rPr>
-          <w:lang w:val="de-CH"/>
-        </w:rPr>
-        <w:t>brightdata</w:t>
-      </w:r>
-      <w:proofErr w:type="spellEnd"/>
-      <w:r>
-        <w:rPr>
-          <w:lang w:val="de-CH"/>
-        </w:rPr>
-        <w:t xml:space="preserve"> kommend), zuerst </w:t>
-      </w:r>
-      <w:proofErr w:type="spellStart"/>
-      <w:r>
-        <w:rPr>
-          <w:lang w:val="de-CH"/>
-        </w:rPr>
-        <w:t>deactivate</w:t>
-      </w:r>
-      <w:proofErr w:type="spellEnd"/>
-      <w:r>
-        <w:rPr>
-          <w:lang w:val="de-CH"/>
-        </w:rPr>
-        <w:t xml:space="preserve"> ausführen, bevor die </w:t>
-      </w:r>
-      <w:proofErr w:type="spellStart"/>
-      <w:r>
-        <w:rPr>
-          <w:lang w:val="de-CH"/>
-        </w:rPr>
-        <w:t>scrapegraphai-venv</w:t>
-      </w:r>
-      <w:proofErr w:type="spellEnd"/>
-      <w:r>
-        <w:rPr>
-          <w:lang w:val="de-CH"/>
-        </w:rPr>
-        <w:t xml:space="preserve"> aktiviert wird – sonst läuft der Scraper mit der falschen, inkompatiblen </w:t>
-      </w:r>
-      <w:proofErr w:type="spellStart"/>
-      <w:r>
-        <w:rPr>
-          <w:lang w:val="de-CH"/>
-        </w:rPr>
-        <w:t>venv</w:t>
-      </w:r>
-      <w:proofErr w:type="spellEnd"/>
-      <w:r>
-        <w:rPr>
-          <w:lang w:val="de-CH"/>
-        </w:rPr>
-        <w:t xml:space="preserve"> weiter. Ausserdem löst PowerShell cd relativ zum aktuellen Verzeichnis auf: Aus </w:t>
-      </w:r>
-      <w:proofErr w:type="spellStart"/>
-      <w:r>
-        <w:rPr>
-          <w:lang w:val="de-CH"/>
-        </w:rPr>
-        <w:t>scraping</w:t>
-      </w:r>
-      <w:proofErr w:type="spellEnd"/>
-      <w:r>
-        <w:rPr>
-          <w:lang w:val="de-CH"/>
-        </w:rPr>
-        <w:t>/</w:t>
-      </w:r>
-      <w:proofErr w:type="spellStart"/>
-      <w:r>
-        <w:rPr>
-          <w:lang w:val="de-CH"/>
-        </w:rPr>
-        <w:t>brightdata</w:t>
-      </w:r>
-      <w:proofErr w:type="spellEnd"/>
-      <w:r>
-        <w:rPr>
-          <w:lang w:val="de-CH"/>
-        </w:rPr>
-        <w:t xml:space="preserve"> heraus funktioniert nur cd</w:t>
-      </w:r>
-      <w:proofErr w:type="gramStart"/>
-      <w:r>
-        <w:rPr>
-          <w:lang w:val="de-CH"/>
-        </w:rPr>
-        <w:t xml:space="preserve"> ..</w:t>
-      </w:r>
-      <w:proofErr w:type="gramEnd"/>
-      <w:r>
-        <w:rPr>
-          <w:lang w:val="de-CH"/>
-        </w:rPr>
-        <w:t>\</w:t>
-      </w:r>
-      <w:proofErr w:type="spellStart"/>
-      <w:r>
-        <w:rPr>
-          <w:lang w:val="de-CH"/>
-        </w:rPr>
-        <w:t>scrapegraphai</w:t>
-      </w:r>
-      <w:proofErr w:type="spellEnd"/>
-      <w:r>
-        <w:rPr>
-          <w:lang w:val="de-CH"/>
-        </w:rPr>
-        <w:t xml:space="preserve">, nicht cd </w:t>
-      </w:r>
-      <w:proofErr w:type="spellStart"/>
-      <w:r>
-        <w:rPr>
-          <w:lang w:val="de-CH"/>
-        </w:rPr>
-        <w:t>scraping</w:t>
-      </w:r>
-      <w:proofErr w:type="spellEnd"/>
-      <w:r>
-        <w:rPr>
-          <w:lang w:val="de-CH"/>
-        </w:rPr>
-        <w:t>/</w:t>
-      </w:r>
-      <w:proofErr w:type="spellStart"/>
-      <w:r>
-        <w:rPr>
-          <w:lang w:val="de-CH"/>
-        </w:rPr>
-        <w:t>scrapegraphai</w:t>
-      </w:r>
-      <w:proofErr w:type="spellEnd"/>
-      <w:r>
-        <w:rPr>
-          <w:lang w:val="de-CH"/>
-        </w:rPr>
-        <w:t xml:space="preserve"> (das würde </w:t>
-      </w:r>
-      <w:proofErr w:type="spellStart"/>
-      <w:r>
-        <w:rPr>
-          <w:lang w:val="de-CH"/>
-        </w:rPr>
-        <w:t>scraping</w:t>
-      </w:r>
-      <w:proofErr w:type="spellEnd"/>
-      <w:r>
-        <w:rPr>
-          <w:lang w:val="de-CH"/>
-        </w:rPr>
-        <w:t>/</w:t>
-      </w:r>
-      <w:proofErr w:type="spellStart"/>
-      <w:r>
-        <w:rPr>
-          <w:lang w:val="de-CH"/>
-        </w:rPr>
-        <w:t>brightdata</w:t>
-      </w:r>
-      <w:proofErr w:type="spellEnd"/>
-      <w:r>
-        <w:rPr>
-          <w:lang w:val="de-CH"/>
-        </w:rPr>
-        <w:t>/</w:t>
-      </w:r>
-      <w:proofErr w:type="spellStart"/>
-      <w:r>
-        <w:rPr>
-          <w:lang w:val="de-CH"/>
-        </w:rPr>
-        <w:t>scraping</w:t>
-      </w:r>
-      <w:proofErr w:type="spellEnd"/>
-      <w:r>
-        <w:rPr>
-          <w:lang w:val="de-CH"/>
-        </w:rPr>
-        <w:t>/</w:t>
-      </w:r>
-      <w:proofErr w:type="spellStart"/>
-      <w:r>
-        <w:rPr>
-          <w:lang w:val="de-CH"/>
-        </w:rPr>
-        <w:t>scrapegraphai</w:t>
-      </w:r>
-      <w:proofErr w:type="spellEnd"/>
-      <w:r>
-        <w:rPr>
-          <w:lang w:val="de-CH"/>
-        </w:rPr>
-        <w:t xml:space="preserve"> suchen, </w:t>
-      </w:r>
-      <w:proofErr w:type="gramStart"/>
-      <w:r>
-        <w:rPr>
-          <w:lang w:val="de-CH"/>
-        </w:rPr>
-        <w:t>das</w:t>
-      </w:r>
-      <w:proofErr w:type="gramEnd"/>
-      <w:r>
-        <w:rPr>
-          <w:lang w:val="de-CH"/>
-        </w:rPr>
-        <w:t xml:space="preserve"> es nicht gibt).</w:t>
-      </w:r>
-    </w:p>
-    <w:p>
-      <w:pPr>
-        <w:pStyle w:val="Code"/>
-      </w:pPr>
-      <w:r>
-        <w:t>deactivate</w:t>
-      </w:r>
-    </w:p>
-    <w:p>
-      <w:pPr>
-        <w:pStyle w:val="Code"/>
-      </w:pPr>
-      <w:r>
-        <w:t>cd ..\scrapegraphai</w:t>
-      </w:r>
-    </w:p>
-    <w:p>
-      <w:pPr>
-        <w:pStyle w:val="Code"/>
-      </w:pPr>
-      <w:r>
-        <w:t>.\venv\Scripts\activate</w:t>
-      </w:r>
-    </w:p>
-    <w:p>
-      <w:pPr>
-        <w:pStyle w:val="Code"/>
-      </w:pPr>
-      <w:r>
-        <w:t>python run_all_scrapers.py</w:t>
-      </w:r>
-    </w:p>
-    <w:p>
-      <w:pPr/>
-      <w:r>
-        <w:t>Falls die scrapegraphai-venv dort noch gar nicht existiert (erstmaliges Setup), stattdessen:</w:t>
-      </w:r>
-    </w:p>
-    <w:p>
-      <w:pPr>
-        <w:pStyle w:val="Code"/>
-      </w:pPr>
-      <w:r>
-        <w:t>deactivate</w:t>
-      </w:r>
-    </w:p>
-    <w:p>
-      <w:pPr>
-        <w:pStyle w:val="Code"/>
-      </w:pPr>
-      <w:r>
-        <w:t>cd ..\scrapegraphai</w:t>
-      </w:r>
-    </w:p>
-    <w:p>
-      <w:pPr>
-        <w:pStyle w:val="Code"/>
-      </w:pPr>
-      <w:r>
-        <w:t>python -m venv venv</w:t>
-      </w:r>
-    </w:p>
-    <w:p>
-      <w:pPr>
-        <w:pStyle w:val="Code"/>
-      </w:pPr>
-      <w:r>
-        <w:t>.\venv\Scripts\activate</w:t>
-      </w:r>
-    </w:p>
-    <w:p>
-      <w:pPr>
-        <w:pStyle w:val="Code"/>
-      </w:pPr>
-      <w:r>
-        <w:t>pip install -r requirements.txt</w:t>
-      </w:r>
-    </w:p>
-    <w:p>
-      <w:pPr>
-        <w:pStyle w:val="Code"/>
-      </w:pPr>
-      <w:r>
-        <w:t>python run_all_scrapers.py</w:t>
-      </w:r>
-    </w:p>
-    <w:p>
-      <w:pPr>
-        <w:pStyle w:val="berschrift2"/>
-        <w:rPr>
-          <w:lang w:val="de-CH"/>
-        </w:rPr>
-      </w:pPr>
-      <w:bookmarkStart w:id="44" w:name="_Toc237169741"/>
-      <w:r>
-        <w:rPr>
-          <w:lang w:val="de-CH"/>
-        </w:rPr>
-        <w:t>6.4 CrawlAI (Platzhalter – von Studierenden zu ergänzen)</w:t>
-      </w:r>
-      <w:bookmarkEnd w:id="44"/>
-    </w:p>
-    <w:p>
-      <w:pPr>
         <w:pBdr>
           <w:left w:val="single" w:sz="18" w:space="8" w:color="2F5496"/>
         </w:pBdr>
@@ -21215,6 +20874,401 @@
       </w:pPr>
       <w:r>
         <w:rPr>
+          <w:lang w:val="de-CH"/>
+        </w:rPr>
+        <w:t>Hinweis: Wechselst du direkt von einer anderen Scraper-</w:t>
+      </w:r>
+      <w:proofErr w:type="spellStart"/>
+      <w:r>
+        <w:rPr>
+          <w:lang w:val="de-CH"/>
+        </w:rPr>
+        <w:t>venv</w:t>
+      </w:r>
+      <w:proofErr w:type="spellEnd"/>
+      <w:r>
+        <w:rPr>
+          <w:lang w:val="de-CH"/>
+        </w:rPr>
+        <w:t xml:space="preserve"> hierher (z. B. von </w:t>
+      </w:r>
+      <w:proofErr w:type="spellStart"/>
+      <w:r>
+        <w:rPr>
+          <w:lang w:val="de-CH"/>
+        </w:rPr>
+        <w:t>scraping</w:t>
+      </w:r>
+      <w:proofErr w:type="spellEnd"/>
+      <w:r>
+        <w:rPr>
+          <w:lang w:val="de-CH"/>
+        </w:rPr>
+        <w:t>/</w:t>
+      </w:r>
+      <w:proofErr w:type="spellStart"/>
+      <w:r>
+        <w:rPr>
+          <w:lang w:val="de-CH"/>
+        </w:rPr>
+        <w:t>brightdata</w:t>
+      </w:r>
+      <w:proofErr w:type="spellEnd"/>
+      <w:r>
+        <w:rPr>
+          <w:lang w:val="de-CH"/>
+        </w:rPr>
+        <w:t xml:space="preserve"> kommend), zuerst </w:t>
+      </w:r>
+      <w:proofErr w:type="spellStart"/>
+      <w:r>
+        <w:rPr>
+          <w:lang w:val="de-CH"/>
+        </w:rPr>
+        <w:t>deactivate</w:t>
+      </w:r>
+      <w:proofErr w:type="spellEnd"/>
+      <w:r>
+        <w:rPr>
+          <w:lang w:val="de-CH"/>
+        </w:rPr>
+        <w:t xml:space="preserve"> ausführen, bevor die </w:t>
+      </w:r>
+      <w:proofErr w:type="spellStart"/>
+      <w:r>
+        <w:rPr>
+          <w:lang w:val="de-CH"/>
+        </w:rPr>
+        <w:t>scrapegraphai-venv</w:t>
+      </w:r>
+      <w:proofErr w:type="spellEnd"/>
+      <w:r>
+        <w:rPr>
+          <w:lang w:val="de-CH"/>
+        </w:rPr>
+        <w:t xml:space="preserve"> aktiviert wird – sonst läuft der Scraper mit der falschen, inkompatiblen </w:t>
+      </w:r>
+      <w:proofErr w:type="spellStart"/>
+      <w:r>
+        <w:rPr>
+          <w:lang w:val="de-CH"/>
+        </w:rPr>
+        <w:t>venv</w:t>
+      </w:r>
+      <w:proofErr w:type="spellEnd"/>
+      <w:r>
+        <w:rPr>
+          <w:lang w:val="de-CH"/>
+        </w:rPr>
+        <w:t xml:space="preserve"> weiter. Ausserdem löst PowerShell cd relativ zum aktuellen Verzeichnis auf: Aus </w:t>
+      </w:r>
+      <w:proofErr w:type="spellStart"/>
+      <w:r>
+        <w:rPr>
+          <w:lang w:val="de-CH"/>
+        </w:rPr>
+        <w:t>scraping</w:t>
+      </w:r>
+      <w:proofErr w:type="spellEnd"/>
+      <w:r>
+        <w:rPr>
+          <w:lang w:val="de-CH"/>
+        </w:rPr>
+        <w:t>/</w:t>
+      </w:r>
+      <w:proofErr w:type="spellStart"/>
+      <w:r>
+        <w:rPr>
+          <w:lang w:val="de-CH"/>
+        </w:rPr>
+        <w:t>brightdata</w:t>
+      </w:r>
+      <w:proofErr w:type="spellEnd"/>
+      <w:r>
+        <w:rPr>
+          <w:lang w:val="de-CH"/>
+        </w:rPr>
+        <w:t xml:space="preserve"> heraus funktioniert nur cd</w:t>
+      </w:r>
+      <w:proofErr w:type="gramStart"/>
+      <w:r>
+        <w:rPr>
+          <w:lang w:val="de-CH"/>
+        </w:rPr>
+        <w:t xml:space="preserve"> ..</w:t>
+      </w:r>
+      <w:proofErr w:type="gramEnd"/>
+      <w:r>
+        <w:rPr>
+          <w:lang w:val="de-CH"/>
+        </w:rPr>
+        <w:t>\</w:t>
+      </w:r>
+      <w:proofErr w:type="spellStart"/>
+      <w:r>
+        <w:rPr>
+          <w:lang w:val="de-CH"/>
+        </w:rPr>
+        <w:t>scrapegraphai</w:t>
+      </w:r>
+      <w:proofErr w:type="spellEnd"/>
+      <w:r>
+        <w:rPr>
+          <w:lang w:val="de-CH"/>
+        </w:rPr>
+        <w:t xml:space="preserve">, nicht cd </w:t>
+      </w:r>
+      <w:proofErr w:type="spellStart"/>
+      <w:r>
+        <w:rPr>
+          <w:lang w:val="de-CH"/>
+        </w:rPr>
+        <w:t>scraping</w:t>
+      </w:r>
+      <w:proofErr w:type="spellEnd"/>
+      <w:r>
+        <w:rPr>
+          <w:lang w:val="de-CH"/>
+        </w:rPr>
+        <w:t>/</w:t>
+      </w:r>
+      <w:proofErr w:type="spellStart"/>
+      <w:r>
+        <w:rPr>
+          <w:lang w:val="de-CH"/>
+        </w:rPr>
+        <w:t>scrapegraphai</w:t>
+      </w:r>
+      <w:proofErr w:type="spellEnd"/>
+      <w:r>
+        <w:rPr>
+          <w:lang w:val="de-CH"/>
+        </w:rPr>
+        <w:t xml:space="preserve"> (das würde </w:t>
+      </w:r>
+      <w:proofErr w:type="spellStart"/>
+      <w:r>
+        <w:rPr>
+          <w:lang w:val="de-CH"/>
+        </w:rPr>
+        <w:t>scraping</w:t>
+      </w:r>
+      <w:proofErr w:type="spellEnd"/>
+      <w:r>
+        <w:rPr>
+          <w:lang w:val="de-CH"/>
+        </w:rPr>
+        <w:t>/</w:t>
+      </w:r>
+      <w:proofErr w:type="spellStart"/>
+      <w:r>
+        <w:rPr>
+          <w:lang w:val="de-CH"/>
+        </w:rPr>
+        <w:t>brightdata</w:t>
+      </w:r>
+      <w:proofErr w:type="spellEnd"/>
+      <w:r>
+        <w:rPr>
+          <w:lang w:val="de-CH"/>
+        </w:rPr>
+        <w:t>/</w:t>
+      </w:r>
+      <w:proofErr w:type="spellStart"/>
+      <w:r>
+        <w:rPr>
+          <w:lang w:val="de-CH"/>
+        </w:rPr>
+        <w:t>scraping</w:t>
+      </w:r>
+      <w:proofErr w:type="spellEnd"/>
+      <w:r>
+        <w:rPr>
+          <w:lang w:val="de-CH"/>
+        </w:rPr>
+        <w:t>/</w:t>
+      </w:r>
+      <w:proofErr w:type="spellStart"/>
+      <w:r>
+        <w:rPr>
+          <w:lang w:val="de-CH"/>
+        </w:rPr>
+        <w:t>scrapegraphai</w:t>
+      </w:r>
+      <w:proofErr w:type="spellEnd"/>
+      <w:r>
+        <w:rPr>
+          <w:lang w:val="de-CH"/>
+        </w:rPr>
+        <w:t xml:space="preserve"> suchen, </w:t>
+      </w:r>
+      <w:proofErr w:type="gramStart"/>
+      <w:r>
+        <w:rPr>
+          <w:lang w:val="de-CH"/>
+        </w:rPr>
+        <w:t>das</w:t>
+      </w:r>
+      <w:proofErr w:type="gramEnd"/>
+      <w:r>
+        <w:rPr>
+          <w:lang w:val="de-CH"/>
+        </w:rPr>
+        <w:t xml:space="preserve"> es nicht gibt).</w:t>
+      </w:r>
+    </w:p>
+    <w:p>
+      <w:pPr>
+        <w:pStyle w:val="Code"/>
+      </w:pPr>
+      <w:r>
+        <w:t>deactivate</w:t>
+      </w:r>
+    </w:p>
+    <w:p>
+      <w:pPr>
+        <w:pStyle w:val="Code"/>
+      </w:pPr>
+      <w:r>
+        <w:t>cd ..\scrapegraphai</w:t>
+      </w:r>
+    </w:p>
+    <w:p>
+      <w:pPr>
+        <w:pStyle w:val="Code"/>
+      </w:pPr>
+      <w:r>
+        <w:t>.\venv\Scripts\activate</w:t>
+      </w:r>
+    </w:p>
+    <w:p>
+      <w:pPr>
+        <w:pStyle w:val="Code"/>
+      </w:pPr>
+      <w:r>
+        <w:t>python run_all_scrapers.py</w:t>
+      </w:r>
+    </w:p>
+    <w:p>
+      <w:pPr>
+        <w:rPr>
+          <w:lang w:val="de-CH"/>
+        </w:rPr>
+      </w:pPr>
+      <w:r>
+        <w:rPr>
+          <w:lang w:val="de-CH"/>
+        </w:rPr>
+        <w:lastRenderedPageBreak/>
+        <w:t xml:space="preserve">Falls die </w:t>
+      </w:r>
+      <w:proofErr w:type="spellStart"/>
+      <w:r>
+        <w:rPr>
+          <w:lang w:val="de-CH"/>
+        </w:rPr>
+        <w:t>scrapegraphai-venv</w:t>
+      </w:r>
+      <w:proofErr w:type="spellEnd"/>
+      <w:r>
+        <w:rPr>
+          <w:lang w:val="de-CH"/>
+        </w:rPr>
+        <w:t xml:space="preserve"> dort noch </w:t>
+      </w:r>
+      <w:r>
+        <w:rPr>
+          <w:b/>
+          <w:bCs/>
+          <w:lang w:val="de-CH"/>
+        </w:rPr>
+        <w:t>gar nicht existiert</w:t>
+      </w:r>
+      <w:r>
+        <w:rPr>
+          <w:lang w:val="de-CH"/>
+        </w:rPr>
+        <w:t xml:space="preserve"> (erstmaliges Setup), stattdessen:</w:t>
+      </w:r>
+    </w:p>
+    <w:p>
+      <w:pPr>
+        <w:pStyle w:val="Code"/>
+      </w:pPr>
+      <w:r>
+        <w:t>deactivate</w:t>
+      </w:r>
+    </w:p>
+    <w:p>
+      <w:pPr>
+        <w:pStyle w:val="Code"/>
+      </w:pPr>
+      <w:r>
+        <w:t>cd ..\scrapegraphai</w:t>
+      </w:r>
+    </w:p>
+    <w:p>
+      <w:pPr>
+        <w:pStyle w:val="Code"/>
+      </w:pPr>
+      <w:r>
+        <w:t>python -m venv venv</w:t>
+      </w:r>
+    </w:p>
+    <w:p>
+      <w:pPr>
+        <w:pStyle w:val="Code"/>
+      </w:pPr>
+      <w:r>
+        <w:t>.\venv\Scripts\activate</w:t>
+      </w:r>
+    </w:p>
+    <w:p>
+      <w:pPr>
+        <w:pStyle w:val="Code"/>
+      </w:pPr>
+      <w:r>
+        <w:t>pip install -r requirements.txt</w:t>
+      </w:r>
+    </w:p>
+    <w:p>
+      <w:pPr>
+        <w:pStyle w:val="Code"/>
+      </w:pPr>
+      <w:r>
+        <w:t>python run_all_scrapers.py</w:t>
+      </w:r>
+    </w:p>
+    <w:p>
+      <w:pPr>
+        <w:pStyle w:val="berschrift2"/>
+        <w:rPr>
+          <w:lang w:val="de-CH"/>
+        </w:rPr>
+      </w:pPr>
+      <w:bookmarkStart w:id="44" w:name="_Toc237169741"/>
+      <w:r>
+        <w:rPr>
+          <w:lang w:val="de-CH"/>
+        </w:rPr>
+        <w:t>6.4 CrawlAI (Platzhalter – von Studierenden zu ergänzen)</w:t>
+      </w:r>
+      <w:bookmarkEnd w:id="44"/>
+    </w:p>
+    <w:p>
+      <w:pPr>
+        <w:pBdr>
+          <w:left w:val="single" w:sz="18" w:space="8" w:color="2F5496"/>
+        </w:pBdr>
+        <w:shd w:val="clear" w:color="auto" w:fill="EEF2FA"/>
+        <w:spacing w:before="120" w:after="200"/>
+        <w:ind w:left="227"/>
+        <w:rPr>
+          <w:lang w:val="de-CH"/>
+        </w:rPr>
+      </w:pPr>
+      <w:r>
+        <w:rPr>
           <w:b/>
           <w:color w:val="2F5496"/>
           <w:lang w:val="de-CH"/>
@@ -21239,14 +21293,57 @@
         <w:rPr>
           <w:lang w:val="de-CH"/>
         </w:rPr>
-        <w:t xml:space="preserve">, allen requirements.txt-Dateien und dem gesamten Quellcode). Auch die Bachelorarbeit behandelt es nicht inhaltlich – die einzige Erwähnung im gesamten Dokument </w:t>
-      </w:r>
-      <w:r>
-        <w:rPr>
-          <w:lang w:val="de-CH"/>
-        </w:rPr>
-        <w:lastRenderedPageBreak/>
-        <w:t>ist ein Literaturzitat im Verzeichnis (Tugui, D.-C., 2026, Medium-Artikel über Open-Source-Scraping-Frameworks inkl. ScrapeGraphAI und Crawl4AI), ohne Bezug im Fliesstext. Eine zukünftige Bearbeiterin/ein zukünftiger Bearbeiter soll dieses Kapitel als vierte, ergänzende Scraping-Technologie ausarbeiten.</w:t>
+        <w:t xml:space="preserve">, allen requirements.txt-Dateien und dem gesamten Quellcode). </w:t>
+      </w:r>
+      <w:r>
+        <w:rPr>
+          <w:lang w:val="de-CH"/>
+        </w:rPr>
+        <w:t>D</w:t>
+      </w:r>
+      <w:r>
+        <w:rPr>
+          <w:lang w:val="de-CH"/>
+        </w:rPr>
+        <w:t xml:space="preserve">ieses Kapitel </w:t>
+      </w:r>
+      <w:r>
+        <w:rPr>
+          <w:lang w:val="de-CH"/>
+        </w:rPr>
+        <w:t xml:space="preserve">wird </w:t>
+      </w:r>
+      <w:r>
+        <w:rPr>
+          <w:lang w:val="de-CH"/>
+        </w:rPr>
+        <w:t xml:space="preserve">als vierte, ergänzende Scraping-Technologie </w:t>
+      </w:r>
+      <w:proofErr w:type="gramStart"/>
+      <w:r>
+        <w:rPr>
+          <w:lang w:val="de-CH"/>
+        </w:rPr>
+        <w:t>ausarbeite</w:t>
+      </w:r>
+      <w:r>
+        <w:rPr>
+          <w:lang w:val="de-CH"/>
+        </w:rPr>
+        <w:t>t</w:t>
+      </w:r>
+      <w:proofErr w:type="gramEnd"/>
+      <w:r>
+        <w:rPr>
+          <w:lang w:val="de-CH"/>
+        </w:rPr>
+        <w:t xml:space="preserve"> werde</w:t>
+      </w:r>
+      <w:r>
+        <w:rPr>
+          <w:lang w:val="de-CH"/>
+        </w:rPr>
+        <w:t>n.</w:t>
       </w:r>
     </w:p>
     <w:p>
@@ -28828,6 +28925,38 @@
           </w:p>
         </w:tc>
       </w:tr>
+      <w:tr>
+        <w:tc>
+          <w:tcPr>
+            <w:tcW w:type="dxa" w:w="2827"/>
+          </w:tcPr>
+          <w:p>
+            <w:r>
+              <w:t>ScrapeGraphAI-Lauf schlägt fehl: BrowserType.launch: Executable doesn't exist at ...\ms-playwright\chromium_headless_shell-...\chrome-headless-shell.exe</w:t>
+            </w:r>
+          </w:p>
+        </w:tc>
+        <w:tc>
+          <w:tcPr>
+            <w:tcW w:type="dxa" w:w="2872"/>
+          </w:tcPr>
+          <w:p>
+            <w:r>
+              <w:t>Playwright (wird von ScrapeGraphAI intern zum Rendern der Zielseiten genutzt) ist als Python-Paket installiert, aber die Browser-Binaries wurden noch nie heruntergeladen – typischerweise nach einem frischen venv-Setup oder einem Playwright-Update.</w:t>
+            </w:r>
+          </w:p>
+        </w:tc>
+        <w:tc>
+          <w:tcPr>
+            <w:tcW w:type="dxa" w:w="3923"/>
+          </w:tcPr>
+          <w:p>
+            <w:r>
+              <w:t>playwright install (bzw. python -m playwright install, falls der Befehl nicht gefunden wird) in der aktivierten scrapegraphai-venv ausführen. Lädt die Browser ins Nutzerprofil (%LOCALAPPDATA%\ms-playwright\), unabhängig vom Projektordner. Danach den Scraper-Lauf erneut starten.</w:t>
+            </w:r>
+          </w:p>
+        </w:tc>
+      </w:tr>
     </w:tbl>
     <w:p>
       <w:pPr>
@@ -33256,7 +33385,15 @@
       </w:r>
       <w:proofErr w:type="spellEnd"/>
       <w:r>
-        <w:t xml:space="preserve"> 'kurzgymi'</w:t>
+        <w:t xml:space="preserve"> '</w:t>
+      </w:r>
+      <w:proofErr w:type="spellStart"/>
+      <w:r>
+        <w:t>kurzgymi</w:t>
+      </w:r>
+      <w:proofErr w:type="spellEnd"/>
+      <w:r>
+        <w:t>'</w:t>
       </w:r>
     </w:p>
     <w:p>

</xml_diff>

<commit_message>
Document BFH LLM token rate-limit error in troubleshooting table
Add a row to chapter 15's troubleshooting table covering the
"Rate limit exceeded ... Limit type: tokens" error from the BFH LLM
gateway that occurs when running all 12 ScrapeGraphAI scrapers in
parallel, with guidance to wait for the reset and re-run only the
failed providers individually.

Co-Authored-By: Claude Sonnet 5 <noreply@anthropic.com>
</commit_message>
<xml_diff>
--- a/docs/Technische-Dokumentation.docx
+++ b/docs/Technische-Dokumentation.docx
@@ -28953,6 +28953,38 @@
           <w:p>
             <w:r>
               <w:t>playwright install (bzw. python -m playwright install, falls der Befehl nicht gefunden wird) in der aktivierten scrapegraphai-venv ausführen. Lädt die Browser ins Nutzerprofil (%LOCALAPPDATA%\ms-playwright\), unabhängig vom Projektordner. Danach den Scraper-Lauf erneut starten.</w:t>
+            </w:r>
+          </w:p>
+        </w:tc>
+      </w:tr>
+      <w:tr>
+        <w:tc>
+          <w:tcPr>
+            <w:tcW w:type="dxa" w:w="2827"/>
+          </w:tcPr>
+          <w:p>
+            <w:r>
+              <w:t>ScrapeGraphAI-Lauf schlägt für einzelne Anbieter fehl: Error code: 400 - {'detail': 'Rate limit exceeded for end_user: ..., Limit type: tokens, ...'}</w:t>
+            </w:r>
+          </w:p>
+        </w:tc>
+        <w:tc>
+          <w:tcPr>
+            <w:tcW w:type="dxa" w:w="2872"/>
+          </w:tcPr>
+          <w:p>
+            <w:r>
+              <w:t>Das BFH-LLM-Gateway begrenzt das Token-Kontingent pro Nutzer:in (z. B. 150 000 Tokens, mit Reset-Zeitpunkt in der Fehlermeldung). Bei python run_all_scrapers.py laufen alle 12 Anbieter parallel und teilen sich dieses Kontingent – v. a. Anbieter mit mehreren Prompts (Kapitel 6.3) verbrauchen es schnell. Unabhängig vom Gemini-Kontingent des Self-Healing-Loops (Kapitel 7.3).</w:t>
+            </w:r>
+          </w:p>
+        </w:tc>
+        <w:tc>
+          <w:tcPr>
+            <w:tcW w:type="dxa" w:w="3923"/>
+          </w:tcPr>
+          <w:p>
+            <w:r>
+              <w:t>Bis zum in der Fehlermeldung genannten Reset-Zeitpunkt warten. Danach nicht den ganzen Batch neu starten, sondern nur die im Log als fehlgeschlagen markierten Anbieter einzeln nachziehen (python sGAI_&lt;name&gt;Scraper.py), um das Kontingent zu schonen.</w:t>
             </w:r>
           </w:p>
         </w:tc>

</xml_diff>